<commit_message>
porousKepsilon now working fine orous Kepsilon with stabilazed nuT stabilized nuT calculated for having a laminar flow (based on info from the user on the characteristic size of the structure) Tutorial also for turbulent case
</commit_message>
<xml_diff>
--- a/Documentation/howTo.docx
+++ b/Documentation/howTo.docx
@@ -569,7 +569,7 @@
         <w:pStyle w:val="ListParagraph"/>
         <w:numPr>
           <w:ilvl w:val="0"/>
-          <w:numId w:val="4"/>
+          <w:numId w:val="3"/>
         </w:numPr>
         <w:rPr/>
       </w:pPr>
@@ -617,13 +617,31 @@
           <w:i/>
           <w:lang w:val="en-US"/>
         </w:rPr>
-        <w:t>serpentToFoamXS.m</w:t>
-      </w:r>
-      <w:r>
-        <w:rPr>
-          <w:lang w:val="en-US"/>
-        </w:rPr>
-        <w:t xml:space="preserve"> file provided with GeN-Foam is a Matlab script that automatically converts serpent output files into the nuclear data files employed by GeN-Foam.</w:t>
+        <w:t>serpentToFoam</w:t>
+      </w:r>
+      <w:r>
+        <w:rPr>
+          <w:lang w:val="en-US"/>
+        </w:rPr>
+        <w:t xml:space="preserve"> </w:t>
+      </w:r>
+      <w:r>
+        <w:rPr>
+          <w:lang w:val="en-US"/>
+        </w:rPr>
+        <w:t>routines</w:t>
+      </w:r>
+      <w:r>
+        <w:rPr>
+          <w:lang w:val="en-US"/>
+        </w:rPr>
+        <w:t xml:space="preserve"> provided with GeN-Foam is a Matlab script that automatically converts serpent output files into the nuclear data files employed by GeN-Foam. </w:t>
+      </w:r>
+      <w:r>
+        <w:rPr>
+          <w:lang w:val="en-US"/>
+        </w:rPr>
+        <w:t xml:space="preserve">The entry discFactor is used only if discontinuity factors have to be used. The term integralFlux, is used only if the automatic adjustment of  discontinuity factors is performed. Nonetheless, these entries should always be present. </w:t>
       </w:r>
     </w:p>
     <w:p>
@@ -631,7 +649,7 @@
         <w:pStyle w:val="ListParagraph"/>
         <w:numPr>
           <w:ilvl w:val="0"/>
-          <w:numId w:val="4"/>
+          <w:numId w:val="3"/>
         </w:numPr>
         <w:rPr/>
       </w:pPr>
@@ -791,33 +809,601 @@
       <w:pPr>
         <w:pStyle w:val="ListParagraph"/>
         <w:ind w:left="720" w:right="0" w:hanging="0"/>
-        <w:rPr>
-          <w:i/>
+        <w:rPr/>
+      </w:pPr>
+      <w:r>
+        <w:rPr>
           <w:i/>
           <w:iCs/>
         </w:rPr>
-      </w:pPr>
+        <w:t xml:space="preserve"> </w:t>
+      </w:r>
       <w:r>
         <w:rPr>
           <w:i/>
           <w:iCs/>
         </w:rPr>
-        <w:t xml:space="preserve"> </w:t>
-      </w:r>
-      <w:r>
-        <w:rPr>
+        <w:t xml:space="preserve">); </w:t>
+      </w:r>
+    </w:p>
+    <w:p>
+      <w:pPr>
+        <w:pStyle w:val="ListParagraph"/>
+        <w:ind w:left="720" w:right="0" w:hanging="0"/>
+        <w:rPr>
+          <w:i/>
           <w:i/>
           <w:iCs/>
-        </w:rPr>
-        <w:t xml:space="preserve">); </w:t>
+          <w:lang w:val="en-US"/>
+        </w:rPr>
+      </w:pPr>
+      <w:r>
+        <w:rPr/>
+      </w:r>
+    </w:p>
+    <w:p>
+      <w:pPr>
+        <w:pStyle w:val="ListParagraph"/>
+        <w:widowControl/>
+        <w:overflowPunct w:val="false"/>
+        <w:bidi w:val="0"/>
+        <w:spacing w:lineRule="auto" w:line="276" w:before="0" w:after="200"/>
+        <w:ind w:left="0" w:right="0" w:hanging="0"/>
+        <w:contextualSpacing/>
+        <w:jc w:val="left"/>
+        <w:rPr>
+          <w:rFonts w:ascii="Cambria" w:hAnsi="Cambria" w:eastAsia="宋体" w:cs="DejaVu Sans"/>
+          <w:b/>
+          <w:b/>
+          <w:bCs/>
+          <w:color w:val="4F81BD"/>
+          <w:sz w:val="22"/>
+          <w:szCs w:val="22"/>
+          <w:lang w:val="en-US" w:eastAsia="en-US" w:bidi="ar-SA"/>
+        </w:rPr>
+      </w:pPr>
+      <w:r>
+        <w:rPr>
+          <w:rFonts w:eastAsia="宋体" w:cs="DejaVu Sans" w:ascii="Cambria" w:hAnsi="Cambria"/>
+          <w:b/>
+          <w:bCs/>
+          <w:color w:val="4F81BD"/>
+          <w:sz w:val="22"/>
+          <w:szCs w:val="22"/>
+          <w:lang w:val="en-US" w:eastAsia="en-US" w:bidi="ar-SA"/>
+        </w:rPr>
+        <w:t>Initial values and boundary conditions</w:t>
       </w:r>
     </w:p>
     <w:p>
       <w:pPr>
         <w:pStyle w:val="Heading3"/>
         <w:rPr>
-          <w:lang w:val="en-US"/>
-        </w:rPr>
+          <w:rFonts w:ascii="Calibri" w:hAnsi="Calibri" w:eastAsia="Calibri" w:cs="DejaVu Sans"/>
+          <w:b w:val="false"/>
+          <w:b w:val="false"/>
+          <w:bCs w:val="false"/>
+          <w:i w:val="false"/>
+          <w:i w:val="false"/>
+          <w:iCs w:val="false"/>
+          <w:color w:val="00000A"/>
+          <w:sz w:val="22"/>
+          <w:szCs w:val="22"/>
+          <w:lang w:val="en-US" w:eastAsia="en-US" w:bidi="ar-SA"/>
+        </w:rPr>
+      </w:pPr>
+      <w:r>
+        <w:rPr>
+          <w:rFonts w:eastAsia="Calibri" w:cs="DejaVu Sans" w:ascii="Calibri" w:hAnsi="Calibri"/>
+          <w:b w:val="false"/>
+          <w:bCs w:val="false"/>
+          <w:i w:val="false"/>
+          <w:iCs w:val="false"/>
+          <w:color w:val="00000A"/>
+          <w:sz w:val="22"/>
+          <w:szCs w:val="22"/>
+          <w:lang w:val="en-US" w:eastAsia="en-US" w:bidi="ar-SA"/>
+        </w:rPr>
+        <w:t xml:space="preserve">As in all standard OpenFOAM solvers, initial values (IC) and boundary conditions (BC) should be provided  in the “0” folder. In the case of neutronics, the user can either specify </w:t>
+      </w:r>
+      <w:r>
+        <w:rPr>
+          <w:rFonts w:eastAsia="Calibri" w:cs="DejaVu Sans" w:ascii="Calibri" w:hAnsi="Calibri"/>
+          <w:b w:val="false"/>
+          <w:bCs w:val="false"/>
+          <w:i w:val="false"/>
+          <w:iCs w:val="false"/>
+          <w:color w:val="00000A"/>
+          <w:sz w:val="22"/>
+          <w:szCs w:val="22"/>
+          <w:lang w:val="en-US" w:eastAsia="en-US" w:bidi="ar-SA"/>
+        </w:rPr>
+        <w:t xml:space="preserve">different </w:t>
+      </w:r>
+      <w:r>
+        <w:rPr>
+          <w:rFonts w:eastAsia="Calibri" w:cs="DejaVu Sans" w:ascii="Calibri" w:hAnsi="Calibri"/>
+          <w:b w:val="false"/>
+          <w:bCs w:val="false"/>
+          <w:i w:val="false"/>
+          <w:iCs w:val="false"/>
+          <w:color w:val="00000A"/>
+          <w:sz w:val="22"/>
+          <w:szCs w:val="22"/>
+          <w:lang w:val="en-US" w:eastAsia="en-US" w:bidi="ar-SA"/>
+        </w:rPr>
+        <w:t xml:space="preserve">IC and BC for each one of the fluxes (that must be named fluxStar0, fluxStar1., etc…), or provide the same </w:t>
+      </w:r>
+      <w:r>
+        <w:rPr>
+          <w:rFonts w:eastAsia="Calibri" w:cs="DejaVu Sans" w:ascii="Calibri" w:hAnsi="Calibri"/>
+          <w:b w:val="false"/>
+          <w:bCs w:val="false"/>
+          <w:i w:val="false"/>
+          <w:iCs w:val="false"/>
+          <w:color w:val="00000A"/>
+          <w:sz w:val="22"/>
+          <w:szCs w:val="22"/>
+          <w:lang w:val="en-US" w:eastAsia="en-US" w:bidi="ar-SA"/>
+        </w:rPr>
+        <w:t xml:space="preserve">IC and BC to all fluxes by using the defaultFlux field. Similarly, in case of SP3 calculations, the IC and BC for the second moment can be imposed either </w:t>
+      </w:r>
+      <w:r>
+        <w:rPr>
+          <w:rFonts w:eastAsia="Calibri" w:cs="DejaVu Sans" w:ascii="Calibri" w:hAnsi="Calibri"/>
+          <w:b w:val="false"/>
+          <w:bCs w:val="false"/>
+          <w:i w:val="false"/>
+          <w:iCs w:val="false"/>
+          <w:color w:val="00000A"/>
+          <w:sz w:val="22"/>
+          <w:szCs w:val="22"/>
+          <w:lang w:val="en-US" w:eastAsia="en-US" w:bidi="ar-SA"/>
+        </w:rPr>
+        <w:t xml:space="preserve">for each </w:t>
+      </w:r>
+      <w:r>
+        <w:rPr>
+          <w:rFonts w:eastAsia="Calibri" w:cs="DejaVu Sans" w:ascii="Calibri" w:hAnsi="Calibri"/>
+          <w:b w:val="false"/>
+          <w:bCs w:val="false"/>
+          <w:i w:val="false"/>
+          <w:iCs w:val="false"/>
+          <w:color w:val="00000A"/>
+          <w:sz w:val="22"/>
+          <w:szCs w:val="22"/>
+          <w:lang w:val="en-US" w:eastAsia="en-US" w:bidi="ar-SA"/>
+        </w:rPr>
+        <w:t>energy</w:t>
+      </w:r>
+      <w:r>
+        <w:rPr>
+          <w:rFonts w:eastAsia="Calibri" w:cs="DejaVu Sans" w:ascii="Calibri" w:hAnsi="Calibri"/>
+          <w:b w:val="false"/>
+          <w:bCs w:val="false"/>
+          <w:i w:val="false"/>
+          <w:iCs w:val="false"/>
+          <w:color w:val="00000A"/>
+          <w:sz w:val="22"/>
+          <w:szCs w:val="22"/>
+          <w:lang w:val="en-US" w:eastAsia="en-US" w:bidi="ar-SA"/>
+        </w:rPr>
+        <w:t xml:space="preserve"> (</w:t>
+      </w:r>
+      <w:r>
+        <w:rPr>
+          <w:rFonts w:eastAsia="Calibri" w:cs="DejaVu Sans" w:ascii="Calibri" w:hAnsi="Calibri"/>
+          <w:b w:val="false"/>
+          <w:bCs w:val="false"/>
+          <w:i w:val="false"/>
+          <w:iCs w:val="false"/>
+          <w:color w:val="00000A"/>
+          <w:sz w:val="22"/>
+          <w:szCs w:val="22"/>
+          <w:lang w:val="en-US" w:eastAsia="en-US" w:bidi="ar-SA"/>
+        </w:rPr>
+        <w:t xml:space="preserve">using fields named </w:t>
+      </w:r>
+      <w:r>
+        <w:rPr>
+          <w:rFonts w:eastAsia="Calibri" w:cs="DejaVu Sans" w:ascii="Calibri" w:hAnsi="Calibri"/>
+          <w:b w:val="false"/>
+          <w:bCs w:val="false"/>
+          <w:i w:val="false"/>
+          <w:iCs w:val="false"/>
+          <w:color w:val="00000A"/>
+          <w:sz w:val="22"/>
+          <w:szCs w:val="22"/>
+          <w:lang w:val="en-US" w:eastAsia="en-US" w:bidi="ar-SA"/>
+        </w:rPr>
+        <w:t>fluxStar</w:t>
+      </w:r>
+      <w:r>
+        <w:rPr>
+          <w:rFonts w:eastAsia="Calibri" w:cs="DejaVu Sans" w:ascii="Calibri" w:hAnsi="Calibri"/>
+          <w:b w:val="false"/>
+          <w:bCs w:val="false"/>
+          <w:i w:val="false"/>
+          <w:iCs w:val="false"/>
+          <w:color w:val="00000A"/>
+          <w:sz w:val="22"/>
+          <w:szCs w:val="22"/>
+          <w:lang w:val="en-US" w:eastAsia="en-US" w:bidi="ar-SA"/>
+        </w:rPr>
+        <w:t>2</w:t>
+      </w:r>
+      <w:r>
+        <w:rPr>
+          <w:rFonts w:eastAsia="Calibri" w:cs="DejaVu Sans" w:ascii="Calibri" w:hAnsi="Calibri"/>
+          <w:b w:val="false"/>
+          <w:bCs w:val="false"/>
+          <w:i w:val="false"/>
+          <w:iCs w:val="false"/>
+          <w:color w:val="00000A"/>
+          <w:sz w:val="22"/>
+          <w:szCs w:val="22"/>
+          <w:lang w:val="en-US" w:eastAsia="en-US" w:bidi="ar-SA"/>
+        </w:rPr>
+        <w:t>0, fluxStar</w:t>
+      </w:r>
+      <w:r>
+        <w:rPr>
+          <w:rFonts w:eastAsia="Calibri" w:cs="DejaVu Sans" w:ascii="Calibri" w:hAnsi="Calibri"/>
+          <w:b w:val="false"/>
+          <w:bCs w:val="false"/>
+          <w:i w:val="false"/>
+          <w:iCs w:val="false"/>
+          <w:color w:val="00000A"/>
+          <w:sz w:val="22"/>
+          <w:szCs w:val="22"/>
+          <w:lang w:val="en-US" w:eastAsia="en-US" w:bidi="ar-SA"/>
+        </w:rPr>
+        <w:t>2</w:t>
+      </w:r>
+      <w:r>
+        <w:rPr>
+          <w:rFonts w:eastAsia="Calibri" w:cs="DejaVu Sans" w:ascii="Calibri" w:hAnsi="Calibri"/>
+          <w:b w:val="false"/>
+          <w:bCs w:val="false"/>
+          <w:i w:val="false"/>
+          <w:iCs w:val="false"/>
+          <w:color w:val="00000A"/>
+          <w:sz w:val="22"/>
+          <w:szCs w:val="22"/>
+          <w:lang w:val="en-US" w:eastAsia="en-US" w:bidi="ar-SA"/>
+        </w:rPr>
+        <w:t xml:space="preserve">1., etc…), </w:t>
+      </w:r>
+      <w:r>
+        <w:rPr>
+          <w:rFonts w:eastAsia="Calibri" w:cs="DejaVu Sans" w:ascii="Calibri" w:hAnsi="Calibri"/>
+          <w:b w:val="false"/>
+          <w:bCs w:val="false"/>
+          <w:i w:val="false"/>
+          <w:iCs w:val="false"/>
+          <w:color w:val="00000A"/>
+          <w:sz w:val="22"/>
+          <w:szCs w:val="22"/>
+          <w:lang w:val="en-US" w:eastAsia="en-US" w:bidi="ar-SA"/>
+        </w:rPr>
+        <w:t>or to all energies by using the defaultFlux2 field.</w:t>
+      </w:r>
+    </w:p>
+    <w:p>
+      <w:pPr>
+        <w:pStyle w:val="Normal"/>
+        <w:rPr>
+          <w:rFonts w:ascii="Calibri" w:hAnsi="Calibri" w:eastAsia="Calibri" w:cs="DejaVu Sans"/>
+          <w:b w:val="false"/>
+          <w:b w:val="false"/>
+          <w:bCs w:val="false"/>
+          <w:i w:val="false"/>
+          <w:i w:val="false"/>
+          <w:iCs w:val="false"/>
+          <w:color w:val="00000A"/>
+          <w:sz w:val="22"/>
+          <w:szCs w:val="22"/>
+          <w:lang w:val="en-US" w:eastAsia="en-US" w:bidi="ar-SA"/>
+        </w:rPr>
+      </w:pPr>
+      <w:r>
+        <w:rPr>
+          <w:rFonts w:eastAsia="Calibri" w:cs="DejaVu Sans"/>
+          <w:b w:val="false"/>
+          <w:bCs w:val="false"/>
+          <w:i w:val="false"/>
+          <w:iCs w:val="false"/>
+          <w:color w:val="00000A"/>
+          <w:sz w:val="22"/>
+          <w:szCs w:val="22"/>
+          <w:lang w:val="en-US" w:eastAsia="en-US" w:bidi="ar-SA"/>
+        </w:rPr>
+        <w:t>In addition to the standard OpenFOAM BC, an albedo boundary condition is available in OpenFOAM and can be used according to the following syntax:</w:t>
+      </w:r>
+    </w:p>
+    <w:p>
+      <w:pPr>
+        <w:pStyle w:val="Normal"/>
+        <w:rPr>
+          <w:rFonts w:ascii="Calibri" w:hAnsi="Calibri" w:eastAsia="Calibri" w:cs="DejaVu Sans"/>
+          <w:b w:val="false"/>
+          <w:b w:val="false"/>
+          <w:bCs w:val="false"/>
+          <w:i/>
+          <w:i/>
+          <w:iCs/>
+          <w:color w:val="00000A"/>
+          <w:sz w:val="22"/>
+          <w:szCs w:val="22"/>
+          <w:lang w:val="en-US" w:eastAsia="en-US" w:bidi="ar-SA"/>
+        </w:rPr>
+      </w:pPr>
+      <w:r>
+        <w:rPr>
+          <w:rFonts w:eastAsia="Calibri" w:cs="DejaVu Sans"/>
+          <w:b w:val="false"/>
+          <w:bCs w:val="false"/>
+          <w:i/>
+          <w:iCs/>
+          <w:color w:val="00000A"/>
+          <w:sz w:val="22"/>
+          <w:szCs w:val="22"/>
+          <w:lang w:val="en-US" w:eastAsia="en-US" w:bidi="ar-SA"/>
+        </w:rPr>
+        <w:t xml:space="preserve">               </w:t>
+      </w:r>
+      <w:r>
+        <w:rPr>
+          <w:rFonts w:eastAsia="Calibri" w:cs="DejaVu Sans"/>
+          <w:b w:val="false"/>
+          <w:bCs w:val="false"/>
+          <w:i/>
+          <w:iCs/>
+          <w:color w:val="00000A"/>
+          <w:sz w:val="22"/>
+          <w:szCs w:val="22"/>
+          <w:lang w:val="en-US" w:eastAsia="en-US" w:bidi="ar-SA"/>
+        </w:rPr>
+        <w:t>type            albedoSP3;</w:t>
+      </w:r>
+    </w:p>
+    <w:p>
+      <w:pPr>
+        <w:pStyle w:val="Normal"/>
+        <w:rPr>
+          <w:rFonts w:ascii="Calibri" w:hAnsi="Calibri" w:eastAsia="Calibri" w:cs="DejaVu Sans"/>
+          <w:b w:val="false"/>
+          <w:b w:val="false"/>
+          <w:bCs w:val="false"/>
+          <w:i/>
+          <w:i/>
+          <w:iCs/>
+          <w:color w:val="00000A"/>
+          <w:sz w:val="22"/>
+          <w:szCs w:val="22"/>
+          <w:lang w:val="en-US" w:eastAsia="en-US" w:bidi="ar-SA"/>
+        </w:rPr>
+      </w:pPr>
+      <w:r>
+        <w:rPr>
+          <w:rFonts w:eastAsia="Calibri" w:cs="DejaVu Sans"/>
+          <w:b w:val="false"/>
+          <w:bCs w:val="false"/>
+          <w:i/>
+          <w:iCs/>
+          <w:color w:val="00000A"/>
+          <w:sz w:val="22"/>
+          <w:szCs w:val="22"/>
+          <w:lang w:val="en-US" w:eastAsia="en-US" w:bidi="ar-SA"/>
+        </w:rPr>
+        <w:tab/>
+        <w:t>gamma</w:t>
+        <w:tab/>
+        <w:tab/>
+        <w:t>0.5; // defined as (1-alpha)/(1+alpha)/2, alpha being the albedo coefficient</w:t>
+      </w:r>
+    </w:p>
+    <w:p>
+      <w:pPr>
+        <w:pStyle w:val="Normal"/>
+        <w:rPr>
+          <w:rFonts w:ascii="Calibri" w:hAnsi="Calibri" w:eastAsia="Calibri" w:cs="DejaVu Sans"/>
+          <w:b w:val="false"/>
+          <w:b w:val="false"/>
+          <w:bCs w:val="false"/>
+          <w:i/>
+          <w:i/>
+          <w:iCs/>
+          <w:color w:val="00000A"/>
+          <w:sz w:val="22"/>
+          <w:szCs w:val="22"/>
+          <w:lang w:val="en-US" w:eastAsia="en-US" w:bidi="ar-SA"/>
+        </w:rPr>
+      </w:pPr>
+      <w:r>
+        <w:rPr>
+          <w:rFonts w:eastAsia="Calibri" w:cs="DejaVu Sans"/>
+          <w:b w:val="false"/>
+          <w:bCs w:val="false"/>
+          <w:i/>
+          <w:iCs/>
+          <w:color w:val="00000A"/>
+          <w:sz w:val="22"/>
+          <w:szCs w:val="22"/>
+          <w:lang w:val="en-US" w:eastAsia="en-US" w:bidi="ar-SA"/>
+        </w:rPr>
+        <w:tab/>
+        <w:t>diffCoeffName</w:t>
+        <w:tab/>
+        <w:t>Dalbedo;  //not to be changed</w:t>
+      </w:r>
+    </w:p>
+    <w:p>
+      <w:pPr>
+        <w:pStyle w:val="Normal"/>
+        <w:rPr>
+          <w:rFonts w:ascii="Calibri" w:hAnsi="Calibri" w:eastAsia="Calibri" w:cs="DejaVu Sans"/>
+          <w:b w:val="false"/>
+          <w:b w:val="false"/>
+          <w:bCs w:val="false"/>
+          <w:i/>
+          <w:i/>
+          <w:iCs/>
+          <w:color w:val="00000A"/>
+          <w:sz w:val="22"/>
+          <w:szCs w:val="22"/>
+          <w:lang w:val="en-US" w:eastAsia="en-US" w:bidi="ar-SA"/>
+        </w:rPr>
+      </w:pPr>
+      <w:r>
+        <w:rPr>
+          <w:rFonts w:eastAsia="Calibri" w:cs="DejaVu Sans"/>
+          <w:b w:val="false"/>
+          <w:bCs w:val="false"/>
+          <w:i/>
+          <w:iCs/>
+          <w:color w:val="00000A"/>
+          <w:sz w:val="22"/>
+          <w:szCs w:val="22"/>
+          <w:lang w:val="en-US" w:eastAsia="en-US" w:bidi="ar-SA"/>
+        </w:rPr>
+        <w:tab/>
+        <w:t>fluxStarAlbedo  fluxStarAlbedo; //not to be changed</w:t>
+      </w:r>
+    </w:p>
+    <w:p>
+      <w:pPr>
+        <w:pStyle w:val="Normal"/>
+        <w:rPr>
+          <w:rFonts w:ascii="Calibri" w:hAnsi="Calibri" w:eastAsia="Calibri" w:cs="DejaVu Sans"/>
+          <w:b w:val="false"/>
+          <w:b w:val="false"/>
+          <w:bCs w:val="false"/>
+          <w:i/>
+          <w:i/>
+          <w:iCs/>
+          <w:color w:val="00000A"/>
+          <w:sz w:val="22"/>
+          <w:szCs w:val="22"/>
+          <w:lang w:val="en-US" w:eastAsia="en-US" w:bidi="ar-SA"/>
+        </w:rPr>
+      </w:pPr>
+      <w:r>
+        <w:rPr>
+          <w:rFonts w:eastAsia="Calibri" w:cs="DejaVu Sans"/>
+          <w:b w:val="false"/>
+          <w:bCs w:val="false"/>
+          <w:i/>
+          <w:iCs/>
+          <w:color w:val="00000A"/>
+          <w:sz w:val="22"/>
+          <w:szCs w:val="22"/>
+          <w:lang w:val="en-US" w:eastAsia="en-US" w:bidi="ar-SA"/>
+        </w:rPr>
+        <w:tab/>
+        <w:t>forSecondMoment false;  //true in case it is a condition for a second moment flux (for SP3 calculations)</w:t>
+      </w:r>
+    </w:p>
+    <w:p>
+      <w:pPr>
+        <w:pStyle w:val="Normal"/>
+        <w:rPr>
+          <w:rFonts w:ascii="Calibri" w:hAnsi="Calibri" w:eastAsia="Calibri" w:cs="DejaVu Sans"/>
+          <w:b w:val="false"/>
+          <w:b w:val="false"/>
+          <w:bCs w:val="false"/>
+          <w:i/>
+          <w:i/>
+          <w:iCs/>
+          <w:color w:val="00000A"/>
+          <w:sz w:val="22"/>
+          <w:szCs w:val="22"/>
+          <w:lang w:val="en-US" w:eastAsia="en-US" w:bidi="ar-SA"/>
+        </w:rPr>
+      </w:pPr>
+      <w:r>
+        <w:rPr>
+          <w:rFonts w:eastAsia="Calibri" w:cs="DejaVu Sans"/>
+          <w:b w:val="false"/>
+          <w:bCs w:val="false"/>
+          <w:i/>
+          <w:iCs/>
+          <w:color w:val="00000A"/>
+          <w:sz w:val="22"/>
+          <w:szCs w:val="22"/>
+          <w:lang w:val="en-US" w:eastAsia="en-US" w:bidi="ar-SA"/>
+        </w:rPr>
+        <w:tab/>
+        <w:t>value           uniform 1;</w:t>
+      </w:r>
+    </w:p>
+    <w:p>
+      <w:pPr>
+        <w:pStyle w:val="Normal"/>
+        <w:rPr>
+          <w:rFonts w:ascii="Calibri" w:hAnsi="Calibri" w:eastAsia="Calibri" w:cs="DejaVu Sans"/>
+          <w:b w:val="false"/>
+          <w:b w:val="false"/>
+          <w:bCs w:val="false"/>
+          <w:i w:val="false"/>
+          <w:i w:val="false"/>
+          <w:iCs w:val="false"/>
+          <w:color w:val="00000A"/>
+          <w:sz w:val="22"/>
+          <w:szCs w:val="22"/>
+          <w:lang w:val="en-US" w:eastAsia="en-US" w:bidi="ar-SA"/>
+        </w:rPr>
+      </w:pPr>
+      <w:r>
+        <w:rPr>
+          <w:rFonts w:eastAsia="Calibri" w:cs="DejaVu Sans"/>
+          <w:b w:val="false"/>
+          <w:bCs w:val="false"/>
+          <w:i w:val="false"/>
+          <w:iCs w:val="false"/>
+          <w:color w:val="00000A"/>
+          <w:sz w:val="22"/>
+          <w:szCs w:val="22"/>
+          <w:lang w:val="en-US" w:eastAsia="en-US" w:bidi="ar-SA"/>
+        </w:rPr>
+        <w:t xml:space="preserve">IC and BC for precursors do not have to be specified for standard reactors. On the other hand, they should be specified in case of liquid fuel reactors. This is possible by creating a defaultPrec field, in case the same conditions apply to all precursor groups, or by creating the fields named prec0, prec1, etc., in case different conditions must be provided for different precursor groups. </w:t>
+      </w:r>
+    </w:p>
+    <w:p>
+      <w:pPr>
+        <w:pStyle w:val="Normal"/>
+        <w:rPr>
+          <w:rFonts w:ascii="Calibri" w:hAnsi="Calibri" w:eastAsia="Calibri" w:cs="DejaVu Sans"/>
+          <w:b w:val="false"/>
+          <w:b w:val="false"/>
+          <w:bCs w:val="false"/>
+          <w:i w:val="false"/>
+          <w:i w:val="false"/>
+          <w:iCs w:val="false"/>
+          <w:color w:val="00000A"/>
+          <w:sz w:val="22"/>
+          <w:szCs w:val="22"/>
+          <w:lang w:val="en-US" w:eastAsia="en-US" w:bidi="ar-SA"/>
+        </w:rPr>
+      </w:pPr>
+      <w:r>
+        <w:rPr>
+          <w:rFonts w:eastAsia="Calibri" w:cs="DejaVu Sans"/>
+          <w:b w:val="false"/>
+          <w:bCs w:val="false"/>
+          <w:i w:val="false"/>
+          <w:iCs w:val="false"/>
+          <w:color w:val="00000A"/>
+          <w:sz w:val="22"/>
+          <w:szCs w:val="22"/>
+          <w:lang w:val="en-US" w:eastAsia="en-US" w:bidi="ar-SA"/>
+        </w:rPr>
+      </w:r>
+    </w:p>
+    <w:p>
+      <w:pPr>
+        <w:pStyle w:val="Heading3"/>
+        <w:rPr/>
       </w:pPr>
       <w:r>
         <w:rPr>
@@ -1579,6 +2165,125 @@
   <w:abstractNum w:abstractNumId="3">
     <w:lvl w:ilvl="0">
       <w:start w:val="1"/>
+      <w:numFmt w:val="bullet"/>
+      <w:lvlText w:val=""/>
+      <w:lvlJc w:val="left"/>
+      <w:pPr>
+        <w:ind w:left="720" w:hanging="360"/>
+      </w:pPr>
+      <w:rPr>
+        <w:rFonts w:ascii="Symbol" w:hAnsi="Symbol" w:cs="Symbol" w:hint="default"/>
+        <w:rFonts w:cs="Symbol"/>
+      </w:rPr>
+    </w:lvl>
+    <w:lvl w:ilvl="1">
+      <w:start w:val="1"/>
+      <w:numFmt w:val="bullet"/>
+      <w:lvlText w:val="o"/>
+      <w:lvlJc w:val="left"/>
+      <w:pPr>
+        <w:ind w:left="1440" w:hanging="360"/>
+      </w:pPr>
+      <w:rPr>
+        <w:rFonts w:ascii="Courier New" w:hAnsi="Courier New" w:cs="Courier New" w:hint="default"/>
+        <w:rFonts w:cs="Courier New"/>
+      </w:rPr>
+    </w:lvl>
+    <w:lvl w:ilvl="2">
+      <w:start w:val="1"/>
+      <w:numFmt w:val="bullet"/>
+      <w:lvlText w:val=""/>
+      <w:lvlJc w:val="left"/>
+      <w:pPr>
+        <w:ind w:left="2160" w:hanging="360"/>
+      </w:pPr>
+      <w:rPr>
+        <w:rFonts w:ascii="Wingdings" w:hAnsi="Wingdings" w:cs="Wingdings" w:hint="default"/>
+        <w:rFonts w:cs="Wingdings"/>
+      </w:rPr>
+    </w:lvl>
+    <w:lvl w:ilvl="3">
+      <w:start w:val="1"/>
+      <w:numFmt w:val="bullet"/>
+      <w:lvlText w:val=""/>
+      <w:lvlJc w:val="left"/>
+      <w:pPr>
+        <w:ind w:left="2880" w:hanging="360"/>
+      </w:pPr>
+      <w:rPr>
+        <w:rFonts w:ascii="Symbol" w:hAnsi="Symbol" w:cs="Symbol" w:hint="default"/>
+        <w:rFonts w:cs="Symbol"/>
+      </w:rPr>
+    </w:lvl>
+    <w:lvl w:ilvl="4">
+      <w:start w:val="1"/>
+      <w:numFmt w:val="bullet"/>
+      <w:lvlText w:val="o"/>
+      <w:lvlJc w:val="left"/>
+      <w:pPr>
+        <w:ind w:left="3600" w:hanging="360"/>
+      </w:pPr>
+      <w:rPr>
+        <w:rFonts w:ascii="Courier New" w:hAnsi="Courier New" w:cs="Courier New" w:hint="default"/>
+        <w:rFonts w:cs="Courier New"/>
+      </w:rPr>
+    </w:lvl>
+    <w:lvl w:ilvl="5">
+      <w:start w:val="1"/>
+      <w:numFmt w:val="bullet"/>
+      <w:lvlText w:val=""/>
+      <w:lvlJc w:val="left"/>
+      <w:pPr>
+        <w:ind w:left="4320" w:hanging="360"/>
+      </w:pPr>
+      <w:rPr>
+        <w:rFonts w:ascii="Wingdings" w:hAnsi="Wingdings" w:cs="Wingdings" w:hint="default"/>
+        <w:rFonts w:cs="Wingdings"/>
+      </w:rPr>
+    </w:lvl>
+    <w:lvl w:ilvl="6">
+      <w:start w:val="1"/>
+      <w:numFmt w:val="bullet"/>
+      <w:lvlText w:val=""/>
+      <w:lvlJc w:val="left"/>
+      <w:pPr>
+        <w:ind w:left="5040" w:hanging="360"/>
+      </w:pPr>
+      <w:rPr>
+        <w:rFonts w:ascii="Symbol" w:hAnsi="Symbol" w:cs="Symbol" w:hint="default"/>
+        <w:rFonts w:cs="Symbol"/>
+      </w:rPr>
+    </w:lvl>
+    <w:lvl w:ilvl="7">
+      <w:start w:val="1"/>
+      <w:numFmt w:val="bullet"/>
+      <w:lvlText w:val="o"/>
+      <w:lvlJc w:val="left"/>
+      <w:pPr>
+        <w:ind w:left="5760" w:hanging="360"/>
+      </w:pPr>
+      <w:rPr>
+        <w:rFonts w:ascii="Courier New" w:hAnsi="Courier New" w:cs="Courier New" w:hint="default"/>
+        <w:rFonts w:cs="Courier New"/>
+      </w:rPr>
+    </w:lvl>
+    <w:lvl w:ilvl="8">
+      <w:start w:val="1"/>
+      <w:numFmt w:val="bullet"/>
+      <w:lvlText w:val=""/>
+      <w:lvlJc w:val="left"/>
+      <w:pPr>
+        <w:ind w:left="6480" w:hanging="360"/>
+      </w:pPr>
+      <w:rPr>
+        <w:rFonts w:ascii="Wingdings" w:hAnsi="Wingdings" w:cs="Wingdings" w:hint="default"/>
+        <w:rFonts w:cs="Wingdings"/>
+      </w:rPr>
+    </w:lvl>
+  </w:abstractNum>
+  <w:abstractNum w:abstractNumId="4">
+    <w:lvl w:ilvl="0">
+      <w:start w:val="1"/>
       <w:numFmt w:val="none"/>
       <w:suff w:val="nothing"/>
       <w:lvlText w:val=""/>
@@ -1693,125 +2398,6 @@
         </w:tabs>
         <w:ind w:left="1584" w:hanging="1584"/>
       </w:pPr>
-    </w:lvl>
-  </w:abstractNum>
-  <w:abstractNum w:abstractNumId="4">
-    <w:lvl w:ilvl="0">
-      <w:start w:val="1"/>
-      <w:numFmt w:val="bullet"/>
-      <w:lvlText w:val=""/>
-      <w:lvlJc w:val="left"/>
-      <w:pPr>
-        <w:ind w:left="720" w:hanging="360"/>
-      </w:pPr>
-      <w:rPr>
-        <w:rFonts w:ascii="Symbol" w:hAnsi="Symbol" w:cs="Symbol" w:hint="default"/>
-        <w:rFonts w:cs="Symbol"/>
-      </w:rPr>
-    </w:lvl>
-    <w:lvl w:ilvl="1">
-      <w:start w:val="1"/>
-      <w:numFmt w:val="bullet"/>
-      <w:lvlText w:val="o"/>
-      <w:lvlJc w:val="left"/>
-      <w:pPr>
-        <w:ind w:left="1440" w:hanging="360"/>
-      </w:pPr>
-      <w:rPr>
-        <w:rFonts w:ascii="Courier New" w:hAnsi="Courier New" w:cs="Courier New" w:hint="default"/>
-        <w:rFonts w:cs="Courier New"/>
-      </w:rPr>
-    </w:lvl>
-    <w:lvl w:ilvl="2">
-      <w:start w:val="1"/>
-      <w:numFmt w:val="bullet"/>
-      <w:lvlText w:val=""/>
-      <w:lvlJc w:val="left"/>
-      <w:pPr>
-        <w:ind w:left="2160" w:hanging="360"/>
-      </w:pPr>
-      <w:rPr>
-        <w:rFonts w:ascii="Wingdings" w:hAnsi="Wingdings" w:cs="Wingdings" w:hint="default"/>
-        <w:rFonts w:cs="Wingdings"/>
-      </w:rPr>
-    </w:lvl>
-    <w:lvl w:ilvl="3">
-      <w:start w:val="1"/>
-      <w:numFmt w:val="bullet"/>
-      <w:lvlText w:val=""/>
-      <w:lvlJc w:val="left"/>
-      <w:pPr>
-        <w:ind w:left="2880" w:hanging="360"/>
-      </w:pPr>
-      <w:rPr>
-        <w:rFonts w:ascii="Symbol" w:hAnsi="Symbol" w:cs="Symbol" w:hint="default"/>
-        <w:rFonts w:cs="Symbol"/>
-      </w:rPr>
-    </w:lvl>
-    <w:lvl w:ilvl="4">
-      <w:start w:val="1"/>
-      <w:numFmt w:val="bullet"/>
-      <w:lvlText w:val="o"/>
-      <w:lvlJc w:val="left"/>
-      <w:pPr>
-        <w:ind w:left="3600" w:hanging="360"/>
-      </w:pPr>
-      <w:rPr>
-        <w:rFonts w:ascii="Courier New" w:hAnsi="Courier New" w:cs="Courier New" w:hint="default"/>
-        <w:rFonts w:cs="Courier New"/>
-      </w:rPr>
-    </w:lvl>
-    <w:lvl w:ilvl="5">
-      <w:start w:val="1"/>
-      <w:numFmt w:val="bullet"/>
-      <w:lvlText w:val=""/>
-      <w:lvlJc w:val="left"/>
-      <w:pPr>
-        <w:ind w:left="4320" w:hanging="360"/>
-      </w:pPr>
-      <w:rPr>
-        <w:rFonts w:ascii="Wingdings" w:hAnsi="Wingdings" w:cs="Wingdings" w:hint="default"/>
-        <w:rFonts w:cs="Wingdings"/>
-      </w:rPr>
-    </w:lvl>
-    <w:lvl w:ilvl="6">
-      <w:start w:val="1"/>
-      <w:numFmt w:val="bullet"/>
-      <w:lvlText w:val=""/>
-      <w:lvlJc w:val="left"/>
-      <w:pPr>
-        <w:ind w:left="5040" w:hanging="360"/>
-      </w:pPr>
-      <w:rPr>
-        <w:rFonts w:ascii="Symbol" w:hAnsi="Symbol" w:cs="Symbol" w:hint="default"/>
-        <w:rFonts w:cs="Symbol"/>
-      </w:rPr>
-    </w:lvl>
-    <w:lvl w:ilvl="7">
-      <w:start w:val="1"/>
-      <w:numFmt w:val="bullet"/>
-      <w:lvlText w:val="o"/>
-      <w:lvlJc w:val="left"/>
-      <w:pPr>
-        <w:ind w:left="5760" w:hanging="360"/>
-      </w:pPr>
-      <w:rPr>
-        <w:rFonts w:ascii="Courier New" w:hAnsi="Courier New" w:cs="Courier New" w:hint="default"/>
-        <w:rFonts w:cs="Courier New"/>
-      </w:rPr>
-    </w:lvl>
-    <w:lvl w:ilvl="8">
-      <w:start w:val="1"/>
-      <w:numFmt w:val="bullet"/>
-      <w:lvlText w:val=""/>
-      <w:lvlJc w:val="left"/>
-      <w:pPr>
-        <w:ind w:left="6480" w:hanging="360"/>
-      </w:pPr>
-      <w:rPr>
-        <w:rFonts w:ascii="Wingdings" w:hAnsi="Wingdings" w:cs="Wingdings" w:hint="default"/>
-        <w:rFonts w:cs="Wingdings"/>
-      </w:rPr>
     </w:lvl>
   </w:abstractNum>
   <w:num w:numId="1">
@@ -1835,6 +2421,7 @@
     <w:rPrDefault>
       <w:rPr>
         <w:rFonts w:ascii="Calibri" w:hAnsi="Calibri" w:eastAsia="Calibri" w:cs="DejaVu Sans"/>
+        <w:sz w:val="20"/>
         <w:szCs w:val="22"/>
         <w:lang w:val="de-CH" w:eastAsia="en-US" w:bidi="ar-SA"/>
       </w:rPr>
@@ -1848,9 +2435,7 @@
     <w:qFormat/>
     <w:pPr>
       <w:widowControl/>
-      <w:kinsoku w:val="true"/>
-      <w:overflowPunct w:val="true"/>
-      <w:autoSpaceDE w:val="true"/>
+      <w:overflowPunct w:val="false"/>
       <w:bidi w:val="0"/>
       <w:spacing w:lineRule="auto" w:line="276" w:before="0" w:after="200"/>
       <w:jc w:val="left"/>
@@ -1871,10 +2456,6 @@
     <w:pPr>
       <w:keepNext/>
       <w:keepLines/>
-      <w:numPr>
-        <w:ilvl w:val="0"/>
-        <w:numId w:val="0"/>
-      </w:numPr>
       <w:spacing w:before="480" w:after="0"/>
       <w:outlineLvl w:val="0"/>
     </w:pPr>
@@ -1895,10 +2476,6 @@
     <w:pPr>
       <w:keepNext/>
       <w:keepLines/>
-      <w:numPr>
-        <w:ilvl w:val="0"/>
-        <w:numId w:val="0"/>
-      </w:numPr>
       <w:spacing w:before="200" w:after="0"/>
       <w:outlineLvl w:val="1"/>
     </w:pPr>
@@ -1919,10 +2496,6 @@
     <w:pPr>
       <w:keepNext/>
       <w:keepLines/>
-      <w:numPr>
-        <w:ilvl w:val="0"/>
-        <w:numId w:val="0"/>
-      </w:numPr>
       <w:spacing w:before="200" w:after="0"/>
       <w:outlineLvl w:val="2"/>
     </w:pPr>
@@ -2085,6 +2658,132 @@
   </w:style>
   <w:style w:type="character" w:styleId="ListLabel12">
     <w:name w:val="ListLabel 12"/>
+    <w:qFormat/>
+    <w:rPr>
+      <w:rFonts w:cs="Wingdings"/>
+    </w:rPr>
+  </w:style>
+  <w:style w:type="character" w:styleId="ListLabel13">
+    <w:name w:val="ListLabel 13"/>
+    <w:qFormat/>
+    <w:rPr>
+      <w:rFonts w:cs="Symbol"/>
+    </w:rPr>
+  </w:style>
+  <w:style w:type="character" w:styleId="ListLabel14">
+    <w:name w:val="ListLabel 14"/>
+    <w:qFormat/>
+    <w:rPr>
+      <w:rFonts w:cs="Courier New"/>
+    </w:rPr>
+  </w:style>
+  <w:style w:type="character" w:styleId="ListLabel15">
+    <w:name w:val="ListLabel 15"/>
+    <w:qFormat/>
+    <w:rPr>
+      <w:rFonts w:cs="Wingdings"/>
+    </w:rPr>
+  </w:style>
+  <w:style w:type="character" w:styleId="ListLabel16">
+    <w:name w:val="ListLabel 16"/>
+    <w:qFormat/>
+    <w:rPr>
+      <w:rFonts w:cs="Symbol"/>
+    </w:rPr>
+  </w:style>
+  <w:style w:type="character" w:styleId="ListLabel17">
+    <w:name w:val="ListLabel 17"/>
+    <w:qFormat/>
+    <w:rPr>
+      <w:rFonts w:cs="Courier New"/>
+    </w:rPr>
+  </w:style>
+  <w:style w:type="character" w:styleId="ListLabel18">
+    <w:name w:val="ListLabel 18"/>
+    <w:qFormat/>
+    <w:rPr>
+      <w:rFonts w:cs="Wingdings"/>
+    </w:rPr>
+  </w:style>
+  <w:style w:type="character" w:styleId="ListLabel19">
+    <w:name w:val="ListLabel 19"/>
+    <w:qFormat/>
+    <w:rPr>
+      <w:rFonts w:cs="Symbol"/>
+    </w:rPr>
+  </w:style>
+  <w:style w:type="character" w:styleId="ListLabel20">
+    <w:name w:val="ListLabel 20"/>
+    <w:qFormat/>
+    <w:rPr>
+      <w:rFonts w:cs="Courier New"/>
+    </w:rPr>
+  </w:style>
+  <w:style w:type="character" w:styleId="ListLabel21">
+    <w:name w:val="ListLabel 21"/>
+    <w:qFormat/>
+    <w:rPr>
+      <w:rFonts w:cs="Wingdings"/>
+    </w:rPr>
+  </w:style>
+  <w:style w:type="character" w:styleId="ListLabel22">
+    <w:name w:val="ListLabel 22"/>
+    <w:qFormat/>
+    <w:rPr>
+      <w:rFonts w:cs="Symbol"/>
+    </w:rPr>
+  </w:style>
+  <w:style w:type="character" w:styleId="ListLabel23">
+    <w:name w:val="ListLabel 23"/>
+    <w:qFormat/>
+    <w:rPr>
+      <w:rFonts w:cs="Courier New"/>
+    </w:rPr>
+  </w:style>
+  <w:style w:type="character" w:styleId="ListLabel24">
+    <w:name w:val="ListLabel 24"/>
+    <w:qFormat/>
+    <w:rPr>
+      <w:rFonts w:cs="Wingdings"/>
+    </w:rPr>
+  </w:style>
+  <w:style w:type="character" w:styleId="ListLabel25">
+    <w:name w:val="ListLabel 25"/>
+    <w:qFormat/>
+    <w:rPr>
+      <w:rFonts w:cs="Symbol"/>
+    </w:rPr>
+  </w:style>
+  <w:style w:type="character" w:styleId="ListLabel26">
+    <w:name w:val="ListLabel 26"/>
+    <w:qFormat/>
+    <w:rPr>
+      <w:rFonts w:cs="Courier New"/>
+    </w:rPr>
+  </w:style>
+  <w:style w:type="character" w:styleId="ListLabel27">
+    <w:name w:val="ListLabel 27"/>
+    <w:qFormat/>
+    <w:rPr>
+      <w:rFonts w:cs="Wingdings"/>
+    </w:rPr>
+  </w:style>
+  <w:style w:type="character" w:styleId="ListLabel28">
+    <w:name w:val="ListLabel 28"/>
+    <w:qFormat/>
+    <w:rPr>
+      <w:rFonts w:cs="Symbol"/>
+    </w:rPr>
+  </w:style>
+  <w:style w:type="character" w:styleId="ListLabel29">
+    <w:name w:val="ListLabel 29"/>
+    <w:qFormat/>
+    <w:rPr>
+      <w:rFonts w:cs="Courier New"/>
+    </w:rPr>
+  </w:style>
+  <w:style w:type="character" w:styleId="ListLabel30">
+    <w:name w:val="ListLabel 30"/>
     <w:qFormat/>
     <w:rPr>
       <w:rFonts w:cs="Wingdings"/>

</xml_diff>

<commit_message>
howTo modified - suggestions from Paolo Balestra
</commit_message>
<xml_diff>
--- a/Documentation/howTo.docx
+++ b/Documentation/howTo.docx
@@ -51,14 +51,12 @@
           <w:t>carlo.fiorina@outlook.com</w:t>
         </w:r>
       </w:hyperlink>
-      <w:hyperlink r:id="rId4">
-        <w:r>
-          <w:rPr>
-            <w:lang w:val="en-US"/>
-          </w:rPr>
-          <w:t xml:space="preserve"> )</w:t>
-        </w:r>
-      </w:hyperlink>
+      <w:r>
+        <w:rPr>
+          <w:lang w:val="en-US"/>
+        </w:rPr>
+        <w:t xml:space="preserve"> )</w:t>
+      </w:r>
     </w:p>
     <w:p>
       <w:pPr>
@@ -69,13 +67,7 @@
         <w:rPr>
           <w:lang w:val="en-US"/>
         </w:rPr>
-        <w:t xml:space="preserve">Using GeN-Foam requires a basic knowledge of OpenFOAM [1]. In view of its complexity, this document has been written aiming at facilitating its use. In addition, one tutorial (ESFR3D_small) has been prepared. It is a 3-D model for the European Sodium Fast Reactor (ESFR) [2]. An EMPTY case is also provided that can be used for building step by step one’s own case. </w:t>
-      </w:r>
-      <w:r>
-        <w:rPr>
-          <w:lang w:val="en-US"/>
-        </w:rPr>
-        <w:t>It is recommended to start from  the EMPTY case to build a case, as it already includes a consistent minimum set of (dummy) files that have to be present independent of the physics that are solved for.</w:t>
+        <w:t>Using GeN-Foam requires a basic knowledge of OpenFOAM [1]. In view of its complexity, this document has been written aiming at facilitating its use. In addition, one tutorial (ESFR3D_small) has been prepared. It is a 3-D model for the European Sodium Fast Reactor (ESFR) [2]. An EMPTY case is also provided that can be used for building step by step one’s own case. It is recommended to start from  the EMPTY case to build a case, as it already includes a consistent minimum set of (dummy) files that have to be present independent of the physics that are solved for.</w:t>
       </w:r>
     </w:p>
     <w:p>
@@ -101,19 +93,7 @@
         <w:rPr>
           <w:lang w:val="en-US"/>
         </w:rPr>
-        <w:t xml:space="preserve">GeN-Foam is built as a standard OpenFOAM solver. As such, one should first install the latest OpenFOAM </w:t>
-      </w:r>
-      <w:r>
-        <w:rPr>
-          <w:lang w:val="en-US"/>
-        </w:rPr>
-        <w:t>foundation</w:t>
-      </w:r>
-      <w:r>
-        <w:rPr>
-          <w:lang w:val="en-US"/>
-        </w:rPr>
-        <w:t xml:space="preserve"> version and then compile GeN-Foam </w:t>
+        <w:t xml:space="preserve">GeN-Foam is built as a standard OpenFOAM solver. As such, one should first install the latest OpenFOAM foundation version and then compile GeN-Foam </w:t>
       </w:r>
       <w:r>
         <w:rPr>
@@ -198,19 +178,7 @@
         <w:rPr>
           <w:lang w:val="en-US"/>
         </w:rPr>
-        <w:t xml:space="preserve">N.B. A dummy mesh must always be present in all physics directories, even if not solved for. The EMPTY case is already provided with minimal dummy meshes </w:t>
-      </w:r>
-      <w:r>
-        <w:rPr>
-          <w:lang w:val="en-US"/>
-        </w:rPr>
-        <w:t>and consistent fields in the “0” folder</w:t>
-      </w:r>
-      <w:r>
-        <w:rPr>
-          <w:lang w:val="en-US"/>
-        </w:rPr>
-        <w:t>.</w:t>
+        <w:t>N.B. A dummy mesh must always be present in all physics directories, even if not solved for. The EMPTY case is already provided with minimal dummy meshes and consistent fields in the “0” folder.</w:t>
       </w:r>
     </w:p>
     <w:p>
@@ -236,19 +204,7 @@
         <w:rPr>
           <w:lang w:val="en-US"/>
         </w:rPr>
-        <w:t>GeN-Foam uses three different meshes for neutronics, thermal-hydraulics and thermal-mechanics. There is no requirement for the three meshes to occupy the same region of space. Consistent mapping of fields is performed and a reference value is given to a field if no correspondence is found in the mesh where its value is being projected from. It follows that the geometry for neutronics can include without problems only a small part of the overall reactor geometry.  Meshes can be created with every OpenFoam-compatible tool. Meshes should be divided into mesh zones (cellZones) to allow the use of different physical properties (e.g., cross sections) in different reactor regions. S</w:t>
-      </w:r>
-      <w:r>
-        <w:rPr>
-          <w:lang w:val="en-US"/>
-        </w:rPr>
-        <w:t>o</w:t>
-      </w:r>
-      <w:r>
-        <w:rPr>
-          <w:lang w:val="en-US"/>
-        </w:rPr>
-        <w:t>metimes, when converting a mesh to the polymesh format, cellSets (and not cellZones) are created. The topoSetDict must be set and used to convert cellSets to cellZones.</w:t>
+        <w:t>GeN-Foam uses three different meshes for neutronics, thermal-hydraulics and thermal-mechanics. There is no requirement for the three meshes to occupy the same region of space. Consistent mapping of fields is performed and a reference value is given to a field if no correspondence is found in the mesh where its value is being projected from. It follows that the geometry for neutronics can include without problems only a small part of the overall reactor geometry.  Meshes can be created with every OpenFoam-compatible tool. Meshes should be divided into mesh zones (cellZones) to allow the use of different physical properties (e.g., cross sections) in different reactor regions. Sometimes, when converting a mesh to the polymesh format, cellSets (and not cellZones) are created. The topoSetDict must be set and used to convert cellSets to cellZones.</w:t>
       </w:r>
     </w:p>
     <w:p>
@@ -262,7 +218,7 @@
         </w:rPr>
         <w:t>The ESFR3D_small tutorial includes an example of mesh generation with Gmsh (</w:t>
       </w:r>
-      <w:hyperlink r:id="rId5">
+      <w:hyperlink r:id="rId4">
         <w:r>
           <w:rPr>
             <w:rStyle w:val="InternetLink"/>
@@ -441,25 +397,7 @@
         <w:rPr>
           <w:lang w:val="en-US"/>
         </w:rPr>
-        <w:t>The</w:t>
-      </w:r>
-      <w:r>
-        <w:rPr>
-          <w:lang w:val="en-US"/>
-        </w:rPr>
-        <w:t xml:space="preserve">  data for the GeN-Foam simulations </w:t>
-      </w:r>
-      <w:r>
-        <w:rPr>
-          <w:lang w:val="en-US"/>
-        </w:rPr>
-        <w:t>can</w:t>
-      </w:r>
-      <w:r>
-        <w:rPr>
-          <w:lang w:val="en-US"/>
-        </w:rPr>
-        <w:t xml:space="preserve"> be included in the following input files (dictionaries):</w:t>
+        <w:t>The  data for the GeN-Foam simulations can be included in the following input files (dictionaries):</w:t>
       </w:r>
     </w:p>
     <w:p>
@@ -482,7 +420,7 @@
         <w:rPr>
           <w:lang w:val="en-US"/>
         </w:rPr>
-        <w:t>–thermo-mechanical properties of structures, subdivided according to the mesh zones in the thermo-mechanical mesh.</w:t>
+        <w:t>-thermo-mechanical properties of structures, subdivided according to the mesh zones in the thermo-mechanical mesh.</w:t>
       </w:r>
     </w:p>
     <w:p>
@@ -518,7 +456,7 @@
         <w:rPr>
           <w:lang w:val="en-US"/>
         </w:rPr>
-        <w:t xml:space="preserve"> – thermal expansion coefficient for the coolant and reference temperature to evaluate the gravitational force in case of incompressible simulations  with constant coolant density (Boussinesq approximation).</w:t>
+        <w:t xml:space="preserve"> - thermal expansion coefficient for the coolant and reference temperature to evaluate the gravitational force in case of incompressible simulations  with constant coolant density (Boussinesq approximation).</w:t>
       </w:r>
     </w:p>
     <w:p>
@@ -541,7 +479,7 @@
         <w:rPr>
           <w:lang w:val="en-US"/>
         </w:rPr>
-        <w:t xml:space="preserve"> – gravitational acceleration</w:t>
+        <w:t xml:space="preserve"> - gravitational acceleration</w:t>
       </w:r>
     </w:p>
     <w:p>
@@ -564,7 +502,7 @@
         <w:rPr>
           <w:lang w:val="en-US"/>
         </w:rPr>
-        <w:t xml:space="preserve"> – properties of the sub-scale fuel, for each mesh zone that contains the fuel</w:t>
+        <w:t xml:space="preserve"> - properties of the sub-scale fuel, for each mesh zone that contains the fuel</w:t>
       </w:r>
     </w:p>
     <w:p>
@@ -587,7 +525,7 @@
         <w:rPr>
           <w:lang w:val="en-US"/>
         </w:rPr>
-        <w:t xml:space="preserve"> – properties of the sub-scale porous structure for each mesh zone that contains a porous structure. Clear fluid is assumed for unspecified zones.</w:t>
+        <w:t xml:space="preserve"> - properties of the sub-scale porous structure for each mesh zone that contains a porous structure. Clear fluid is assumed for unspecified zones.</w:t>
       </w:r>
     </w:p>
     <w:p>
@@ -604,32 +542,13 @@
           <w:i/>
           <w:lang w:val="en-US"/>
         </w:rPr>
-        <w:t>c</w:t>
-      </w:r>
-      <w:r>
-        <w:rPr>
-          <w:i/>
-          <w:lang w:val="en-US"/>
-        </w:rPr>
-        <w:t>onstant/fluidRegion/ turbulenceProperties</w:t>
-      </w:r>
-      <w:r>
-        <w:rPr>
-          <w:lang w:val="en-US"/>
-        </w:rPr>
-        <w:t xml:space="preserve"> – standard OpenFOAM dictionar</w:t>
-      </w:r>
-      <w:r>
-        <w:rPr>
-          <w:lang w:val="en-US"/>
-        </w:rPr>
-        <w:t>y</w:t>
-      </w:r>
-      <w:r>
-        <w:rPr>
-          <w:lang w:val="en-US"/>
-        </w:rPr>
-        <w:t xml:space="preserve"> to define the turbulence model to be used</w:t>
+        <w:t>constant/fluidRegion/ turbulenceProperties</w:t>
+      </w:r>
+      <w:r>
+        <w:rPr>
+          <w:lang w:val="en-US"/>
+        </w:rPr>
+        <w:t xml:space="preserve"> - standard OpenFOAM dictionary to define the turbulence model to be used</w:t>
       </w:r>
     </w:p>
     <w:p>
@@ -652,7 +571,7 @@
         <w:rPr>
           <w:lang w:val="en-US"/>
         </w:rPr>
-        <w:t xml:space="preserve"> – standard OpenFOAM dictionary to define the thermophysical properties of the coolant</w:t>
+        <w:t xml:space="preserve"> - standard OpenFOAM dictionary to define the thermophysical properties of the coolant</w:t>
       </w:r>
     </w:p>
     <w:p>
@@ -675,7 +594,7 @@
         <w:rPr>
           <w:lang w:val="en-US"/>
         </w:rPr>
-        <w:t xml:space="preserve">– contains all basic nuclear properties for the reference reactor state. The other </w:t>
+        <w:t xml:space="preserve">- contains all basic nuclear properties for the reference reactor state. The other </w:t>
       </w:r>
       <w:r>
         <w:rPr>
@@ -701,31 +620,7 @@
         <w:rPr>
           <w:lang w:val="en-US"/>
         </w:rPr>
-        <w:t xml:space="preserve"> should include the cross-sections for perturbed reactor states. Linear interpolation is performed by GeN-Foam between reference and perturbed reactor states, except for fuel temperature, for which a logarithmic </w:t>
-      </w:r>
-      <w:r>
-        <w:rPr>
-          <w:lang w:val="en-US"/>
-        </w:rPr>
-        <w:t>or square root</w:t>
-      </w:r>
-      <w:r>
-        <w:rPr>
-          <w:lang w:val="en-US"/>
-        </w:rPr>
-        <w:t xml:space="preserve"> interpolation is provided </w:t>
-      </w:r>
-      <w:r>
-        <w:rPr>
-          <w:lang w:val="en-US"/>
-        </w:rPr>
-        <w:t>(depending on the spectrum)</w:t>
-      </w:r>
-      <w:r>
-        <w:rPr>
-          <w:lang w:val="en-US"/>
-        </w:rPr>
-        <w:t xml:space="preserve">.  If no data are provided, the reference cross sections are used. Nuclear data can be generated using whatever nuclear code.  The </w:t>
+        <w:t xml:space="preserve"> should include the cross-sections for perturbed reactor states. Linear interpolation is performed by GeN-Foam between reference and perturbed reactor states, except for fuel temperature, for which a logarithmic or square root interpolation is provided (depending on the spectrum).  If no data are provided, the reference cross sections are used. Nuclear data can be generated using whatever nuclear code.  The </w:t>
       </w:r>
       <w:r>
         <w:rPr>
@@ -738,19 +633,7 @@
         <w:rPr>
           <w:lang w:val="en-US"/>
         </w:rPr>
-        <w:t xml:space="preserve"> routines provided with GeN-Foam is a Matlab </w:t>
-      </w:r>
-      <w:r>
-        <w:rPr>
-          <w:lang w:val="en-US"/>
-        </w:rPr>
-        <w:t>(or octave)</w:t>
-      </w:r>
-      <w:r>
-        <w:rPr>
-          <w:lang w:val="en-US"/>
-        </w:rPr>
-        <w:t xml:space="preserve"> script that automatically converts serpent output files into the nuclear data files employed by GeN-Foam. The entry discFactor is used only if discontinuity factors have to be used. The term integralFlux, is used only if the automatic adjustment of  discontinuity factors is performed. Nonetheless, these entries should always be present. </w:t>
+        <w:t xml:space="preserve"> routines provided with GeN-Foam is a Matlab (or octave) script that automatically converts serpent output files into the nuclear data files employed by GeN-Foam. The entry discFactor is used only if discontinuity factors have to be used. The term integralFlux, is used only if the automatic adjustment of  discontinuity factors is performed. Nonetheless, these entries should always be present. </w:t>
       </w:r>
     </w:p>
     <w:p>
@@ -767,7 +650,7 @@
           <w:i/>
           <w:lang w:val="en-US"/>
         </w:rPr>
-        <w:t xml:space="preserve">constant/ neutroRegion /CRMove – </w:t>
+        <w:t xml:space="preserve">constant/ neutroRegion /CRMove - </w:t>
       </w:r>
       <w:r>
         <w:rPr>
@@ -937,7 +820,7 @@
       <w:pPr>
         <w:pStyle w:val="ListParagraph"/>
         <w:widowControl/>
-        <w:overflowPunct w:val="true"/>
+        <w:overflowPunct w:val="false"/>
         <w:bidi w:val="0"/>
         <w:spacing w:lineRule="auto" w:line="276" w:before="0" w:after="200"/>
         <w:ind w:left="0" w:right="0" w:hanging="0"/>
@@ -1016,35 +899,7 @@
           <w:szCs w:val="22"/>
           <w:lang w:val="en-US" w:eastAsia="en-US" w:bidi="ar-SA"/>
         </w:rPr>
-        <w:t xml:space="preserve">In addition to the standard OpenFOAM BC, an albedo boundary condition is available in </w:t>
-      </w:r>
-      <w:r>
-        <w:rPr>
-          <w:rFonts w:eastAsia="Calibri" w:cs="DejaVu Sans"/>
-          <w:b w:val="false"/>
-          <w:bCs w:val="false"/>
-          <w:i w:val="false"/>
-          <w:iCs w:val="false"/>
-          <w:color w:val="00000A"/>
-          <w:sz w:val="22"/>
-          <w:szCs w:val="22"/>
-          <w:lang w:val="en-US" w:eastAsia="en-US" w:bidi="ar-SA"/>
-        </w:rPr>
-        <w:t>GeN-Foam</w:t>
-      </w:r>
-      <w:r>
-        <w:rPr>
-          <w:rFonts w:eastAsia="Calibri" w:cs="DejaVu Sans"/>
-          <w:b w:val="false"/>
-          <w:bCs w:val="false"/>
-          <w:i w:val="false"/>
-          <w:iCs w:val="false"/>
-          <w:color w:val="00000A"/>
-          <w:sz w:val="22"/>
-          <w:szCs w:val="22"/>
-          <w:lang w:val="en-US" w:eastAsia="en-US" w:bidi="ar-SA"/>
-        </w:rPr>
-        <w:t xml:space="preserve"> and can be used according to the following syntax:</w:t>
+        <w:t>In addition to the standard OpenFOAM BC, an albedo boundary condition is available in GeN-Foam and can be used according to the following syntax:</w:t>
       </w:r>
     </w:p>
     <w:p>
@@ -1586,7 +1441,7 @@
           <w:i/>
           <w:lang w:val="en-US"/>
         </w:rPr>
-        <w:t>mpirun –np (number of processors) GeN-Foam -parallel</w:t>
+        <w:t>mpirun -np (number of processors) GeN-Foam -parallel</w:t>
       </w:r>
     </w:p>
     <w:p>
@@ -1618,7 +1473,21 @@
           <w:i/>
           <w:lang w:val="en-US"/>
         </w:rPr>
-        <w:t>decomposPar –region (region name)</w:t>
+        <w:t>decompos</w:t>
+      </w:r>
+      <w:r>
+        <w:rPr>
+          <w:i/>
+          <w:lang w:val="en-US"/>
+        </w:rPr>
+        <w:t>e</w:t>
+      </w:r>
+      <w:r>
+        <w:rPr>
+          <w:i/>
+          <w:lang w:val="en-US"/>
+        </w:rPr>
+        <w:t>Par -region (region name)</w:t>
       </w:r>
     </w:p>
     <w:p>
@@ -1731,7 +1600,7 @@
           <w:i/>
           <w:lang w:val="en-US"/>
         </w:rPr>
-        <w:t>paraFoam –region (region name)</w:t>
+        <w:t>paraFoam -region (region name)</w:t>
       </w:r>
     </w:p>
     <w:p>
@@ -2369,7 +2238,7 @@
     <w:qFormat/>
     <w:pPr>
       <w:widowControl/>
-      <w:overflowPunct w:val="true"/>
+      <w:overflowPunct w:val="false"/>
       <w:bidi w:val="0"/>
       <w:spacing w:lineRule="auto" w:line="276" w:before="0" w:after="200"/>
       <w:jc w:val="left"/>
@@ -2844,6 +2713,132 @@
   </w:style>
   <w:style w:type="character" w:styleId="ListLabel48">
     <w:name w:val="ListLabel 48"/>
+    <w:qFormat/>
+    <w:rPr>
+      <w:rFonts w:cs="Wingdings"/>
+    </w:rPr>
+  </w:style>
+  <w:style w:type="character" w:styleId="ListLabel49">
+    <w:name w:val="ListLabel 49"/>
+    <w:qFormat/>
+    <w:rPr>
+      <w:rFonts w:cs="Symbol"/>
+    </w:rPr>
+  </w:style>
+  <w:style w:type="character" w:styleId="ListLabel50">
+    <w:name w:val="ListLabel 50"/>
+    <w:qFormat/>
+    <w:rPr>
+      <w:rFonts w:cs="Courier New"/>
+    </w:rPr>
+  </w:style>
+  <w:style w:type="character" w:styleId="ListLabel51">
+    <w:name w:val="ListLabel 51"/>
+    <w:qFormat/>
+    <w:rPr>
+      <w:rFonts w:cs="Wingdings"/>
+    </w:rPr>
+  </w:style>
+  <w:style w:type="character" w:styleId="ListLabel52">
+    <w:name w:val="ListLabel 52"/>
+    <w:qFormat/>
+    <w:rPr>
+      <w:rFonts w:cs="Symbol"/>
+    </w:rPr>
+  </w:style>
+  <w:style w:type="character" w:styleId="ListLabel53">
+    <w:name w:val="ListLabel 53"/>
+    <w:qFormat/>
+    <w:rPr>
+      <w:rFonts w:cs="Courier New"/>
+    </w:rPr>
+  </w:style>
+  <w:style w:type="character" w:styleId="ListLabel54">
+    <w:name w:val="ListLabel 54"/>
+    <w:qFormat/>
+    <w:rPr>
+      <w:rFonts w:cs="Wingdings"/>
+    </w:rPr>
+  </w:style>
+  <w:style w:type="character" w:styleId="ListLabel55">
+    <w:name w:val="ListLabel 55"/>
+    <w:qFormat/>
+    <w:rPr>
+      <w:rFonts w:cs="Symbol"/>
+    </w:rPr>
+  </w:style>
+  <w:style w:type="character" w:styleId="ListLabel56">
+    <w:name w:val="ListLabel 56"/>
+    <w:qFormat/>
+    <w:rPr>
+      <w:rFonts w:cs="Courier New"/>
+    </w:rPr>
+  </w:style>
+  <w:style w:type="character" w:styleId="ListLabel57">
+    <w:name w:val="ListLabel 57"/>
+    <w:qFormat/>
+    <w:rPr>
+      <w:rFonts w:cs="Wingdings"/>
+    </w:rPr>
+  </w:style>
+  <w:style w:type="character" w:styleId="ListLabel58">
+    <w:name w:val="ListLabel 58"/>
+    <w:qFormat/>
+    <w:rPr>
+      <w:rFonts w:cs="Symbol"/>
+    </w:rPr>
+  </w:style>
+  <w:style w:type="character" w:styleId="ListLabel59">
+    <w:name w:val="ListLabel 59"/>
+    <w:qFormat/>
+    <w:rPr>
+      <w:rFonts w:cs="Courier New"/>
+    </w:rPr>
+  </w:style>
+  <w:style w:type="character" w:styleId="ListLabel60">
+    <w:name w:val="ListLabel 60"/>
+    <w:qFormat/>
+    <w:rPr>
+      <w:rFonts w:cs="Wingdings"/>
+    </w:rPr>
+  </w:style>
+  <w:style w:type="character" w:styleId="ListLabel61">
+    <w:name w:val="ListLabel 61"/>
+    <w:qFormat/>
+    <w:rPr>
+      <w:rFonts w:cs="Symbol"/>
+    </w:rPr>
+  </w:style>
+  <w:style w:type="character" w:styleId="ListLabel62">
+    <w:name w:val="ListLabel 62"/>
+    <w:qFormat/>
+    <w:rPr>
+      <w:rFonts w:cs="Courier New"/>
+    </w:rPr>
+  </w:style>
+  <w:style w:type="character" w:styleId="ListLabel63">
+    <w:name w:val="ListLabel 63"/>
+    <w:qFormat/>
+    <w:rPr>
+      <w:rFonts w:cs="Wingdings"/>
+    </w:rPr>
+  </w:style>
+  <w:style w:type="character" w:styleId="ListLabel64">
+    <w:name w:val="ListLabel 64"/>
+    <w:qFormat/>
+    <w:rPr>
+      <w:rFonts w:cs="Symbol"/>
+    </w:rPr>
+  </w:style>
+  <w:style w:type="character" w:styleId="ListLabel65">
+    <w:name w:val="ListLabel 65"/>
+    <w:qFormat/>
+    <w:rPr>
+      <w:rFonts w:cs="Courier New"/>
+    </w:rPr>
+  </w:style>
+  <w:style w:type="character" w:styleId="ListLabel66">
+    <w:name w:val="ListLabel 66"/>
     <w:qFormat/>
     <w:rPr>
       <w:rFonts w:cs="Wingdings"/>

</xml_diff>

<commit_message>
Reorganization of flags cluttering the controlDict to better places
eigenvalueNeutronics
SP3Neutronics
fastNeutrons
adjustDiscFactors
useGivenDiscFactors
groupsWoDF
doNotParametrize
moved to constant/neutroRegion/neutronicsProperties

integralPredictor
implicitPredictor
aitkenAcceleration
ROMAcceleration
neutronIterationResidual
maxNeutronIterations
moved to system/neutroRegion/fvSolution.neutronTransport

tightlyCoupled
timeStepResidual
maxTimeStepIterations
moved to system/fvSolution.PIMPLE

readPhysicsToSolve.H moved back from createFields to main
Tutorials adjusted
Updated documentation
</commit_message>
<xml_diff>
--- a/Documentation/howTo.docx
+++ b/Documentation/howTo.docx
@@ -1,6 +1,6 @@
 
 <file path=word/document.xml><?xml version="1.0" encoding="utf-8"?>
-<w:document xmlns:o="urn:schemas-microsoft-com:office:office" xmlns:r="http://schemas.openxmlformats.org/officeDocument/2006/relationships" xmlns:v="urn:schemas-microsoft-com:vml" xmlns:w="http://schemas.openxmlformats.org/wordprocessingml/2006/main" xmlns:w10="urn:schemas-microsoft-com:office:word" xmlns:wp="http://schemas.openxmlformats.org/drawingml/2006/wordprocessingDrawing" xmlns:wps="http://schemas.microsoft.com/office/word/2010/wordprocessingShape" xmlns:wpg="http://schemas.microsoft.com/office/word/2010/wordprocessingGroup" xmlns:mc="http://schemas.openxmlformats.org/markup-compatibility/2006" xmlns:wp14="http://schemas.microsoft.com/office/word/2010/wordprocessingDrawing" xmlns:w14="http://schemas.microsoft.com/office/word/2010/wordml" mc:Ignorable="w14 wp14">
+<w:document xmlns:o="urn:schemas-microsoft-com:office:office" xmlns:r="http://schemas.openxmlformats.org/officeDocument/2006/relationships" xmlns:v="urn:schemas-microsoft-com:vml" xmlns:w="http://schemas.openxmlformats.org/wordprocessingml/2006/main" xmlns:w10="urn:schemas-microsoft-com:office:word" xmlns:wp="http://schemas.openxmlformats.org/drawingml/2006/wordprocessingDrawing">
   <w:body>
     <w:p>
       <w:pPr>
@@ -19,13 +19,27 @@
     <w:p>
       <w:pPr>
         <w:pStyle w:val="Normal"/>
-        <w:rPr/>
-      </w:pPr>
-      <w:r>
-        <w:rPr>
-          <w:lang w:val="en-US"/>
-        </w:rPr>
-        <w:t>Author: Carlo Fiorina (</w:t>
+        <w:rPr>
+          <w:lang w:val="en-US"/>
+        </w:rPr>
+      </w:pPr>
+      <w:r>
+        <w:rPr>
+          <w:lang w:val="en-US"/>
+        </w:rPr>
+        <w:t>Author</w:t>
+      </w:r>
+      <w:r>
+        <w:rPr>
+          <w:lang w:val="en-US"/>
+        </w:rPr>
+        <w:t>s</w:t>
+      </w:r>
+      <w:r>
+        <w:rPr>
+          <w:lang w:val="en-US"/>
+        </w:rPr>
+        <w:t>: Carlo Fiorina (</w:t>
       </w:r>
       <w:hyperlink r:id="rId2">
         <w:r>
@@ -55,13 +69,51 @@
         <w:rPr>
           <w:lang w:val="en-US"/>
         </w:rPr>
-        <w:t xml:space="preserve"> )</w:t>
-      </w:r>
-    </w:p>
-    <w:p>
-      <w:pPr>
-        <w:pStyle w:val="Normal"/>
-        <w:rPr/>
+        <w:t xml:space="preserve"> ), </w:t>
+      </w:r>
+      <w:r>
+        <w:rPr>
+          <w:lang w:val="en-US"/>
+        </w:rPr>
+        <w:t>Rodrigo de Oliveira (</w:t>
+      </w:r>
+      <w:hyperlink r:id="rId4">
+        <w:r>
+          <w:rPr>
+            <w:rStyle w:val="InternetLink"/>
+            <w:lang w:val="en-US"/>
+          </w:rPr>
+          <w:t>rodrigo.de-oliveira@psi.ch</w:t>
+        </w:r>
+      </w:hyperlink>
+      <w:r>
+        <w:rPr>
+          <w:lang w:val="en-US"/>
+        </w:rPr>
+        <w:t xml:space="preserve">; </w:t>
+      </w:r>
+      <w:hyperlink r:id="rId5">
+        <w:r>
+          <w:rPr>
+            <w:rStyle w:val="InternetLink"/>
+            <w:lang w:val="en-US"/>
+          </w:rPr>
+          <w:t>rodrigoggoliveira@gmail.com</w:t>
+        </w:r>
+      </w:hyperlink>
+      <w:r>
+        <w:rPr>
+          <w:lang w:val="en-US"/>
+        </w:rPr>
+        <w:t>)</w:t>
+      </w:r>
+    </w:p>
+    <w:p>
+      <w:pPr>
+        <w:pStyle w:val="Normal"/>
+        <w:rPr>
+          <w:lang w:val="en-US"/>
+        </w:rPr>
       </w:pPr>
       <w:r>
         <w:rPr>
@@ -87,21 +139,28 @@
     <w:p>
       <w:pPr>
         <w:pStyle w:val="Normal"/>
-        <w:rPr/>
-      </w:pPr>
-      <w:r>
-        <w:rPr>
-          <w:lang w:val="en-US"/>
-        </w:rPr>
-        <w:t xml:space="preserve">GeN-Foam is built as a standard OpenFOAM solver. As such, one should first install the latest OpenFOAM foundation version and then compile GeN-Foam </w:t>
-      </w:r>
-      <w:r>
         <w:rPr>
           <w:rFonts w:cs="Arial" w:ascii="Arial" w:hAnsi="Arial"/>
           <w:color w:val="000000"/>
           <w:sz w:val="18"/>
           <w:szCs w:val="18"/>
-          <w:highlight w:val="white"/>
+          <w:shd w:fill="FFFFFF" w:val="clear"/>
+          <w:lang w:val="en-US"/>
+        </w:rPr>
+      </w:pPr>
+      <w:r>
+        <w:rPr>
+          <w:lang w:val="en-US"/>
+        </w:rPr>
+        <w:t xml:space="preserve">GeN-Foam is built as a standard OpenFOAM solver. As such, one should first install the latest OpenFOAM foundation version and then compile GeN-Foam </w:t>
+      </w:r>
+      <w:r>
+        <w:rPr>
+          <w:rFonts w:cs="Arial" w:ascii="Arial" w:hAnsi="Arial"/>
+          <w:color w:val="000000"/>
+          <w:sz w:val="18"/>
+          <w:szCs w:val="18"/>
+          <w:shd w:fill="FFFFFF" w:val="clear"/>
           <w:lang w:val="en-US"/>
         </w:rPr>
         <w:t>by  typing in a terminal</w:t>
@@ -113,7 +172,6 @@
         <w:ind w:left="567" w:right="0" w:hanging="0"/>
         <w:rPr>
           <w:i/>
-          <w:i/>
           <w:lang w:val="en-US"/>
         </w:rPr>
       </w:pPr>
@@ -198,7 +256,9 @@
     <w:p>
       <w:pPr>
         <w:pStyle w:val="Normal"/>
-        <w:rPr/>
+        <w:rPr>
+          <w:lang w:val="en-US"/>
+        </w:rPr>
       </w:pPr>
       <w:r>
         <w:rPr>
@@ -210,7 +270,9 @@
     <w:p>
       <w:pPr>
         <w:pStyle w:val="Normal"/>
-        <w:rPr/>
+        <w:rPr>
+          <w:lang w:val="en-US"/>
+        </w:rPr>
       </w:pPr>
       <w:r>
         <w:rPr>
@@ -218,7 +280,7 @@
         </w:rPr>
         <w:t>The ESFR3D_small tutorial includes an example of mesh generation with Gmsh (</w:t>
       </w:r>
-      <w:hyperlink r:id="rId4">
+      <w:hyperlink r:id="rId6">
         <w:r>
           <w:rPr>
             <w:rStyle w:val="InternetLink"/>
@@ -253,7 +315,6 @@
         <w:ind w:left="0" w:right="0" w:firstLine="708"/>
         <w:rPr>
           <w:i/>
-          <w:i/>
           <w:lang w:val="en-US"/>
         </w:rPr>
       </w:pPr>
@@ -285,7 +346,6 @@
         <w:ind w:left="0" w:right="0" w:firstLine="708"/>
         <w:rPr>
           <w:i/>
-          <w:i/>
           <w:lang w:val="en-US"/>
         </w:rPr>
       </w:pPr>
@@ -300,7 +360,9 @@
     <w:p>
       <w:pPr>
         <w:pStyle w:val="Normal"/>
-        <w:rPr/>
+        <w:rPr>
+          <w:lang w:val="en-US"/>
+        </w:rPr>
       </w:pPr>
       <w:r>
         <w:rPr>
@@ -391,7 +453,9 @@
     <w:p>
       <w:pPr>
         <w:pStyle w:val="Normal"/>
-        <w:rPr/>
+        <w:rPr>
+          <w:lang w:val="en-US"/>
+        </w:rPr>
       </w:pPr>
       <w:r>
         <w:rPr>
@@ -407,7 +471,9 @@
           <w:ilvl w:val="0"/>
           <w:numId w:val="1"/>
         </w:numPr>
-        <w:rPr/>
+        <w:rPr>
+          <w:lang w:val="en-US"/>
+        </w:rPr>
       </w:pPr>
       <w:r>
         <w:rPr>
@@ -430,7 +496,9 @@
           <w:ilvl w:val="0"/>
           <w:numId w:val="1"/>
         </w:numPr>
-        <w:rPr/>
+        <w:rPr>
+          <w:lang w:val="en-US"/>
+        </w:rPr>
       </w:pPr>
       <w:r>
         <w:rPr>
@@ -466,7 +534,9 @@
           <w:ilvl w:val="0"/>
           <w:numId w:val="1"/>
         </w:numPr>
-        <w:rPr/>
+        <w:rPr>
+          <w:lang w:val="en-US"/>
+        </w:rPr>
       </w:pPr>
       <w:r>
         <w:rPr>
@@ -489,7 +559,9 @@
           <w:ilvl w:val="0"/>
           <w:numId w:val="1"/>
         </w:numPr>
-        <w:rPr/>
+        <w:rPr>
+          <w:lang w:val="en-US"/>
+        </w:rPr>
       </w:pPr>
       <w:r>
         <w:rPr>
@@ -512,7 +584,9 @@
           <w:ilvl w:val="0"/>
           <w:numId w:val="1"/>
         </w:numPr>
-        <w:rPr/>
+        <w:rPr>
+          <w:lang w:val="en-US"/>
+        </w:rPr>
       </w:pPr>
       <w:r>
         <w:rPr>
@@ -535,7 +609,9 @@
           <w:ilvl w:val="0"/>
           <w:numId w:val="1"/>
         </w:numPr>
-        <w:rPr/>
+        <w:rPr>
+          <w:lang w:val="en-US"/>
+        </w:rPr>
       </w:pPr>
       <w:r>
         <w:rPr>
@@ -558,7 +634,9 @@
           <w:ilvl w:val="0"/>
           <w:numId w:val="1"/>
         </w:numPr>
-        <w:rPr/>
+        <w:rPr>
+          <w:lang w:val="en-US"/>
+        </w:rPr>
       </w:pPr>
       <w:r>
         <w:rPr>
@@ -572,6 +650,24 @@
           <w:lang w:val="en-US"/>
         </w:rPr>
         <w:t xml:space="preserve"> - standard OpenFOAM dictionary to define the thermophysical properties of the coolant</w:t>
+      </w:r>
+    </w:p>
+    <w:p>
+      <w:pPr>
+        <w:pStyle w:val="ListParagraph"/>
+        <w:numPr>
+          <w:ilvl w:val="0"/>
+          <w:numId w:val="1"/>
+        </w:numPr>
+        <w:rPr>
+          <w:lang w:val="en-US"/>
+        </w:rPr>
+      </w:pPr>
+      <w:r>
+        <w:rPr>
+          <w:lang w:val="en-US"/>
+        </w:rPr>
+        <w:t>constant/neutroRegion/neutronicsProperties – dictionary to control how neutronics is solved (diffusion or SP3), it it's an eigenvalue calculation, etc.</w:t>
       </w:r>
     </w:p>
     <w:p>
@@ -581,7 +677,9 @@
           <w:ilvl w:val="0"/>
           <w:numId w:val="3"/>
         </w:numPr>
-        <w:rPr/>
+        <w:rPr>
+          <w:lang w:val="en-US"/>
+        </w:rPr>
       </w:pPr>
       <w:r>
         <w:rPr>
@@ -643,7 +741,9 @@
           <w:ilvl w:val="0"/>
           <w:numId w:val="3"/>
         </w:numPr>
-        <w:rPr/>
+        <w:rPr>
+          <w:lang w:val="en-US"/>
+        </w:rPr>
       </w:pPr>
       <w:r>
         <w:rPr>
@@ -677,27 +777,31 @@
       <w:pPr>
         <w:pStyle w:val="ListParagraph"/>
         <w:ind w:left="720" w:right="0" w:hanging="0"/>
-        <w:rPr/>
-      </w:pPr>
-      <w:r>
-        <w:rPr>
-          <w:lang w:val="en-US"/>
-        </w:rPr>
-        <w:t xml:space="preserve">N.B.: the  </w:t>
-      </w:r>
-      <w:r>
-        <w:rPr>
-          <w:i/>
-          <w:lang w:val="en-US"/>
-        </w:rPr>
-        <w:t xml:space="preserve">nuclearData* </w:t>
-      </w:r>
-      <w:r>
         <w:rPr>
           <w:i w:val="false"/>
           <w:iCs w:val="false"/>
           <w:lang w:val="en-US"/>
         </w:rPr>
+      </w:pPr>
+      <w:r>
+        <w:rPr>
+          <w:lang w:val="en-US"/>
+        </w:rPr>
+        <w:t xml:space="preserve">N.B.: the  </w:t>
+      </w:r>
+      <w:r>
+        <w:rPr>
+          <w:i/>
+          <w:lang w:val="en-US"/>
+        </w:rPr>
+        <w:t xml:space="preserve">nuclearData* </w:t>
+      </w:r>
+      <w:r>
+        <w:rPr>
+          <w:i w:val="false"/>
+          <w:iCs w:val="false"/>
+          <w:lang w:val="en-US"/>
+        </w:rPr>
         <w:t>files must always be present, even when not parametrizing cross-sections. If no parametrization is needed, the “zone” card must be left “blank” as:</w:t>
       </w:r>
     </w:p>
@@ -707,17 +811,16 @@
         <w:ind w:left="720" w:right="0" w:hanging="0"/>
         <w:rPr>
           <w:i w:val="false"/>
+          <w:iCs w:val="false"/>
+          <w:lang w:val="en-US"/>
+        </w:rPr>
+      </w:pPr>
+      <w:r>
+        <w:rPr>
           <w:i w:val="false"/>
           <w:iCs w:val="false"/>
           <w:lang w:val="en-US"/>
         </w:rPr>
-      </w:pPr>
-      <w:r>
-        <w:rPr>
-          <w:i w:val="false"/>
-          <w:iCs w:val="false"/>
-          <w:lang w:val="en-US"/>
-        </w:rPr>
       </w:r>
     </w:p>
     <w:p>
@@ -726,7 +829,6 @@
         <w:ind w:left="720" w:right="0" w:hanging="0"/>
         <w:rPr>
           <w:i/>
-          <w:i/>
           <w:iCs/>
         </w:rPr>
       </w:pPr>
@@ -742,7 +844,10 @@
       <w:pPr>
         <w:pStyle w:val="ListParagraph"/>
         <w:ind w:left="720" w:right="0" w:hanging="0"/>
-        <w:rPr/>
+        <w:rPr>
+          <w:i/>
+          <w:iCs/>
+        </w:rPr>
       </w:pPr>
       <w:r>
         <w:rPr>
@@ -765,7 +870,6 @@
         <w:ind w:left="720" w:right="0" w:hanging="0"/>
         <w:rPr>
           <w:i/>
-          <w:i/>
           <w:iCs/>
         </w:rPr>
       </w:pPr>
@@ -780,7 +884,10 @@
       <w:pPr>
         <w:pStyle w:val="ListParagraph"/>
         <w:ind w:left="720" w:right="0" w:hanging="0"/>
-        <w:rPr/>
+        <w:rPr>
+          <w:i/>
+          <w:iCs/>
+        </w:rPr>
       </w:pPr>
       <w:r>
         <w:rPr>
@@ -803,7 +910,6 @@
         <w:ind w:left="720" w:right="0" w:hanging="0"/>
         <w:rPr>
           <w:i/>
-          <w:i/>
           <w:iCs/>
           <w:lang w:val="en-US"/>
         </w:rPr>
@@ -820,24 +926,12 @@
       <w:pPr>
         <w:pStyle w:val="ListParagraph"/>
         <w:widowControl/>
-        <w:overflowPunct w:val="false"/>
+        <w:overflowPunct w:val="true"/>
         <w:bidi w:val="0"/>
         <w:spacing w:lineRule="auto" w:line="276" w:before="0" w:after="200"/>
         <w:ind w:left="0" w:right="0" w:hanging="0"/>
         <w:contextualSpacing/>
         <w:jc w:val="left"/>
-        <w:rPr>
-          <w:rFonts w:ascii="Cambria" w:hAnsi="Cambria" w:eastAsia="宋体" w:cs="DejaVu Sans"/>
-          <w:b/>
-          <w:b/>
-          <w:bCs/>
-          <w:color w:val="4F81BD"/>
-          <w:sz w:val="22"/>
-          <w:szCs w:val="22"/>
-          <w:lang w:val="en-US" w:eastAsia="en-US" w:bidi="ar-SA"/>
-        </w:rPr>
-      </w:pPr>
-      <w:r>
         <w:rPr>
           <w:rFonts w:eastAsia="宋体" w:cs="DejaVu Sans" w:ascii="Cambria" w:hAnsi="Cambria"/>
           <w:b/>
@@ -847,27 +941,23 @@
           <w:szCs w:val="22"/>
           <w:lang w:val="en-US" w:eastAsia="en-US" w:bidi="ar-SA"/>
         </w:rPr>
-        <w:t>Initial values and boundary conditions</w:t>
-      </w:r>
-    </w:p>
-    <w:p>
-      <w:pPr>
-        <w:pStyle w:val="Heading3"/>
-        <w:rPr>
-          <w:rFonts w:ascii="Calibri" w:hAnsi="Calibri" w:eastAsia="Calibri" w:cs="DejaVu Sans"/>
-          <w:b w:val="false"/>
-          <w:b w:val="false"/>
-          <w:bCs w:val="false"/>
-          <w:i w:val="false"/>
-          <w:i w:val="false"/>
-          <w:iCs w:val="false"/>
-          <w:color w:val="00000A"/>
+      </w:pPr>
+      <w:r>
+        <w:rPr>
+          <w:rFonts w:eastAsia="宋体" w:cs="DejaVu Sans" w:ascii="Cambria" w:hAnsi="Cambria"/>
+          <w:b/>
+          <w:bCs/>
+          <w:color w:val="4F81BD"/>
           <w:sz w:val="22"/>
           <w:szCs w:val="22"/>
           <w:lang w:val="en-US" w:eastAsia="en-US" w:bidi="ar-SA"/>
         </w:rPr>
-      </w:pPr>
-      <w:r>
+        <w:t>Initial values and boundary conditions</w:t>
+      </w:r>
+    </w:p>
+    <w:p>
+      <w:pPr>
+        <w:pStyle w:val="Heading3"/>
         <w:rPr>
           <w:rFonts w:eastAsia="Calibri" w:cs="DejaVu Sans" w:ascii="Calibri" w:hAnsi="Calibri"/>
           <w:b w:val="false"/>
@@ -879,15 +969,25 @@
           <w:szCs w:val="22"/>
           <w:lang w:val="en-US" w:eastAsia="en-US" w:bidi="ar-SA"/>
         </w:rPr>
+      </w:pPr>
+      <w:r>
+        <w:rPr>
+          <w:rFonts w:eastAsia="Calibri" w:cs="DejaVu Sans" w:ascii="Calibri" w:hAnsi="Calibri"/>
+          <w:b w:val="false"/>
+          <w:bCs w:val="false"/>
+          <w:i w:val="false"/>
+          <w:iCs w:val="false"/>
+          <w:color w:val="00000A"/>
+          <w:sz w:val="22"/>
+          <w:szCs w:val="22"/>
+          <w:lang w:val="en-US" w:eastAsia="en-US" w:bidi="ar-SA"/>
+        </w:rPr>
         <w:t>As in all standard OpenFOAM solvers, initial values (IC) and boundary conditions (BC) should be provided  in the “0” folder. In the case of neutronics, the user can either specify different IC and BC for each one of the fluxes (that must be named fluxStar0, fluxStar1., etc…), or provide the same IC and BC to all fluxes by using the defaultFlux field. Similarly, in case of SP3 calculations, the IC and BC for the second moment can be imposed either for each energy (using fields named fluxStar20, fluxStar21., etc…), or to all energies by using the defaultFlux2 field.</w:t>
       </w:r>
     </w:p>
     <w:p>
       <w:pPr>
         <w:pStyle w:val="Normal"/>
-        <w:rPr/>
-      </w:pPr>
-      <w:r>
         <w:rPr>
           <w:rFonts w:eastAsia="Calibri" w:cs="DejaVu Sans"/>
           <w:b w:val="false"/>
@@ -899,241 +999,6 @@
           <w:szCs w:val="22"/>
           <w:lang w:val="en-US" w:eastAsia="en-US" w:bidi="ar-SA"/>
         </w:rPr>
-        <w:t>In addition to the standard OpenFOAM BC, an albedo boundary condition is available in GeN-Foam and can be used according to the following syntax:</w:t>
-      </w:r>
-    </w:p>
-    <w:p>
-      <w:pPr>
-        <w:pStyle w:val="Normal"/>
-        <w:rPr>
-          <w:rFonts w:ascii="Calibri" w:hAnsi="Calibri" w:eastAsia="Calibri" w:cs="DejaVu Sans"/>
-          <w:b w:val="false"/>
-          <w:b w:val="false"/>
-          <w:bCs w:val="false"/>
-          <w:i/>
-          <w:i/>
-          <w:iCs/>
-          <w:color w:val="00000A"/>
-          <w:sz w:val="22"/>
-          <w:szCs w:val="22"/>
-          <w:lang w:val="en-US" w:eastAsia="en-US" w:bidi="ar-SA"/>
-        </w:rPr>
-      </w:pPr>
-      <w:r>
-        <w:rPr>
-          <w:rFonts w:eastAsia="Calibri" w:cs="DejaVu Sans"/>
-          <w:b w:val="false"/>
-          <w:bCs w:val="false"/>
-          <w:i/>
-          <w:iCs/>
-          <w:color w:val="00000A"/>
-          <w:sz w:val="22"/>
-          <w:szCs w:val="22"/>
-          <w:lang w:val="en-US" w:eastAsia="en-US" w:bidi="ar-SA"/>
-        </w:rPr>
-        <w:t xml:space="preserve">               </w:t>
-      </w:r>
-      <w:r>
-        <w:rPr>
-          <w:rFonts w:eastAsia="Calibri" w:cs="DejaVu Sans"/>
-          <w:b w:val="false"/>
-          <w:bCs w:val="false"/>
-          <w:i/>
-          <w:iCs/>
-          <w:color w:val="00000A"/>
-          <w:sz w:val="22"/>
-          <w:szCs w:val="22"/>
-          <w:lang w:val="en-US" w:eastAsia="en-US" w:bidi="ar-SA"/>
-        </w:rPr>
-        <w:t>type            albedoSP3;</w:t>
-      </w:r>
-    </w:p>
-    <w:p>
-      <w:pPr>
-        <w:pStyle w:val="Normal"/>
-        <w:rPr>
-          <w:rFonts w:ascii="Calibri" w:hAnsi="Calibri" w:eastAsia="Calibri" w:cs="DejaVu Sans"/>
-          <w:b w:val="false"/>
-          <w:b w:val="false"/>
-          <w:bCs w:val="false"/>
-          <w:i/>
-          <w:i/>
-          <w:iCs/>
-          <w:color w:val="00000A"/>
-          <w:sz w:val="22"/>
-          <w:szCs w:val="22"/>
-          <w:lang w:val="en-US" w:eastAsia="en-US" w:bidi="ar-SA"/>
-        </w:rPr>
-      </w:pPr>
-      <w:r>
-        <w:rPr>
-          <w:rFonts w:eastAsia="Calibri" w:cs="DejaVu Sans"/>
-          <w:b w:val="false"/>
-          <w:bCs w:val="false"/>
-          <w:i/>
-          <w:iCs/>
-          <w:color w:val="00000A"/>
-          <w:sz w:val="22"/>
-          <w:szCs w:val="22"/>
-          <w:lang w:val="en-US" w:eastAsia="en-US" w:bidi="ar-SA"/>
-        </w:rPr>
-        <w:tab/>
-        <w:t>gamma</w:t>
-        <w:tab/>
-        <w:tab/>
-        <w:t>0.5; // defined as (1-alpha)/(1+alpha)/2, alpha being the albedo coefficient</w:t>
-      </w:r>
-    </w:p>
-    <w:p>
-      <w:pPr>
-        <w:pStyle w:val="Normal"/>
-        <w:rPr>
-          <w:rFonts w:ascii="Calibri" w:hAnsi="Calibri" w:eastAsia="Calibri" w:cs="DejaVu Sans"/>
-          <w:b w:val="false"/>
-          <w:b w:val="false"/>
-          <w:bCs w:val="false"/>
-          <w:i/>
-          <w:i/>
-          <w:iCs/>
-          <w:color w:val="00000A"/>
-          <w:sz w:val="22"/>
-          <w:szCs w:val="22"/>
-          <w:lang w:val="en-US" w:eastAsia="en-US" w:bidi="ar-SA"/>
-        </w:rPr>
-      </w:pPr>
-      <w:r>
-        <w:rPr>
-          <w:rFonts w:eastAsia="Calibri" w:cs="DejaVu Sans"/>
-          <w:b w:val="false"/>
-          <w:bCs w:val="false"/>
-          <w:i/>
-          <w:iCs/>
-          <w:color w:val="00000A"/>
-          <w:sz w:val="22"/>
-          <w:szCs w:val="22"/>
-          <w:lang w:val="en-US" w:eastAsia="en-US" w:bidi="ar-SA"/>
-        </w:rPr>
-        <w:tab/>
-        <w:t>diffCoeffName</w:t>
-        <w:tab/>
-        <w:t>Dalbedo;  //not to be changed</w:t>
-      </w:r>
-    </w:p>
-    <w:p>
-      <w:pPr>
-        <w:pStyle w:val="Normal"/>
-        <w:rPr>
-          <w:rFonts w:ascii="Calibri" w:hAnsi="Calibri" w:eastAsia="Calibri" w:cs="DejaVu Sans"/>
-          <w:b w:val="false"/>
-          <w:b w:val="false"/>
-          <w:bCs w:val="false"/>
-          <w:i/>
-          <w:i/>
-          <w:iCs/>
-          <w:color w:val="00000A"/>
-          <w:sz w:val="22"/>
-          <w:szCs w:val="22"/>
-          <w:lang w:val="en-US" w:eastAsia="en-US" w:bidi="ar-SA"/>
-        </w:rPr>
-      </w:pPr>
-      <w:r>
-        <w:rPr>
-          <w:rFonts w:eastAsia="Calibri" w:cs="DejaVu Sans"/>
-          <w:b w:val="false"/>
-          <w:bCs w:val="false"/>
-          <w:i/>
-          <w:iCs/>
-          <w:color w:val="00000A"/>
-          <w:sz w:val="22"/>
-          <w:szCs w:val="22"/>
-          <w:lang w:val="en-US" w:eastAsia="en-US" w:bidi="ar-SA"/>
-        </w:rPr>
-        <w:tab/>
-        <w:t>fluxStarAlbedo  fluxStarAlbedo; //not to be changed</w:t>
-      </w:r>
-    </w:p>
-    <w:p>
-      <w:pPr>
-        <w:pStyle w:val="Normal"/>
-        <w:rPr>
-          <w:rFonts w:ascii="Calibri" w:hAnsi="Calibri" w:eastAsia="Calibri" w:cs="DejaVu Sans"/>
-          <w:b w:val="false"/>
-          <w:b w:val="false"/>
-          <w:bCs w:val="false"/>
-          <w:i/>
-          <w:i/>
-          <w:iCs/>
-          <w:color w:val="00000A"/>
-          <w:sz w:val="22"/>
-          <w:szCs w:val="22"/>
-          <w:lang w:val="en-US" w:eastAsia="en-US" w:bidi="ar-SA"/>
-        </w:rPr>
-      </w:pPr>
-      <w:r>
-        <w:rPr>
-          <w:rFonts w:eastAsia="Calibri" w:cs="DejaVu Sans"/>
-          <w:b w:val="false"/>
-          <w:bCs w:val="false"/>
-          <w:i/>
-          <w:iCs/>
-          <w:color w:val="00000A"/>
-          <w:sz w:val="22"/>
-          <w:szCs w:val="22"/>
-          <w:lang w:val="en-US" w:eastAsia="en-US" w:bidi="ar-SA"/>
-        </w:rPr>
-        <w:tab/>
-        <w:t>forSecondMoment false;  //true in case it is a condition for a second moment flux (for SP3 calculations)</w:t>
-      </w:r>
-    </w:p>
-    <w:p>
-      <w:pPr>
-        <w:pStyle w:val="Normal"/>
-        <w:rPr>
-          <w:rFonts w:ascii="Calibri" w:hAnsi="Calibri" w:eastAsia="Calibri" w:cs="DejaVu Sans"/>
-          <w:b w:val="false"/>
-          <w:b w:val="false"/>
-          <w:bCs w:val="false"/>
-          <w:i/>
-          <w:i/>
-          <w:iCs/>
-          <w:color w:val="00000A"/>
-          <w:sz w:val="22"/>
-          <w:szCs w:val="22"/>
-          <w:lang w:val="en-US" w:eastAsia="en-US" w:bidi="ar-SA"/>
-        </w:rPr>
-      </w:pPr>
-      <w:r>
-        <w:rPr>
-          <w:rFonts w:eastAsia="Calibri" w:cs="DejaVu Sans"/>
-          <w:b w:val="false"/>
-          <w:bCs w:val="false"/>
-          <w:i/>
-          <w:iCs/>
-          <w:color w:val="00000A"/>
-          <w:sz w:val="22"/>
-          <w:szCs w:val="22"/>
-          <w:lang w:val="en-US" w:eastAsia="en-US" w:bidi="ar-SA"/>
-        </w:rPr>
-        <w:tab/>
-        <w:t>value           uniform 1;</w:t>
-      </w:r>
-    </w:p>
-    <w:p>
-      <w:pPr>
-        <w:pStyle w:val="Normal"/>
-        <w:rPr>
-          <w:rFonts w:ascii="Calibri" w:hAnsi="Calibri" w:eastAsia="Calibri" w:cs="DejaVu Sans"/>
-          <w:b w:val="false"/>
-          <w:b w:val="false"/>
-          <w:bCs w:val="false"/>
-          <w:i w:val="false"/>
-          <w:i w:val="false"/>
-          <w:iCs w:val="false"/>
-          <w:color w:val="00000A"/>
-          <w:sz w:val="22"/>
-          <w:szCs w:val="22"/>
-          <w:lang w:val="en-US" w:eastAsia="en-US" w:bidi="ar-SA"/>
-        </w:rPr>
       </w:pPr>
       <w:r>
         <w:rPr>
@@ -1147,20 +1012,18 @@
           <w:szCs w:val="22"/>
           <w:lang w:val="en-US" w:eastAsia="en-US" w:bidi="ar-SA"/>
         </w:rPr>
-        <w:t xml:space="preserve">IC and BC for precursors do not have to be specified for standard reactors. On the other hand, they should be specified in case of liquid fuel reactors. This is possible by creating a defaultPrec field, in case the same conditions apply to all precursor groups, or by creating the fields named prec0, prec1, etc., in case different conditions must be provided for different precursor groups. </w:t>
-      </w:r>
-    </w:p>
-    <w:p>
-      <w:pPr>
-        <w:pStyle w:val="Normal"/>
-        <w:rPr>
-          <w:rFonts w:ascii="Calibri" w:hAnsi="Calibri" w:eastAsia="Calibri" w:cs="DejaVu Sans"/>
-          <w:b w:val="false"/>
+        <w:t>In addition to the standard OpenFOAM BC, an albedo boundary condition is available in GeN-Foam and can be used according to the following syntax:</w:t>
+      </w:r>
+    </w:p>
+    <w:p>
+      <w:pPr>
+        <w:pStyle w:val="Normal"/>
+        <w:rPr>
+          <w:rFonts w:eastAsia="Calibri" w:cs="DejaVu Sans"/>
           <w:b w:val="false"/>
           <w:bCs w:val="false"/>
-          <w:i w:val="false"/>
-          <w:i w:val="false"/>
-          <w:iCs w:val="false"/>
+          <w:i/>
+          <w:iCs/>
           <w:color w:val="00000A"/>
           <w:sz w:val="22"/>
           <w:szCs w:val="22"/>
@@ -1168,6 +1031,197 @@
         </w:rPr>
       </w:pPr>
       <w:r>
+        <w:rPr>
+          <w:rFonts w:eastAsia="Calibri" w:cs="DejaVu Sans"/>
+          <w:b w:val="false"/>
+          <w:bCs w:val="false"/>
+          <w:i/>
+          <w:iCs/>
+          <w:color w:val="00000A"/>
+          <w:sz w:val="22"/>
+          <w:szCs w:val="22"/>
+          <w:lang w:val="en-US" w:eastAsia="en-US" w:bidi="ar-SA"/>
+        </w:rPr>
+        <w:t xml:space="preserve">               </w:t>
+      </w:r>
+      <w:r>
+        <w:rPr>
+          <w:rFonts w:eastAsia="Calibri" w:cs="DejaVu Sans"/>
+          <w:b w:val="false"/>
+          <w:bCs w:val="false"/>
+          <w:i/>
+          <w:iCs/>
+          <w:color w:val="00000A"/>
+          <w:sz w:val="22"/>
+          <w:szCs w:val="22"/>
+          <w:lang w:val="en-US" w:eastAsia="en-US" w:bidi="ar-SA"/>
+        </w:rPr>
+        <w:t>type            albedoSP3;</w:t>
+      </w:r>
+    </w:p>
+    <w:p>
+      <w:pPr>
+        <w:pStyle w:val="Normal"/>
+        <w:rPr>
+          <w:rFonts w:eastAsia="Calibri" w:cs="DejaVu Sans"/>
+          <w:b w:val="false"/>
+          <w:bCs w:val="false"/>
+          <w:i/>
+          <w:iCs/>
+          <w:color w:val="00000A"/>
+          <w:sz w:val="22"/>
+          <w:szCs w:val="22"/>
+          <w:lang w:val="en-US" w:eastAsia="en-US" w:bidi="ar-SA"/>
+        </w:rPr>
+      </w:pPr>
+      <w:r>
+        <w:rPr>
+          <w:rFonts w:eastAsia="Calibri" w:cs="DejaVu Sans"/>
+          <w:b w:val="false"/>
+          <w:bCs w:val="false"/>
+          <w:i/>
+          <w:iCs/>
+          <w:color w:val="00000A"/>
+          <w:sz w:val="22"/>
+          <w:szCs w:val="22"/>
+          <w:lang w:val="en-US" w:eastAsia="en-US" w:bidi="ar-SA"/>
+        </w:rPr>
+        <w:tab/>
+        <w:t>gamma</w:t>
+        <w:tab/>
+        <w:tab/>
+        <w:t>0.5; // defined as (1-alpha)/(1+alpha)/2, alpha being the albedo coefficient</w:t>
+      </w:r>
+    </w:p>
+    <w:p>
+      <w:pPr>
+        <w:pStyle w:val="Normal"/>
+        <w:rPr>
+          <w:rFonts w:eastAsia="Calibri" w:cs="DejaVu Sans"/>
+          <w:b w:val="false"/>
+          <w:bCs w:val="false"/>
+          <w:i/>
+          <w:iCs/>
+          <w:color w:val="00000A"/>
+          <w:sz w:val="22"/>
+          <w:szCs w:val="22"/>
+          <w:lang w:val="en-US" w:eastAsia="en-US" w:bidi="ar-SA"/>
+        </w:rPr>
+      </w:pPr>
+      <w:r>
+        <w:rPr>
+          <w:rFonts w:eastAsia="Calibri" w:cs="DejaVu Sans"/>
+          <w:b w:val="false"/>
+          <w:bCs w:val="false"/>
+          <w:i/>
+          <w:iCs/>
+          <w:color w:val="00000A"/>
+          <w:sz w:val="22"/>
+          <w:szCs w:val="22"/>
+          <w:lang w:val="en-US" w:eastAsia="en-US" w:bidi="ar-SA"/>
+        </w:rPr>
+        <w:tab/>
+        <w:t>diffCoeffName</w:t>
+        <w:tab/>
+        <w:t>Dalbedo;  //not to be changed</w:t>
+      </w:r>
+    </w:p>
+    <w:p>
+      <w:pPr>
+        <w:pStyle w:val="Normal"/>
+        <w:rPr>
+          <w:rFonts w:eastAsia="Calibri" w:cs="DejaVu Sans"/>
+          <w:b w:val="false"/>
+          <w:bCs w:val="false"/>
+          <w:i/>
+          <w:iCs/>
+          <w:color w:val="00000A"/>
+          <w:sz w:val="22"/>
+          <w:szCs w:val="22"/>
+          <w:lang w:val="en-US" w:eastAsia="en-US" w:bidi="ar-SA"/>
+        </w:rPr>
+      </w:pPr>
+      <w:r>
+        <w:rPr>
+          <w:rFonts w:eastAsia="Calibri" w:cs="DejaVu Sans"/>
+          <w:b w:val="false"/>
+          <w:bCs w:val="false"/>
+          <w:i/>
+          <w:iCs/>
+          <w:color w:val="00000A"/>
+          <w:sz w:val="22"/>
+          <w:szCs w:val="22"/>
+          <w:lang w:val="en-US" w:eastAsia="en-US" w:bidi="ar-SA"/>
+        </w:rPr>
+        <w:tab/>
+        <w:t>fluxStarAlbedo  fluxStarAlbedo; //not to be changed</w:t>
+      </w:r>
+    </w:p>
+    <w:p>
+      <w:pPr>
+        <w:pStyle w:val="Normal"/>
+        <w:rPr>
+          <w:rFonts w:eastAsia="Calibri" w:cs="DejaVu Sans"/>
+          <w:b w:val="false"/>
+          <w:bCs w:val="false"/>
+          <w:i/>
+          <w:iCs/>
+          <w:color w:val="00000A"/>
+          <w:sz w:val="22"/>
+          <w:szCs w:val="22"/>
+          <w:lang w:val="en-US" w:eastAsia="en-US" w:bidi="ar-SA"/>
+        </w:rPr>
+      </w:pPr>
+      <w:r>
+        <w:rPr>
+          <w:rFonts w:eastAsia="Calibri" w:cs="DejaVu Sans"/>
+          <w:b w:val="false"/>
+          <w:bCs w:val="false"/>
+          <w:i/>
+          <w:iCs/>
+          <w:color w:val="00000A"/>
+          <w:sz w:val="22"/>
+          <w:szCs w:val="22"/>
+          <w:lang w:val="en-US" w:eastAsia="en-US" w:bidi="ar-SA"/>
+        </w:rPr>
+        <w:tab/>
+        <w:t>forSecondMoment false;  //true in case it is a condition for a second moment flux (for SP3 calculations)</w:t>
+      </w:r>
+    </w:p>
+    <w:p>
+      <w:pPr>
+        <w:pStyle w:val="Normal"/>
+        <w:rPr>
+          <w:rFonts w:eastAsia="Calibri" w:cs="DejaVu Sans"/>
+          <w:b w:val="false"/>
+          <w:bCs w:val="false"/>
+          <w:i/>
+          <w:iCs/>
+          <w:color w:val="00000A"/>
+          <w:sz w:val="22"/>
+          <w:szCs w:val="22"/>
+          <w:lang w:val="en-US" w:eastAsia="en-US" w:bidi="ar-SA"/>
+        </w:rPr>
+      </w:pPr>
+      <w:r>
+        <w:rPr>
+          <w:rFonts w:eastAsia="Calibri" w:cs="DejaVu Sans"/>
+          <w:b w:val="false"/>
+          <w:bCs w:val="false"/>
+          <w:i/>
+          <w:iCs/>
+          <w:color w:val="00000A"/>
+          <w:sz w:val="22"/>
+          <w:szCs w:val="22"/>
+          <w:lang w:val="en-US" w:eastAsia="en-US" w:bidi="ar-SA"/>
+        </w:rPr>
+        <w:tab/>
+        <w:t>value           uniform 1;</w:t>
+      </w:r>
+    </w:p>
+    <w:p>
+      <w:pPr>
+        <w:pStyle w:val="Normal"/>
         <w:rPr>
           <w:rFonts w:eastAsia="Calibri" w:cs="DejaVu Sans"/>
           <w:b w:val="false"/>
@@ -1179,160 +1233,215 @@
           <w:szCs w:val="22"/>
           <w:lang w:val="en-US" w:eastAsia="en-US" w:bidi="ar-SA"/>
         </w:rPr>
-      </w:r>
-    </w:p>
-    <w:p>
-      <w:pPr>
-        <w:pStyle w:val="Heading3"/>
-        <w:rPr/>
-      </w:pPr>
-      <w:r>
-        <w:rPr>
-          <w:lang w:val="en-US"/>
-        </w:rPr>
-        <w:t>Discretization and solution</w:t>
-      </w:r>
-    </w:p>
-    <w:p>
-      <w:pPr>
-        <w:pStyle w:val="Normal"/>
-        <w:rPr/>
-      </w:pPr>
-      <w:r>
-        <w:rPr>
-          <w:lang w:val="en-US"/>
-        </w:rPr>
-        <w:t xml:space="preserve">Details for discretization and solution of equations are handled in a standard OpenFOAM way, i.e., through the </w:t>
-      </w:r>
-      <w:r>
-        <w:rPr>
-          <w:i/>
-          <w:lang w:val="en-US"/>
-        </w:rPr>
-        <w:t>fvSolution</w:t>
-      </w:r>
-      <w:r>
-        <w:rPr>
-          <w:lang w:val="en-US"/>
-        </w:rPr>
-        <w:t xml:space="preserve"> and </w:t>
-      </w:r>
-      <w:r>
-        <w:rPr>
-          <w:i/>
-          <w:lang w:val="en-US"/>
-        </w:rPr>
-        <w:t>fvSchemes</w:t>
-      </w:r>
-      <w:r>
-        <w:rPr>
-          <w:lang w:val="en-US"/>
-        </w:rPr>
-        <w:t xml:space="preserve"> dictionaries in “</w:t>
-      </w:r>
-      <w:r>
-        <w:rPr>
-          <w:i/>
-          <w:lang w:val="en-US"/>
-        </w:rPr>
-        <w:t>constant/ neutroRegion</w:t>
-      </w:r>
-      <w:r>
-        <w:rPr>
-          <w:lang w:val="en-US"/>
-        </w:rPr>
-        <w:t>”, “</w:t>
-      </w:r>
-      <w:r>
-        <w:rPr>
-          <w:i/>
-          <w:lang w:val="en-US"/>
-        </w:rPr>
-        <w:t>constant/fluidRegion</w:t>
-      </w:r>
-      <w:r>
-        <w:rPr>
-          <w:lang w:val="en-US"/>
-        </w:rPr>
-        <w:t>” or “</w:t>
-      </w:r>
-      <w:r>
-        <w:rPr>
-          <w:i/>
-          <w:lang w:val="en-US"/>
-        </w:rPr>
-        <w:t>constant/ thermalMechanicalRegion</w:t>
-      </w:r>
-      <w:r>
-        <w:rPr>
-          <w:lang w:val="en-US"/>
-        </w:rPr>
-        <w:t xml:space="preserve">”. Solution details are determined through the </w:t>
-      </w:r>
-      <w:r>
-        <w:rPr>
-          <w:i/>
-          <w:lang w:val="en-US"/>
-        </w:rPr>
-        <w:t>controlDict</w:t>
-      </w:r>
-      <w:r>
-        <w:rPr>
-          <w:lang w:val="en-US"/>
-        </w:rPr>
-        <w:t xml:space="preserve"> in the“</w:t>
-      </w:r>
-      <w:r>
-        <w:rPr>
-          <w:i/>
-          <w:lang w:val="en-US"/>
-        </w:rPr>
-        <w:t>system</w:t>
-      </w:r>
-      <w:r>
-        <w:rPr>
-          <w:lang w:val="en-US"/>
-        </w:rPr>
-        <w:t xml:space="preserve">” folder. The </w:t>
-      </w:r>
-      <w:r>
-        <w:rPr>
-          <w:i/>
-          <w:lang w:val="en-US"/>
-        </w:rPr>
-        <w:t>controlDict</w:t>
-      </w:r>
-      <w:r>
-        <w:rPr>
-          <w:lang w:val="en-US"/>
-        </w:rPr>
-        <w:t xml:space="preserve"> is widely extended compared to a standard OpenFOAM </w:t>
-      </w:r>
-      <w:r>
-        <w:rPr>
-          <w:i/>
-          <w:lang w:val="en-US"/>
-        </w:rPr>
-        <w:t>controlDict</w:t>
-      </w:r>
-      <w:r>
-        <w:rPr>
-          <w:lang w:val="en-US"/>
-        </w:rPr>
-        <w:t>. Examples of controlDicts are provided in the “</w:t>
-      </w:r>
-      <w:r>
-        <w:rPr>
-          <w:i/>
-          <w:iCs/>
-          <w:lang w:val="en-US"/>
-        </w:rPr>
-        <w:t>system”</w:t>
-      </w:r>
-      <w:r>
-        <w:rPr>
+      </w:pPr>
+      <w:r>
+        <w:rPr>
+          <w:rFonts w:eastAsia="Calibri" w:cs="DejaVu Sans"/>
+          <w:b w:val="false"/>
+          <w:bCs w:val="false"/>
           <w:i w:val="false"/>
           <w:iCs w:val="false"/>
+          <w:color w:val="00000A"/>
+          <w:sz w:val="22"/>
+          <w:szCs w:val="22"/>
+          <w:lang w:val="en-US" w:eastAsia="en-US" w:bidi="ar-SA"/>
+        </w:rPr>
+        <w:t xml:space="preserve">IC and BC for precursors do not have to be specified for standard reactors. On the other hand, they should be specified in case of liquid fuel reactors. This is possible by creating a defaultPrec field, in case the same conditions apply to all precursor groups, or by creating the fields named prec0, prec1, etc., in case different conditions must be provided for different precursor groups. </w:t>
+      </w:r>
+    </w:p>
+    <w:p>
+      <w:pPr>
+        <w:pStyle w:val="Normal"/>
+        <w:rPr>
+          <w:rFonts w:eastAsia="Calibri" w:cs="DejaVu Sans"/>
+          <w:b w:val="false"/>
+          <w:bCs w:val="false"/>
+          <w:i w:val="false"/>
+          <w:iCs w:val="false"/>
+          <w:color w:val="00000A"/>
+          <w:sz w:val="22"/>
+          <w:szCs w:val="22"/>
+          <w:lang w:val="en-US" w:eastAsia="en-US" w:bidi="ar-SA"/>
+        </w:rPr>
+      </w:pPr>
+      <w:r>
+        <w:rPr>
+          <w:rFonts w:eastAsia="Calibri" w:cs="DejaVu Sans"/>
+          <w:b w:val="false"/>
+          <w:bCs w:val="false"/>
+          <w:i w:val="false"/>
+          <w:iCs w:val="false"/>
+          <w:color w:val="00000A"/>
+          <w:sz w:val="22"/>
+          <w:szCs w:val="22"/>
+          <w:lang w:val="en-US" w:eastAsia="en-US" w:bidi="ar-SA"/>
+        </w:rPr>
+      </w:r>
+    </w:p>
+    <w:p>
+      <w:pPr>
+        <w:pStyle w:val="Heading3"/>
+        <w:rPr>
+          <w:lang w:val="en-US"/>
+        </w:rPr>
+      </w:pPr>
+      <w:r>
+        <w:rPr>
+          <w:lang w:val="en-US"/>
+        </w:rPr>
+        <w:t>Discretization and solution</w:t>
+      </w:r>
+    </w:p>
+    <w:p>
+      <w:pPr>
+        <w:pStyle w:val="Normal"/>
+        <w:rPr>
+          <w:lang w:val="en-US"/>
+        </w:rPr>
+      </w:pPr>
+      <w:r>
+        <w:rPr>
+          <w:lang w:val="en-US"/>
+        </w:rPr>
+        <w:t xml:space="preserve">Details for discretization and solution of equations are handled in a standard OpenFOAM way, i.e., through the </w:t>
+      </w:r>
+      <w:r>
+        <w:rPr>
+          <w:i/>
+          <w:lang w:val="en-US"/>
+        </w:rPr>
+        <w:t>fvSolution</w:t>
+      </w:r>
+      <w:r>
+        <w:rPr>
+          <w:lang w:val="en-US"/>
+        </w:rPr>
+        <w:t xml:space="preserve"> and </w:t>
+      </w:r>
+      <w:r>
+        <w:rPr>
+          <w:i/>
+          <w:lang w:val="en-US"/>
+        </w:rPr>
+        <w:t>fvSchemes</w:t>
+      </w:r>
+      <w:r>
+        <w:rPr>
+          <w:lang w:val="en-US"/>
+        </w:rPr>
+        <w:t xml:space="preserve"> dictionaries in “</w:t>
+      </w:r>
+      <w:r>
+        <w:rPr>
+          <w:i/>
+          <w:lang w:val="en-US"/>
+        </w:rPr>
+        <w:t>constant/ neutroRegion</w:t>
+      </w:r>
+      <w:r>
+        <w:rPr>
+          <w:lang w:val="en-US"/>
+        </w:rPr>
+        <w:t>”, “</w:t>
+      </w:r>
+      <w:r>
+        <w:rPr>
+          <w:i/>
+          <w:lang w:val="en-US"/>
+        </w:rPr>
+        <w:t>constant/fluidRegion</w:t>
+      </w:r>
+      <w:r>
+        <w:rPr>
+          <w:lang w:val="en-US"/>
+        </w:rPr>
+        <w:t>” or “</w:t>
+      </w:r>
+      <w:r>
+        <w:rPr>
+          <w:i/>
+          <w:lang w:val="en-US"/>
+        </w:rPr>
+        <w:t>constant/ thermalMechanicalRegion</w:t>
+      </w:r>
+      <w:r>
+        <w:rPr>
+          <w:lang w:val="en-US"/>
+        </w:rPr>
+        <w:t xml:space="preserve">”. Solution details are determined through the </w:t>
+      </w:r>
+      <w:r>
+        <w:rPr>
+          <w:i/>
+          <w:lang w:val="en-US"/>
+        </w:rPr>
+        <w:t>controlDict</w:t>
+      </w:r>
+      <w:r>
+        <w:rPr>
+          <w:lang w:val="en-US"/>
+        </w:rPr>
+        <w:t xml:space="preserve"> in the“</w:t>
+      </w:r>
+      <w:r>
+        <w:rPr>
+          <w:i/>
+          <w:lang w:val="en-US"/>
+        </w:rPr>
+        <w:t>system</w:t>
+      </w:r>
+      <w:r>
+        <w:rPr>
+          <w:lang w:val="en-US"/>
+        </w:rPr>
+        <w:t xml:space="preserve">” folder. The </w:t>
+      </w:r>
+      <w:r>
+        <w:rPr>
+          <w:i/>
+          <w:lang w:val="en-US"/>
+        </w:rPr>
+        <w:t>controlDict</w:t>
+      </w:r>
+      <w:r>
+        <w:rPr>
+          <w:lang w:val="en-US"/>
+        </w:rPr>
+        <w:t xml:space="preserve"> is extended compared to a standard OpenFOAM </w:t>
+      </w:r>
+      <w:r>
+        <w:rPr>
+          <w:i/>
+          <w:lang w:val="en-US"/>
+        </w:rPr>
+        <w:t xml:space="preserve">controlDict </w:t>
+      </w:r>
+      <w:r>
+        <w:rPr>
+          <w:i w:val="false"/>
+          <w:iCs w:val="false"/>
+          <w:lang w:val="en-US"/>
+        </w:rPr>
+        <w:t>in order to control what solvers are activated and flags that affect the behaviour of GeN-Foam as a whole but are not suitable to be included anywhere else</w:t>
+      </w:r>
+      <w:r>
+        <w:rPr>
+          <w:lang w:val="en-US"/>
+        </w:rPr>
+        <w:t>. Examples of controlDicts are provided in the “</w:t>
+      </w:r>
+      <w:r>
+        <w:rPr>
+          <w:i/>
+          <w:iCs/>
+          <w:lang w:val="en-US"/>
+        </w:rPr>
+        <w:t>system”</w:t>
+      </w:r>
+      <w:r>
+        <w:rPr>
+          <w:i w:val="false"/>
+          <w:iCs w:val="false"/>
           <w:lang w:val="en-US"/>
         </w:rPr>
         <w:t xml:space="preserve"> folder</w:t>
@@ -1400,7 +1509,6 @@
         <w:ind w:left="0" w:right="0" w:firstLine="708"/>
         <w:rPr>
           <w:i/>
-          <w:i/>
           <w:lang w:val="en-US"/>
         </w:rPr>
       </w:pPr>
@@ -1432,7 +1540,6 @@
         <w:ind w:left="0" w:right="0" w:firstLine="708"/>
         <w:rPr>
           <w:i/>
-          <w:i/>
           <w:lang w:val="en-US"/>
         </w:rPr>
       </w:pPr>
@@ -1464,36 +1571,23 @@
         <w:ind w:left="0" w:right="0" w:firstLine="708"/>
         <w:rPr>
           <w:i/>
-          <w:i/>
-          <w:lang w:val="en-US"/>
-        </w:rPr>
-      </w:pPr>
-      <w:r>
-        <w:rPr>
-          <w:i/>
-          <w:lang w:val="en-US"/>
-        </w:rPr>
-        <w:t>decompos</w:t>
-      </w:r>
-      <w:r>
-        <w:rPr>
-          <w:i/>
-          <w:lang w:val="en-US"/>
-        </w:rPr>
-        <w:t>e</w:t>
-      </w:r>
-      <w:r>
-        <w:rPr>
-          <w:i/>
-          <w:lang w:val="en-US"/>
-        </w:rPr>
-        <w:t>Par -region (region name)</w:t>
-      </w:r>
-    </w:p>
-    <w:p>
-      <w:pPr>
-        <w:pStyle w:val="Normal"/>
-        <w:rPr/>
+          <w:lang w:val="en-US"/>
+        </w:rPr>
+      </w:pPr>
+      <w:r>
+        <w:rPr>
+          <w:i/>
+          <w:lang w:val="en-US"/>
+        </w:rPr>
+        <w:t>decomposePar -region (region name)</w:t>
+      </w:r>
+    </w:p>
+    <w:p>
+      <w:pPr>
+        <w:pStyle w:val="Normal"/>
+        <w:rPr>
+          <w:lang w:val="en-US"/>
+        </w:rPr>
       </w:pPr>
       <w:r>
         <w:rPr>
@@ -1591,7 +1685,6 @@
         <w:ind w:left="0" w:right="0" w:firstLine="708"/>
         <w:rPr>
           <w:i/>
-          <w:i/>
           <w:lang w:val="en-US"/>
         </w:rPr>
       </w:pPr>
@@ -1606,7 +1699,9 @@
     <w:p>
       <w:pPr>
         <w:pStyle w:val="Normal"/>
-        <w:rPr/>
+        <w:rPr>
+          <w:lang w:val="en-US"/>
+        </w:rPr>
       </w:pPr>
       <w:r>
         <w:rPr>
@@ -1632,7 +1727,9 @@
     <w:p>
       <w:pPr>
         <w:pStyle w:val="Normal"/>
-        <w:rPr/>
+        <w:rPr>
+          <w:lang w:val="en-US"/>
+        </w:rPr>
       </w:pPr>
       <w:r>
         <w:rPr>
@@ -1688,7 +1785,9 @@
           <w:ilvl w:val="0"/>
           <w:numId w:val="2"/>
         </w:numPr>
-        <w:rPr/>
+        <w:rPr>
+          <w:lang w:val="en-US"/>
+        </w:rPr>
       </w:pPr>
       <w:r>
         <w:rPr>
@@ -1710,7 +1809,9 @@
           <w:ilvl w:val="0"/>
           <w:numId w:val="2"/>
         </w:numPr>
-        <w:rPr/>
+        <w:rPr>
+          <w:lang w:val="en-US"/>
+        </w:rPr>
       </w:pPr>
       <w:r>
         <w:rPr>
@@ -1774,7 +1875,6 @@
       </w:pPr>
       <w:rPr>
         <w:rFonts w:ascii="Symbol" w:hAnsi="Symbol" w:cs="Symbol" w:hint="default"/>
-        <w:rFonts w:cs="Symbol"/>
       </w:rPr>
     </w:lvl>
     <w:lvl w:ilvl="1">
@@ -1787,7 +1887,6 @@
       </w:pPr>
       <w:rPr>
         <w:rFonts w:ascii="Courier New" w:hAnsi="Courier New" w:cs="Courier New" w:hint="default"/>
-        <w:rFonts w:cs="Courier New"/>
       </w:rPr>
     </w:lvl>
     <w:lvl w:ilvl="2">
@@ -1800,7 +1899,6 @@
       </w:pPr>
       <w:rPr>
         <w:rFonts w:ascii="Wingdings" w:hAnsi="Wingdings" w:cs="Wingdings" w:hint="default"/>
-        <w:rFonts w:cs="Wingdings"/>
       </w:rPr>
     </w:lvl>
     <w:lvl w:ilvl="3">
@@ -1813,7 +1911,6 @@
       </w:pPr>
       <w:rPr>
         <w:rFonts w:ascii="Symbol" w:hAnsi="Symbol" w:cs="Symbol" w:hint="default"/>
-        <w:rFonts w:cs="Symbol"/>
       </w:rPr>
     </w:lvl>
     <w:lvl w:ilvl="4">
@@ -1826,7 +1923,6 @@
       </w:pPr>
       <w:rPr>
         <w:rFonts w:ascii="Courier New" w:hAnsi="Courier New" w:cs="Courier New" w:hint="default"/>
-        <w:rFonts w:cs="Courier New"/>
       </w:rPr>
     </w:lvl>
     <w:lvl w:ilvl="5">
@@ -1839,7 +1935,6 @@
       </w:pPr>
       <w:rPr>
         <w:rFonts w:ascii="Wingdings" w:hAnsi="Wingdings" w:cs="Wingdings" w:hint="default"/>
-        <w:rFonts w:cs="Wingdings"/>
       </w:rPr>
     </w:lvl>
     <w:lvl w:ilvl="6">
@@ -1852,7 +1947,6 @@
       </w:pPr>
       <w:rPr>
         <w:rFonts w:ascii="Symbol" w:hAnsi="Symbol" w:cs="Symbol" w:hint="default"/>
-        <w:rFonts w:cs="Symbol"/>
       </w:rPr>
     </w:lvl>
     <w:lvl w:ilvl="7">
@@ -1865,7 +1959,6 @@
       </w:pPr>
       <w:rPr>
         <w:rFonts w:ascii="Courier New" w:hAnsi="Courier New" w:cs="Courier New" w:hint="default"/>
-        <w:rFonts w:cs="Courier New"/>
       </w:rPr>
     </w:lvl>
     <w:lvl w:ilvl="8">
@@ -1878,7 +1971,6 @@
       </w:pPr>
       <w:rPr>
         <w:rFonts w:ascii="Wingdings" w:hAnsi="Wingdings" w:cs="Wingdings" w:hint="default"/>
-        <w:rFonts w:cs="Wingdings"/>
       </w:rPr>
     </w:lvl>
   </w:abstractNum>
@@ -1976,7 +2068,6 @@
       </w:pPr>
       <w:rPr>
         <w:rFonts w:ascii="Symbol" w:hAnsi="Symbol" w:cs="Symbol" w:hint="default"/>
-        <w:rFonts w:cs="Symbol"/>
       </w:rPr>
     </w:lvl>
     <w:lvl w:ilvl="1">
@@ -1989,7 +2080,6 @@
       </w:pPr>
       <w:rPr>
         <w:rFonts w:ascii="Courier New" w:hAnsi="Courier New" w:cs="Courier New" w:hint="default"/>
-        <w:rFonts w:cs="Courier New"/>
       </w:rPr>
     </w:lvl>
     <w:lvl w:ilvl="2">
@@ -2002,7 +2092,6 @@
       </w:pPr>
       <w:rPr>
         <w:rFonts w:ascii="Wingdings" w:hAnsi="Wingdings" w:cs="Wingdings" w:hint="default"/>
-        <w:rFonts w:cs="Wingdings"/>
       </w:rPr>
     </w:lvl>
     <w:lvl w:ilvl="3">
@@ -2015,7 +2104,6 @@
       </w:pPr>
       <w:rPr>
         <w:rFonts w:ascii="Symbol" w:hAnsi="Symbol" w:cs="Symbol" w:hint="default"/>
-        <w:rFonts w:cs="Symbol"/>
       </w:rPr>
     </w:lvl>
     <w:lvl w:ilvl="4">
@@ -2028,7 +2116,6 @@
       </w:pPr>
       <w:rPr>
         <w:rFonts w:ascii="Courier New" w:hAnsi="Courier New" w:cs="Courier New" w:hint="default"/>
-        <w:rFonts w:cs="Courier New"/>
       </w:rPr>
     </w:lvl>
     <w:lvl w:ilvl="5">
@@ -2041,7 +2128,6 @@
       </w:pPr>
       <w:rPr>
         <w:rFonts w:ascii="Wingdings" w:hAnsi="Wingdings" w:cs="Wingdings" w:hint="default"/>
-        <w:rFonts w:cs="Wingdings"/>
       </w:rPr>
     </w:lvl>
     <w:lvl w:ilvl="6">
@@ -2054,7 +2140,6 @@
       </w:pPr>
       <w:rPr>
         <w:rFonts w:ascii="Symbol" w:hAnsi="Symbol" w:cs="Symbol" w:hint="default"/>
-        <w:rFonts w:cs="Symbol"/>
       </w:rPr>
     </w:lvl>
     <w:lvl w:ilvl="7">
@@ -2067,7 +2152,6 @@
       </w:pPr>
       <w:rPr>
         <w:rFonts w:ascii="Courier New" w:hAnsi="Courier New" w:cs="Courier New" w:hint="default"/>
-        <w:rFonts w:cs="Courier New"/>
       </w:rPr>
     </w:lvl>
     <w:lvl w:ilvl="8">
@@ -2080,7 +2164,6 @@
       </w:pPr>
       <w:rPr>
         <w:rFonts w:ascii="Wingdings" w:hAnsi="Wingdings" w:cs="Wingdings" w:hint="default"/>
-        <w:rFonts w:cs="Wingdings"/>
       </w:rPr>
     </w:lvl>
   </w:abstractNum>
@@ -2219,12 +2302,11 @@
 </file>
 
 <file path=word/styles.xml><?xml version="1.0" encoding="utf-8"?>
-<w:styles xmlns:w="http://schemas.openxmlformats.org/wordprocessingml/2006/main" xmlns:w14="http://schemas.microsoft.com/office/word/2010/wordml" xmlns:mc="http://schemas.openxmlformats.org/markup-compatibility/2006" mc:Ignorable="w14">
+<w:styles xmlns:w="http://schemas.openxmlformats.org/wordprocessingml/2006/main">
   <w:docDefaults>
     <w:rPrDefault>
       <w:rPr>
         <w:rFonts w:ascii="Calibri" w:hAnsi="Calibri" w:eastAsia="Calibri" w:cs="DejaVu Sans"/>
-        <w:sz w:val="20"/>
         <w:szCs w:val="22"/>
         <w:lang w:val="de-CH" w:eastAsia="en-US" w:bidi="ar-SA"/>
       </w:rPr>
@@ -2238,7 +2320,8 @@
     <w:qFormat/>
     <w:pPr>
       <w:widowControl/>
-      <w:overflowPunct w:val="false"/>
+      <w:suppressAutoHyphens w:val="true"/>
+      <w:overflowPunct w:val="true"/>
       <w:bidi w:val="0"/>
       <w:spacing w:lineRule="auto" w:line="276" w:before="0" w:after="200"/>
       <w:jc w:val="left"/>
@@ -2253,9 +2336,9 @@
   </w:style>
   <w:style w:type="paragraph" w:styleId="Heading1">
     <w:name w:val="Heading 1"/>
+    <w:qFormat/>
     <w:basedOn w:val="Normal"/>
     <w:next w:val="Normal"/>
-    <w:qFormat/>
     <w:pPr>
       <w:keepNext/>
       <w:keepLines/>
@@ -2273,9 +2356,9 @@
   </w:style>
   <w:style w:type="paragraph" w:styleId="Heading2">
     <w:name w:val="Heading 2"/>
+    <w:qFormat/>
     <w:basedOn w:val="Normal"/>
     <w:next w:val="Normal"/>
-    <w:qFormat/>
     <w:pPr>
       <w:keepNext/>
       <w:keepLines/>
@@ -2293,9 +2376,9 @@
   </w:style>
   <w:style w:type="paragraph" w:styleId="Heading3">
     <w:name w:val="Heading 3"/>
+    <w:qFormat/>
     <w:basedOn w:val="Normal"/>
     <w:next w:val="Normal"/>
-    <w:qFormat/>
     <w:pPr>
       <w:keepNext/>
       <w:keepLines/>
@@ -2320,12 +2403,13 @@
     <w:rPr>
       <w:color w:val="0000FF"/>
       <w:u w:val="single"/>
+      <w:lang w:val="zxx" w:eastAsia="zxx" w:bidi="zxx"/>
     </w:rPr>
   </w:style>
   <w:style w:type="character" w:styleId="Heading1Char">
     <w:name w:val="Heading 1 Char"/>
+    <w:qFormat/>
     <w:basedOn w:val="DefaultParagraphFont"/>
-    <w:qFormat/>
     <w:rPr>
       <w:rFonts w:ascii="Cambria" w:hAnsi="Cambria" w:eastAsia="宋体" w:cs="DejaVu Sans"/>
       <w:b/>
@@ -2337,8 +2421,8 @@
   </w:style>
   <w:style w:type="character" w:styleId="Heading2Char">
     <w:name w:val="Heading 2 Char"/>
+    <w:qFormat/>
     <w:basedOn w:val="DefaultParagraphFont"/>
-    <w:qFormat/>
     <w:rPr>
       <w:rFonts w:ascii="Cambria" w:hAnsi="Cambria" w:eastAsia="宋体" w:cs="DejaVu Sans"/>
       <w:b/>
@@ -2350,8 +2434,8 @@
   </w:style>
   <w:style w:type="character" w:styleId="Heading3Char">
     <w:name w:val="Heading 3 Char"/>
+    <w:qFormat/>
     <w:basedOn w:val="DefaultParagraphFont"/>
-    <w:qFormat/>
     <w:rPr>
       <w:rFonts w:ascii="Cambria" w:hAnsi="Cambria" w:eastAsia="宋体" w:cs="DejaVu Sans"/>
       <w:b/>
@@ -2361,8 +2445,8 @@
   </w:style>
   <w:style w:type="character" w:styleId="TitleChar">
     <w:name w:val="Title Char"/>
+    <w:qFormat/>
     <w:basedOn w:val="DefaultParagraphFont"/>
-    <w:qFormat/>
     <w:rPr>
       <w:rFonts w:ascii="Cambria" w:hAnsi="Cambria" w:eastAsia="宋体" w:cs="DejaVu Sans"/>
       <w:color w:val="17365D"/>
@@ -2373,8 +2457,8 @@
   </w:style>
   <w:style w:type="character" w:styleId="BodyTextIndentChar">
     <w:name w:val="Body Text Indent Char"/>
+    <w:qFormat/>
     <w:basedOn w:val="DefaultParagraphFont"/>
-    <w:qFormat/>
     <w:rPr>
       <w:rFonts w:ascii="Times New Roman" w:hAnsi="Times New Roman" w:eastAsia="Times New Roman" w:cs="Times New Roman"/>
       <w:sz w:val="20"/>
@@ -2844,11 +2928,29 @@
       <w:rFonts w:cs="Wingdings"/>
     </w:rPr>
   </w:style>
+  <w:style w:type="character" w:styleId="ListLabel67">
+    <w:name w:val="ListLabel 67"/>
+    <w:rPr>
+      <w:rFonts w:cs="Symbol"/>
+    </w:rPr>
+  </w:style>
+  <w:style w:type="character" w:styleId="ListLabel68">
+    <w:name w:val="ListLabel 68"/>
+    <w:rPr>
+      <w:rFonts w:cs="Courier New"/>
+    </w:rPr>
+  </w:style>
+  <w:style w:type="character" w:styleId="ListLabel69">
+    <w:name w:val="ListLabel 69"/>
+    <w:rPr>
+      <w:rFonts w:cs="Wingdings"/>
+    </w:rPr>
+  </w:style>
   <w:style w:type="paragraph" w:styleId="Heading">
     <w:name w:val="Heading"/>
+    <w:qFormat/>
     <w:basedOn w:val="Normal"/>
     <w:next w:val="TextBody"/>
-    <w:qFormat/>
     <w:pPr>
       <w:keepNext/>
       <w:spacing w:before="240" w:after="120"/>
@@ -2860,7 +2962,7 @@
     </w:rPr>
   </w:style>
   <w:style w:type="paragraph" w:styleId="TextBody">
-    <w:name w:val="Body Text"/>
+    <w:name w:val="Text Body"/>
     <w:basedOn w:val="Normal"/>
     <w:pPr>
       <w:spacing w:lineRule="auto" w:line="288" w:before="0" w:after="140"/>
@@ -2877,8 +2979,8 @@
   </w:style>
   <w:style w:type="paragraph" w:styleId="Caption">
     <w:name w:val="Caption"/>
+    <w:qFormat/>
     <w:basedOn w:val="Normal"/>
-    <w:qFormat/>
     <w:pPr>
       <w:suppressLineNumbers/>
       <w:spacing w:before="120" w:after="120"/>
@@ -2893,8 +2995,8 @@
   </w:style>
   <w:style w:type="paragraph" w:styleId="Index">
     <w:name w:val="Index"/>
+    <w:qFormat/>
     <w:basedOn w:val="Normal"/>
-    <w:qFormat/>
     <w:pPr>
       <w:suppressLineNumbers/>
     </w:pPr>
@@ -2904,8 +3006,8 @@
   </w:style>
   <w:style w:type="paragraph" w:styleId="ListParagraph">
     <w:name w:val="List Paragraph"/>
+    <w:qFormat/>
     <w:basedOn w:val="Normal"/>
-    <w:qFormat/>
     <w:pPr>
       <w:spacing w:before="0" w:after="200"/>
       <w:ind w:left="720" w:right="0" w:hanging="0"/>
@@ -2915,12 +3017,15 @@
   </w:style>
   <w:style w:type="paragraph" w:styleId="Title">
     <w:name w:val="Title"/>
+    <w:qFormat/>
     <w:basedOn w:val="Normal"/>
     <w:next w:val="Normal"/>
-    <w:qFormat/>
     <w:pPr>
       <w:pBdr>
+        <w:top w:val="nil"/>
+        <w:left w:val="nil"/>
         <w:bottom w:val="single" w:sz="8" w:space="4" w:color="4F81BD"/>
+        <w:right w:val="nil"/>
       </w:pBdr>
       <w:spacing w:lineRule="auto" w:line="240" w:before="0" w:after="300"/>
       <w:contextualSpacing/>
@@ -2934,7 +3039,7 @@
     </w:rPr>
   </w:style>
   <w:style w:type="paragraph" w:styleId="TextBodyIndent">
-    <w:name w:val="Body Text Indent"/>
+    <w:name w:val="Text Body Indent"/>
     <w:basedOn w:val="Normal"/>
     <w:pPr>
       <w:suppressAutoHyphens w:val="true"/>

</xml_diff>

<commit_message>
Added tutorial for MSRs
</commit_message>
<xml_diff>
--- a/Documentation/howTo.docx
+++ b/Documentation/howTo.docx
@@ -37,28 +37,7 @@
           <w:rFonts w:ascii="TeXGyreTermes" w:hAnsi="TeXGyreTermes"/>
           <w:lang w:val="en-US"/>
         </w:rPr>
-        <w:t>[1,</w:t>
-      </w:r>
-      <w:r>
-        <w:rPr>
-          <w:rFonts w:ascii="TeXGyreTermes" w:hAnsi="TeXGyreTermes"/>
-          <w:lang w:val="en-US"/>
-        </w:rPr>
-        <w:t>2</w:t>
-      </w:r>
-      <w:r>
-        <w:rPr>
-          <w:rFonts w:ascii="TeXGyreTermes" w:hAnsi="TeXGyreTermes"/>
-          <w:lang w:val="en-US"/>
-        </w:rPr>
-        <w:t xml:space="preserve">]. It solves for neutronics (diffusion, SP3, SN), thermal-hydraulics (RANS-CFD and/or porous-medium coarse mesh), and thermal-mechanics. A different mesh is employed for each physics. A 1-D sub-scale model is also employed for calculating fuel temperatures in coarse-mesh models of a core.  </w:t>
-      </w:r>
-      <w:r>
-        <w:rPr>
-          <w:rFonts w:ascii="TeXGyreTermes" w:hAnsi="TeXGyreTermes"/>
-          <w:lang w:val="en-US"/>
-        </w:rPr>
-        <w:t xml:space="preserve">It should be mentioned that GeN-Foam was mainly designed for coarse-mesh analyses of a reactor core (with porous medium approach and sub-scale representation of fuel), and not for detailed pin-by-pin models. </w:t>
+        <w:t xml:space="preserve">[1,2]. It solves for neutronics (diffusion, SP3, SN), thermal-hydraulics (RANS-CFD and/or porous-medium coarse mesh), and thermal-mechanics. A different mesh is employed for each physics. A 1-D sub-scale model is also employed for calculating fuel temperatures in coarse-mesh models of a core.  It should be mentioned that GeN-Foam was mainly designed for coarse-mesh analyses of a reactor core (with porous medium approach and sub-scale representation of fuel), and not for detailed pin-by-pin models. </w:t>
       </w:r>
     </w:p>
     <w:p>
@@ -74,28 +53,7 @@
           <w:rFonts w:ascii="TeXGyreTermes" w:hAnsi="TeXGyreTermes"/>
           <w:lang w:val="en-US"/>
         </w:rPr>
-        <w:t xml:space="preserve">Using GeN-Foam requires a </w:t>
-      </w:r>
-      <w:r>
-        <w:rPr>
-          <w:rFonts w:ascii="TeXGyreTermes" w:hAnsi="TeXGyreTermes"/>
-          <w:lang w:val="en-US"/>
-        </w:rPr>
-        <w:t>good</w:t>
-      </w:r>
-      <w:r>
-        <w:rPr>
-          <w:rFonts w:ascii="TeXGyreTermes" w:hAnsi="TeXGyreTermes"/>
-          <w:lang w:val="en-US"/>
-        </w:rPr>
-        <w:t xml:space="preserve"> knowledge of OpenFOAM. </w:t>
-      </w:r>
-      <w:r>
-        <w:rPr>
-          <w:rFonts w:ascii="TeXGyreTermes" w:hAnsi="TeXGyreTermes"/>
-          <w:lang w:val="en-US"/>
-        </w:rPr>
-        <w:t>In order to use GeN-Foam, one should at least be familiar with the OpenFOAM user guide [3], and have run and understood the related tutorials. This gives an introduction to the overall logic of OpenFOAM, and to its simplest solvers. More specialized OpenFOAM solvers are normally not provided with a user guide and users are expected to learn how to use them based on:</w:t>
+        <w:t>Using GeN-Foam requires a good knowledge of OpenFOAM. In order to use GeN-Foam, one should at least be familiar with the OpenFOAM user guide [3], and have run and understood the related tutorials. This gives an introduction to the overall logic of OpenFOAM, and to its simplest solvers. More specialized OpenFOAM solvers are normally not provided with a user guide and users are expected to learn how to use them based on:</w:t>
       </w:r>
     </w:p>
     <w:p>
@@ -175,21 +133,7 @@
           <w:rFonts w:ascii="TeXGyreTermes" w:hAnsi="TeXGyreTermes"/>
           <w:lang w:val="en-US"/>
         </w:rPr>
-        <w:t xml:space="preserve">the high-level C++-based object-oriented language of OpenFOAM, which normally allows to easily understand the behavior of </w:t>
-      </w:r>
-      <w:r>
-        <w:rPr>
-          <w:rFonts w:ascii="TeXGyreTermes" w:hAnsi="TeXGyreTermes"/>
-          <w:lang w:val="en-US"/>
-        </w:rPr>
-        <w:t>a</w:t>
-      </w:r>
-      <w:r>
-        <w:rPr>
-          <w:rFonts w:ascii="TeXGyreTermes" w:hAnsi="TeXGyreTermes"/>
-          <w:lang w:val="en-US"/>
-        </w:rPr>
-        <w:t xml:space="preserve"> solver;</w:t>
+        <w:t>the high-level C++-based object-oriented language of OpenFOAM, which normally allows to easily understand the behavior of a solver;</w:t>
       </w:r>
     </w:p>
     <w:p>
@@ -216,128 +160,56 @@
       <w:pPr>
         <w:pStyle w:val="Normal"/>
         <w:jc w:val="both"/>
-        <w:rPr>
-          <w:rFonts w:ascii="TeXGyreTermes" w:hAnsi="TeXGyreTermes"/>
-        </w:rPr>
-      </w:pPr>
-      <w:r>
-        <w:rPr>
-          <w:rFonts w:ascii="TeXGyreTermes" w:hAnsi="TeXGyreTermes"/>
-          <w:lang w:val="en-US"/>
-        </w:rPr>
-        <w:t xml:space="preserve">However, GeN-Foam is an unusually complex OpenFOAM solver. </w:t>
-      </w:r>
-      <w:r>
-        <w:rPr>
-          <w:rFonts w:ascii="TeXGyreTermes" w:hAnsi="TeXGyreTermes"/>
-          <w:lang w:val="en-US"/>
-        </w:rPr>
-        <w:t>T</w:t>
-      </w:r>
-      <w:r>
-        <w:rPr>
-          <w:rFonts w:ascii="TeXGyreTermes" w:hAnsi="TeXGyreTermes"/>
-          <w:lang w:val="en-US"/>
-        </w:rPr>
-        <w:t xml:space="preserve">his document has </w:t>
-      </w:r>
-      <w:r>
-        <w:rPr>
-          <w:rFonts w:ascii="TeXGyreTermes" w:hAnsi="TeXGyreTermes"/>
-          <w:lang w:val="en-US"/>
-        </w:rPr>
-        <w:t>then</w:t>
-      </w:r>
-      <w:r>
-        <w:rPr>
-          <w:rFonts w:ascii="TeXGyreTermes" w:hAnsi="TeXGyreTermes"/>
-          <w:lang w:val="en-US"/>
-        </w:rPr>
-        <w:t xml:space="preserve"> been written </w:t>
-      </w:r>
-      <w:r>
-        <w:rPr>
-          <w:rFonts w:ascii="TeXGyreTermes" w:hAnsi="TeXGyreTermes"/>
-          <w:lang w:val="en-US"/>
-        </w:rPr>
-        <w:t xml:space="preserve">to </w:t>
-      </w:r>
-      <w:r>
-        <w:rPr>
-          <w:rFonts w:ascii="TeXGyreTermes" w:hAnsi="TeXGyreTermes"/>
-          <w:lang w:val="en-US"/>
-        </w:rPr>
-        <w:t>facilitat</w:t>
-      </w:r>
-      <w:r>
-        <w:rPr>
-          <w:rFonts w:ascii="TeXGyreTermes" w:hAnsi="TeXGyreTermes"/>
-          <w:lang w:val="en-US"/>
-        </w:rPr>
-        <w:t>e</w:t>
-      </w:r>
-      <w:r>
-        <w:rPr>
-          <w:rFonts w:ascii="TeXGyreTermes" w:hAnsi="TeXGyreTermes"/>
-          <w:lang w:val="en-US"/>
-        </w:rPr>
-        <w:t xml:space="preserve"> its use. In addition, </w:t>
-      </w:r>
-      <w:r>
-        <w:rPr>
-          <w:rFonts w:ascii="TeXGyreTermes" w:hAnsi="TeXGyreTermes"/>
-          <w:lang w:val="en-US"/>
-        </w:rPr>
-        <w:t>thee</w:t>
-      </w:r>
-      <w:r>
-        <w:rPr>
-          <w:rFonts w:ascii="TeXGyreTermes" w:hAnsi="TeXGyreTermes"/>
-          <w:lang w:val="en-US"/>
-        </w:rPr>
-        <w:t xml:space="preserve"> tutorial</w:t>
-      </w:r>
-      <w:r>
-        <w:rPr>
-          <w:rFonts w:ascii="TeXGyreTermes" w:hAnsi="TeXGyreTermes"/>
-          <w:lang w:val="en-US"/>
-        </w:rPr>
-        <w:t>s</w:t>
-      </w:r>
-      <w:r>
-        <w:rPr>
-          <w:rFonts w:ascii="TeXGyreTermes" w:hAnsi="TeXGyreTermes"/>
-          <w:lang w:val="en-US"/>
-        </w:rPr>
-        <w:t xml:space="preserve"> (ESFR3D_small, </w:t>
-      </w:r>
-      <w:r>
-        <w:rPr>
-          <w:rFonts w:ascii="TeXGyreTermes" w:hAnsi="TeXGyreTermes"/>
-          <w:lang w:val="en-US"/>
-        </w:rPr>
-        <w:t xml:space="preserve">ESFR2D_regression, and godiva_SN </w:t>
-      </w:r>
-      <w:r>
-        <w:rPr>
-          <w:rFonts w:ascii="TeXGyreTermes" w:hAnsi="TeXGyreTermes"/>
-          <w:lang w:val="en-US"/>
-        </w:rPr>
-        <w:t>) ha</w:t>
-      </w:r>
-      <w:r>
-        <w:rPr>
-          <w:rFonts w:ascii="TeXGyreTermes" w:hAnsi="TeXGyreTermes"/>
-          <w:lang w:val="en-US"/>
-        </w:rPr>
-        <w:t>ve</w:t>
-      </w:r>
-      <w:r>
-        <w:rPr>
-          <w:rFonts w:ascii="TeXGyreTermes" w:hAnsi="TeXGyreTermes"/>
-          <w:lang w:val="en-US"/>
-        </w:rPr>
-        <w:t xml:space="preserve"> been prepared.  An EMPTY case is also provided that can be used for step-by-step building one’s own case. It is recommended to start from the EMPTY case to build a case, as it already includes a consistent minimum set of (dummy) files that have to be present independent of the physics that are solved for.</w:t>
+        <w:rPr/>
+      </w:pPr>
+      <w:r>
+        <w:rPr>
+          <w:rFonts w:ascii="TeXGyreTermes" w:hAnsi="TeXGyreTermes"/>
+          <w:lang w:val="en-US"/>
+        </w:rPr>
+        <w:t xml:space="preserve">However, GeN-Foam is an unusually complex OpenFOAM solver. This document has then been written to facilitate its use. In addition, </w:t>
+      </w:r>
+      <w:r>
+        <w:rPr>
+          <w:rFonts w:ascii="TeXGyreTermes" w:hAnsi="TeXGyreTermes"/>
+          <w:lang w:val="en-US"/>
+        </w:rPr>
+        <w:t>4</w:t>
+      </w:r>
+      <w:r>
+        <w:rPr>
+          <w:rFonts w:ascii="TeXGyreTermes" w:hAnsi="TeXGyreTermes"/>
+          <w:lang w:val="en-US"/>
+        </w:rPr>
+        <w:t xml:space="preserve"> tutorials (ESFR3D_small, ESFR2D_regression,  godiva_SN </w:t>
+      </w:r>
+      <w:r>
+        <w:rPr>
+          <w:rFonts w:ascii="TeXGyreTermes" w:hAnsi="TeXGyreTermes"/>
+          <w:lang w:val="en-US"/>
+        </w:rPr>
+        <w:t>and msfr</w:t>
+      </w:r>
+      <w:r>
+        <w:rPr>
+          <w:rFonts w:ascii="TeXGyreTermes" w:hAnsi="TeXGyreTermes"/>
+          <w:lang w:val="en-US"/>
+        </w:rPr>
+        <w:t xml:space="preserve"> ) have been prepared.  An EMPTY case is also provided that can be used for step-by-step building one’s own case. It is recommended to start from the EMPTY case to build a case, as it already includes a consistent minimum set of (dummy) files that have to be present independent of the physics that are solved for.</w:t>
+      </w:r>
+    </w:p>
+    <w:p>
+      <w:pPr>
+        <w:pStyle w:val="Normal"/>
+        <w:jc w:val="both"/>
+        <w:rPr/>
+      </w:pPr>
+      <w:r>
+        <w:rPr>
+          <w:rFonts w:ascii="TeXGyreTermes" w:hAnsi="TeXGyreTermes"/>
+          <w:lang w:val="en-US"/>
+        </w:rPr>
+        <w:t xml:space="preserve">Although developed as a full multi-physics solver, the current structure of the source code allows to easily extract functionalities for neutronics, thermal-mechanics, fuel behavior and porous-medium treatments. Only the thermal-hydraulics equations are still fully embedded in the solver. </w:t>
       </w:r>
     </w:p>
     <w:p>
@@ -353,14 +225,7 @@
           <w:rFonts w:ascii="TeXGyreTermes" w:hAnsi="TeXGyreTermes"/>
           <w:lang w:val="en-US"/>
         </w:rPr>
-        <w:t>Theoretical background</w:t>
-      </w:r>
-      <w:r>
-        <w:rPr>
-          <w:rFonts w:ascii="TeXGyreTermes" w:hAnsi="TeXGyreTermes"/>
-          <w:lang w:val="en-US"/>
-        </w:rPr>
-        <w:t xml:space="preserve"> </w:t>
+        <w:t xml:space="preserve">Theoretical background </w:t>
       </w:r>
     </w:p>
     <w:p>
@@ -381,34 +246,7 @@
           <w:sz w:val="22"/>
           <w:lang w:val="en-US"/>
         </w:rPr>
-        <w:t xml:space="preserve">A general theoretical presentation of GeN-Foam is provided in </w:t>
-      </w:r>
-      <w:r>
-        <w:rPr>
-          <w:rFonts w:ascii="TeXGyreTermes" w:hAnsi="TeXGyreTermes"/>
-          <w:color w:val="00000A"/>
-          <w:sz w:val="22"/>
-          <w:lang w:val="en-US"/>
-        </w:rPr>
-        <w:t>Ref.</w:t>
-      </w:r>
-      <w:r>
-        <w:rPr>
-          <w:rFonts w:ascii="TeXGyreTermes" w:hAnsi="TeXGyreTermes"/>
-          <w:color w:val="00000A"/>
-          <w:sz w:val="22"/>
-          <w:lang w:val="en-US"/>
-        </w:rPr>
-        <w:t xml:space="preserve"> [4]. </w:t>
-      </w:r>
-      <w:r>
-        <w:rPr>
-          <w:rFonts w:ascii="TeXGyreTermes" w:hAnsi="TeXGyreTermes"/>
-          <w:color w:val="00000A"/>
-          <w:sz w:val="22"/>
-          <w:lang w:val="en-US"/>
-        </w:rPr>
-        <w:t xml:space="preserve">It is recommended to go through this paper before starting to use GeN-Foam. Further information can be found in Ref. [5] for the diffusion solver, Ref. [6] for the SP3 solver, Refs. [7,8] for the thermal-mechanic solver and its use for mesh deformation, Ref. [8] for the SN solver. </w:t>
+        <w:t xml:space="preserve">A general theoretical presentation of GeN-Foam is provided in Ref. [4]. It is recommended to go through this paper before starting to use GeN-Foam. Further information can be found in Ref. [5] for the diffusion solver, Ref. [6] for the SP3 solver, Refs. [7,8] for the thermal-mechanic solver and its use for mesh deformation, Ref. [8] for the SN solver. </w:t>
       </w:r>
     </w:p>
     <w:p>
@@ -424,14 +262,7 @@
           <w:rFonts w:ascii="TeXGyreTermes" w:hAnsi="TeXGyreTermes"/>
           <w:lang w:val="en-US"/>
         </w:rPr>
-        <w:t xml:space="preserve">Source code </w:t>
-      </w:r>
-      <w:r>
-        <w:rPr>
-          <w:rFonts w:ascii="TeXGyreTermes" w:hAnsi="TeXGyreTermes"/>
-          <w:lang w:val="en-US"/>
-        </w:rPr>
-        <w:t xml:space="preserve"> </w:t>
+        <w:t xml:space="preserve">Source code  </w:t>
       </w:r>
     </w:p>
     <w:p>
@@ -458,9 +289,7 @@
           <w:numId w:val="5"/>
         </w:numPr>
         <w:jc w:val="both"/>
-        <w:rPr>
-          <w:rFonts w:ascii="TeXGyreTermes" w:hAnsi="TeXGyreTermes"/>
-        </w:rPr>
+        <w:rPr/>
       </w:pPr>
       <w:r>
         <w:rPr>
@@ -476,21 +305,7 @@
           <w:rFonts w:ascii="TeXGyreTermes" w:hAnsi="TeXGyreTermes"/>
           <w:lang w:val="en-US"/>
         </w:rPr>
-        <w:t xml:space="preserve">: containing the main  </w:t>
-      </w:r>
-      <w:r>
-        <w:rPr>
-          <w:rFonts w:ascii="TeXGyreTermes" w:hAnsi="TeXGyreTermes"/>
-          <w:lang w:val="en-US"/>
-        </w:rPr>
-        <w:t xml:space="preserve">GeN-Foam.C </w:t>
-      </w:r>
-      <w:r>
-        <w:rPr>
-          <w:rFonts w:ascii="TeXGyreTermes" w:hAnsi="TeXGyreTermes"/>
-          <w:lang w:val="en-US"/>
-        </w:rPr>
-        <w:t>source file, and the solver for thermal-hydraulics (derived from buoyantPimpleFoam);</w:t>
+        <w:t>: containing the main  GeN-Foam.C source file (and other files included in it), and the solver for thermal-hydraulics (derived from buoyantPimpleFoam);</w:t>
       </w:r>
     </w:p>
     <w:p>
@@ -530,9 +345,7 @@
           <w:numId w:val="5"/>
         </w:numPr>
         <w:jc w:val="both"/>
-        <w:rPr>
-          <w:rFonts w:ascii="TeXGyreTermes" w:hAnsi="TeXGyreTermes"/>
-        </w:rPr>
+        <w:rPr/>
       </w:pPr>
       <w:r>
         <w:rPr>
@@ -571,21 +384,14 @@
       <w:pPr>
         <w:pStyle w:val="Normal"/>
         <w:jc w:val="both"/>
-        <w:rPr>
-          <w:rFonts w:ascii="Arial" w:hAnsi="Arial" w:cs="Arial"/>
-          <w:color w:val="000000"/>
-          <w:sz w:val="18"/>
-          <w:szCs w:val="18"/>
-          <w:highlight w:val="white"/>
-          <w:lang w:val="en-US"/>
-        </w:rPr>
-      </w:pPr>
-      <w:r>
-        <w:rPr>
-          <w:rFonts w:ascii="TeXGyreTermes" w:hAnsi="TeXGyreTermes"/>
-          <w:lang w:val="en-US"/>
-        </w:rPr>
-        <w:t>GeN-Foam is built as a standard OpenFOAM solver. As such, one should first install the latest OpenFOAM foundation version and then compile GeN-Fo</w:t>
+        <w:rPr/>
+      </w:pPr>
+      <w:r>
+        <w:rPr>
+          <w:rFonts w:ascii="TeXGyreTermes" w:hAnsi="TeXGyreTermes"/>
+          <w:lang w:val="en-US"/>
+        </w:rPr>
+        <w:t>GeN-Foam is built as a standard OpenFOAM solver, based on the www.openfoam.com distribution. As such, one should first install the latest OpenFOAM foundation version and then compile GeN-Fo</w:t>
       </w:r>
       <w:r>
         <w:rPr>
@@ -752,21 +558,7 @@
           <w:rFonts w:ascii="TeXGyreTermes" w:hAnsi="TeXGyreTermes"/>
           <w:lang w:val="en-US"/>
         </w:rPr>
-        <w:t>) [</w:t>
-      </w:r>
-      <w:r>
-        <w:rPr>
-          <w:rFonts w:ascii="TeXGyreTermes" w:hAnsi="TeXGyreTermes"/>
-          <w:lang w:val="en-US"/>
-        </w:rPr>
-        <w:t>9</w:t>
-      </w:r>
-      <w:r>
-        <w:rPr>
-          <w:rFonts w:ascii="TeXGyreTermes" w:hAnsi="TeXGyreTermes"/>
-          <w:lang w:val="en-US"/>
-        </w:rPr>
-        <w:t>]. The folder includes the subfolder “</w:t>
+        <w:t>) [9]. The folder includes the subfolder “</w:t>
       </w:r>
       <w:r>
         <w:rPr>
@@ -988,21 +780,7 @@
           <w:rFonts w:ascii="TeXGyreTermes" w:hAnsi="TeXGyreTermes"/>
           <w:lang w:val="en-US"/>
         </w:rPr>
-        <w:t xml:space="preserve">- thermo-mechanical properties of structures, subdivided according to the </w:t>
-      </w:r>
-      <w:r>
-        <w:rPr>
-          <w:rFonts w:ascii="TeXGyreTermes" w:hAnsi="TeXGyreTermes"/>
-          <w:lang w:val="en-US"/>
-        </w:rPr>
-        <w:t>cell zone</w:t>
-      </w:r>
-      <w:r>
-        <w:rPr>
-          <w:rFonts w:ascii="TeXGyreTermes" w:hAnsi="TeXGyreTermes"/>
-          <w:lang w:val="en-US"/>
-        </w:rPr>
-        <w:t xml:space="preserve"> in the thermo-mechanical mesh.</w:t>
+        <w:t>- thermo-mechanical properties of structures, subdivided according to the cell zone in the thermo-mechanical mesh.</w:t>
       </w:r>
     </w:p>
     <w:p>
@@ -1101,21 +879,7 @@
           <w:rFonts w:ascii="TeXGyreTermes" w:hAnsi="TeXGyreTermes"/>
           <w:lang w:val="en-US"/>
         </w:rPr>
-        <w:t xml:space="preserve"> - properties of the sub-scale fuel, for each </w:t>
-      </w:r>
-      <w:r>
-        <w:rPr>
-          <w:rFonts w:ascii="TeXGyreTermes" w:hAnsi="TeXGyreTermes"/>
-          <w:lang w:val="en-US"/>
-        </w:rPr>
-        <w:t xml:space="preserve">cell zone </w:t>
-      </w:r>
-      <w:r>
-        <w:rPr>
-          <w:rFonts w:ascii="TeXGyreTermes" w:hAnsi="TeXGyreTermes"/>
-          <w:lang w:val="en-US"/>
-        </w:rPr>
-        <w:t xml:space="preserve"> that contains the fuel</w:t>
+        <w:t xml:space="preserve"> - properties of the sub-scale fuel, for each cell zone  that contains the fuel</w:t>
       </w:r>
     </w:p>
     <w:p>
@@ -1143,28 +907,7 @@
           <w:rFonts w:ascii="TeXGyreTermes" w:hAnsi="TeXGyreTermes"/>
           <w:lang w:val="en-US"/>
         </w:rPr>
-        <w:t xml:space="preserve"> - properties of the sub-scale porous structure for each </w:t>
-      </w:r>
-      <w:r>
-        <w:rPr>
-          <w:rFonts w:ascii="TeXGyreTermes" w:hAnsi="TeXGyreTermes"/>
-          <w:lang w:val="en-US"/>
-        </w:rPr>
-        <w:t>cell zone</w:t>
-      </w:r>
-      <w:r>
-        <w:rPr>
-          <w:rFonts w:ascii="TeXGyreTermes" w:hAnsi="TeXGyreTermes"/>
-          <w:lang w:val="en-US"/>
-        </w:rPr>
-        <w:t xml:space="preserve">  that contains a porous structure. </w:t>
-      </w:r>
-      <w:r>
-        <w:rPr>
-          <w:rFonts w:ascii="TeXGyreTermes" w:hAnsi="TeXGyreTermes"/>
-          <w:lang w:val="en-US"/>
-        </w:rPr>
-        <w:t>All zones must be specified. A clear fluid is assumed if the zone is left empty.</w:t>
+        <w:t xml:space="preserve"> - properties of the sub-scale porous structure for each cell zone  that contains a porous structure. All zones must be specified. A clear fluid is assumed if the zone is left empty.</w:t>
       </w:r>
     </w:p>
     <w:p>
@@ -1231,9 +974,7 @@
           <w:numId w:val="1"/>
         </w:numPr>
         <w:jc w:val="both"/>
-        <w:rPr>
-          <w:rFonts w:ascii="TeXGyreTermes" w:hAnsi="TeXGyreTermes"/>
-        </w:rPr>
+        <w:rPr/>
       </w:pPr>
       <w:r>
         <w:rPr>
@@ -1256,56 +997,7 @@
           <w:rFonts w:ascii="TeXGyreTermes" w:hAnsi="TeXGyreTermes"/>
           <w:lang w:val="en-US"/>
         </w:rPr>
-        <w:t xml:space="preserve"> dictionary to control how neutronics is solved (diffusion, SP3 </w:t>
-      </w:r>
-      <w:r>
-        <w:rPr>
-          <w:rFonts w:ascii="TeXGyreTermes" w:hAnsi="TeXGyreTermes"/>
-          <w:lang w:val="en-US"/>
-        </w:rPr>
-        <w:t>or SN</w:t>
-      </w:r>
-      <w:r>
-        <w:rPr>
-          <w:rFonts w:ascii="TeXGyreTermes" w:hAnsi="TeXGyreTermes"/>
-          <w:lang w:val="en-US"/>
-        </w:rPr>
-        <w:t xml:space="preserve">), </w:t>
-      </w:r>
-      <w:r>
-        <w:rPr>
-          <w:rFonts w:ascii="TeXGyreTermes" w:hAnsi="TeXGyreTermes"/>
-          <w:lang w:val="en-US"/>
-        </w:rPr>
-        <w:t>and</w:t>
-      </w:r>
-      <w:r>
-        <w:rPr>
-          <w:rFonts w:ascii="TeXGyreTermes" w:hAnsi="TeXGyreTermes"/>
-          <w:lang w:val="en-US"/>
-        </w:rPr>
-        <w:t xml:space="preserve"> i</w:t>
-      </w:r>
-      <w:r>
-        <w:rPr>
-          <w:rFonts w:ascii="TeXGyreTermes" w:hAnsi="TeXGyreTermes"/>
-          <w:lang w:val="en-US"/>
-        </w:rPr>
-        <w:t>f</w:t>
-      </w:r>
-      <w:r>
-        <w:rPr>
-          <w:rFonts w:ascii="TeXGyreTermes" w:hAnsi="TeXGyreTermes"/>
-          <w:lang w:val="en-US"/>
-        </w:rPr>
-        <w:t xml:space="preserve"> it's an eigenvalue calculation </w:t>
-      </w:r>
-      <w:r>
-        <w:rPr>
-          <w:rFonts w:ascii="TeXGyreTermes" w:hAnsi="TeXGyreTermes"/>
-          <w:lang w:val="en-US"/>
-        </w:rPr>
-        <w:t xml:space="preserve">or not. </w:t>
+        <w:t xml:space="preserve"> dictionary to control how neutronics is solved (diffusion, SP3 or SN), and if it's an eigenvalue calculation or not. </w:t>
       </w:r>
     </w:p>
     <w:p>
@@ -1313,116 +1005,48 @@
         <w:pStyle w:val="ListParagraph"/>
         <w:numPr>
           <w:ilvl w:val="0"/>
-          <w:numId w:val="3"/>
+          <w:numId w:val="9"/>
         </w:numPr>
         <w:jc w:val="both"/>
-        <w:rPr>
-          <w:rFonts w:ascii="TeXGyreTermes" w:hAnsi="TeXGyreTermes"/>
-        </w:rPr>
-      </w:pPr>
-      <w:r>
-        <w:rPr>
-          <w:rFonts w:ascii="TeXGyreTermes" w:hAnsi="TeXGyreTermes"/>
-          <w:i/>
-          <w:lang w:val="en-US"/>
-        </w:rPr>
-        <w:t xml:space="preserve">constant/neutroRegion/nuclearData </w:t>
-      </w:r>
-      <w:r>
-        <w:rPr>
-          <w:rFonts w:ascii="TeXGyreTermes" w:hAnsi="TeXGyreTermes"/>
-          <w:lang w:val="en-US"/>
-        </w:rPr>
-        <w:t xml:space="preserve">- contains all basic nuclear properties for the reference reactor state. The other </w:t>
-      </w:r>
-      <w:r>
-        <w:rPr>
-          <w:rFonts w:ascii="TeXGyreTermes" w:hAnsi="TeXGyreTermes"/>
-          <w:i/>
-          <w:lang w:val="en-US"/>
-        </w:rPr>
-        <w:t>nuclearData</w:t>
-      </w:r>
-      <w:r>
-        <w:rPr>
-          <w:rFonts w:ascii="TeXGyreTermes" w:hAnsi="TeXGyreTermes"/>
-          <w:lang w:val="en-US"/>
-        </w:rPr>
-        <w:t>* files in “</w:t>
-      </w:r>
-      <w:r>
-        <w:rPr>
-          <w:rFonts w:ascii="TeXGyreTermes" w:hAnsi="TeXGyreTermes"/>
-          <w:i/>
-          <w:lang w:val="en-US"/>
-        </w:rPr>
-        <w:t>constant/neutronics/”</w:t>
-      </w:r>
-      <w:r>
-        <w:rPr>
-          <w:rFonts w:ascii="TeXGyreTermes" w:hAnsi="TeXGyreTermes"/>
-          <w:lang w:val="en-US"/>
-        </w:rPr>
-        <w:t xml:space="preserve"> should include the cross-sections for perturbed reactor states. Linear interpolation is performed by GeN-Foam between reference and perturbed reactor states, except for fuel temperature, for which a logarithmic or square root interpolation is provided (depending on the spectrum).  If no data are provided, the reference cross sections are used. Nuclear data can be generated using whatever nuclear code.  The </w:t>
-      </w:r>
-      <w:r>
-        <w:rPr>
-          <w:rFonts w:ascii="TeXGyreTermes" w:hAnsi="TeXGyreTermes"/>
-          <w:i/>
-          <w:lang w:val="en-US"/>
-        </w:rPr>
-        <w:t>serpentToFoam</w:t>
-      </w:r>
-      <w:r>
-        <w:rPr>
-          <w:rFonts w:ascii="TeXGyreTermes" w:hAnsi="TeXGyreTermes"/>
-          <w:lang w:val="en-US"/>
-        </w:rPr>
-        <w:t xml:space="preserve"> routines provided with GeN-Foam </w:t>
-      </w:r>
-      <w:r>
-        <w:rPr>
-          <w:rFonts w:ascii="TeXGyreTermes" w:hAnsi="TeXGyreTermes"/>
-          <w:lang w:val="en-US"/>
-        </w:rPr>
-        <w:t xml:space="preserve">(in the </w:t>
-      </w:r>
-      <w:r>
-        <w:rPr>
-          <w:rFonts w:ascii="TeXGyreTermes" w:hAnsi="TeXGyreTermes"/>
-          <w:i/>
-          <w:iCs/>
-          <w:lang w:val="en-US"/>
-        </w:rPr>
-        <w:t>Tools</w:t>
-      </w:r>
-      <w:r>
-        <w:rPr>
-          <w:rFonts w:ascii="TeXGyreTermes" w:hAnsi="TeXGyreTermes"/>
-          <w:lang w:val="en-US"/>
-        </w:rPr>
-        <w:t xml:space="preserve"> folder)</w:t>
-      </w:r>
-      <w:r>
-        <w:rPr>
-          <w:rFonts w:ascii="TeXGyreTermes" w:hAnsi="TeXGyreTermes"/>
-          <w:lang w:val="en-US"/>
-        </w:rPr>
-        <w:t xml:space="preserve"> is a </w:t>
-      </w:r>
-      <w:r>
-        <w:rPr>
-          <w:rFonts w:ascii="TeXGyreTermes" w:hAnsi="TeXGyreTermes"/>
-          <w:lang w:val="en-US"/>
-        </w:rPr>
-        <w:t>O</w:t>
-      </w:r>
-      <w:r>
-        <w:rPr>
-          <w:rFonts w:ascii="TeXGyreTermes" w:hAnsi="TeXGyreTermes"/>
-          <w:lang w:val="en-US"/>
-        </w:rPr>
-        <w:t xml:space="preserve">ctave script that automatically converts serpent output files into the nuclear data files employed by GeN-Foam. The entry discFactor is used only if discontinuity factors have to be used. The term integralFlux, is used only if the automatic adjustment of discontinuity factors is performed. Nonetheless, these entries should always be present. </w:t>
+        <w:rPr/>
+      </w:pPr>
+      <w:r>
+        <w:rPr>
+          <w:rFonts w:ascii="TeXGyreTermes" w:hAnsi="TeXGyreTermes"/>
+          <w:i/>
+          <w:lang w:val="en-US"/>
+        </w:rPr>
+        <w:t>constant/neutroRegion/</w:t>
+      </w:r>
+      <w:r>
+        <w:rPr>
+          <w:rFonts w:ascii="TeXGyreTermes" w:hAnsi="TeXGyreTermes"/>
+          <w:i/>
+          <w:lang w:val="en-US"/>
+        </w:rPr>
+        <w:t>reactorState</w:t>
+      </w:r>
+      <w:r>
+        <w:rPr>
+          <w:rFonts w:ascii="TeXGyreTermes" w:hAnsi="TeXGyreTermes"/>
+          <w:i/>
+          <w:lang w:val="en-US"/>
+        </w:rPr>
+        <w:t xml:space="preserve"> –</w:t>
+      </w:r>
+      <w:r>
+        <w:rPr>
+          <w:rFonts w:ascii="TeXGyreTermes" w:hAnsi="TeXGyreTermes"/>
+          <w:lang w:val="en-US"/>
+        </w:rPr>
+        <w:t xml:space="preserve"> </w:t>
+      </w:r>
+      <w:r>
+        <w:rPr>
+          <w:rFonts w:ascii="TeXGyreTermes" w:hAnsi="TeXGyreTermes"/>
+          <w:lang w:val="en-US"/>
+        </w:rPr>
+        <w:t>contains the target power for eigenvalue calculations, and the resulting keff.</w:t>
       </w:r>
     </w:p>
     <w:p>
@@ -1430,7 +1054,7 @@
         <w:pStyle w:val="ListParagraph"/>
         <w:numPr>
           <w:ilvl w:val="0"/>
-          <w:numId w:val="3"/>
+          <w:numId w:val="10"/>
         </w:numPr>
         <w:jc w:val="both"/>
         <w:rPr>
@@ -1443,6 +1067,95 @@
           <w:i/>
           <w:lang w:val="en-US"/>
         </w:rPr>
+        <w:t xml:space="preserve">constant/neutroRegion/nuclearData </w:t>
+      </w:r>
+      <w:r>
+        <w:rPr>
+          <w:rFonts w:ascii="TeXGyreTermes" w:hAnsi="TeXGyreTermes"/>
+          <w:lang w:val="en-US"/>
+        </w:rPr>
+        <w:t xml:space="preserve">- contains all basic nuclear properties for the reference reactor state. The other </w:t>
+      </w:r>
+      <w:r>
+        <w:rPr>
+          <w:rFonts w:ascii="TeXGyreTermes" w:hAnsi="TeXGyreTermes"/>
+          <w:i/>
+          <w:lang w:val="en-US"/>
+        </w:rPr>
+        <w:t>nuclearData</w:t>
+      </w:r>
+      <w:r>
+        <w:rPr>
+          <w:rFonts w:ascii="TeXGyreTermes" w:hAnsi="TeXGyreTermes"/>
+          <w:lang w:val="en-US"/>
+        </w:rPr>
+        <w:t>* files in “</w:t>
+      </w:r>
+      <w:r>
+        <w:rPr>
+          <w:rFonts w:ascii="TeXGyreTermes" w:hAnsi="TeXGyreTermes"/>
+          <w:i/>
+          <w:lang w:val="en-US"/>
+        </w:rPr>
+        <w:t>constant/neutronics/”</w:t>
+      </w:r>
+      <w:r>
+        <w:rPr>
+          <w:rFonts w:ascii="TeXGyreTermes" w:hAnsi="TeXGyreTermes"/>
+          <w:lang w:val="en-US"/>
+        </w:rPr>
+        <w:t xml:space="preserve"> should include the cross-sections for perturbed reactor states. Linear interpolation is performed by GeN-Foam between reference and perturbed reactor states, except for fuel temperature, for which a logarithmic or square root interpolation is provided (depending on the spectrum).  If no data are provided, the reference cross sections are used. Nuclear data can be generated using whatever nuclear code.  The </w:t>
+      </w:r>
+      <w:r>
+        <w:rPr>
+          <w:rFonts w:ascii="TeXGyreTermes" w:hAnsi="TeXGyreTermes"/>
+          <w:i/>
+          <w:lang w:val="en-US"/>
+        </w:rPr>
+        <w:t>serpentToFoam</w:t>
+      </w:r>
+      <w:r>
+        <w:rPr>
+          <w:rFonts w:ascii="TeXGyreTermes" w:hAnsi="TeXGyreTermes"/>
+          <w:lang w:val="en-US"/>
+        </w:rPr>
+        <w:t xml:space="preserve"> routines provided with GeN-Foam (in the </w:t>
+      </w:r>
+      <w:r>
+        <w:rPr>
+          <w:rFonts w:ascii="TeXGyreTermes" w:hAnsi="TeXGyreTermes"/>
+          <w:i/>
+          <w:iCs/>
+          <w:lang w:val="en-US"/>
+        </w:rPr>
+        <w:t>Tools</w:t>
+      </w:r>
+      <w:r>
+        <w:rPr>
+          <w:rFonts w:ascii="TeXGyreTermes" w:hAnsi="TeXGyreTermes"/>
+          <w:lang w:val="en-US"/>
+        </w:rPr>
+        <w:t xml:space="preserve"> folder) is a Octave script that automatically converts serpent output files into the nuclear data files employed by GeN-Foam. The entry discFactor is used only if discontinuity factors have to be used. The term integralFlux, is used only if the automatic adjustment of discontinuity factors is performed. Nonetheless, these entries should always be present. </w:t>
+      </w:r>
+    </w:p>
+    <w:p>
+      <w:pPr>
+        <w:pStyle w:val="ListParagraph"/>
+        <w:numPr>
+          <w:ilvl w:val="0"/>
+          <w:numId w:val="10"/>
+        </w:numPr>
+        <w:jc w:val="both"/>
+        <w:rPr>
+          <w:rFonts w:ascii="TeXGyreTermes" w:hAnsi="TeXGyreTermes"/>
+        </w:rPr>
+      </w:pPr>
+      <w:r>
+        <w:rPr>
+          <w:rFonts w:ascii="TeXGyreTermes" w:hAnsi="TeXGyreTermes"/>
+          <w:i/>
+          <w:lang w:val="en-US"/>
+        </w:rPr>
         <w:t xml:space="preserve">constant/neutroRegion/CRMove - </w:t>
       </w:r>
       <w:r>
@@ -1632,7 +1345,7 @@
     <w:p>
       <w:pPr>
         <w:pStyle w:val="ListParagraph"/>
-        <w:ind w:hanging="0"/>
+        <w:ind w:left="720" w:hanging="0"/>
         <w:jc w:val="both"/>
         <w:rPr>
           <w:rFonts w:ascii="TeXGyreTermes" w:hAnsi="TeXGyreTermes"/>
@@ -1726,77 +1439,7 @@
           <w:color w:val="00000A"/>
           <w:lang w:val="en-US"/>
         </w:rPr>
-        <w:t xml:space="preserve">” folder. In the case of neutronics, the user can either specify different IC and BC for each one of the fluxes (that must be named fluxStar0, fluxStar1., etc…), or provide the same IC and BC to all fluxes by using the defaultFlux field. </w:t>
-      </w:r>
-      <w:r>
-        <w:rPr>
-          <w:rFonts w:eastAsia="Calibri" w:ascii="TeXGyreTermes" w:hAnsi="TeXGyreTermes"/>
-          <w:b w:val="false"/>
-          <w:bCs w:val="false"/>
-          <w:color w:val="00000A"/>
-          <w:lang w:val="en-US"/>
-        </w:rPr>
-        <w:t>I</w:t>
-      </w:r>
-      <w:r>
-        <w:rPr>
-          <w:rFonts w:eastAsia="Calibri" w:ascii="TeXGyreTermes" w:hAnsi="TeXGyreTermes"/>
-          <w:b w:val="false"/>
-          <w:bCs w:val="false"/>
-          <w:color w:val="00000A"/>
-          <w:lang w:val="en-US"/>
-        </w:rPr>
-        <w:t xml:space="preserve">n case of SP3 calculations, the IC and BC for the second moment can be imposed either for each energy (using fields named fluxStar20, fluxStar21., etc…), or to all energies by using the defaultFlux2 field. </w:t>
-      </w:r>
-      <w:r>
-        <w:rPr>
-          <w:rFonts w:eastAsia="Calibri" w:ascii="TeXGyreTermes" w:hAnsi="TeXGyreTermes"/>
-          <w:b w:val="false"/>
-          <w:bCs w:val="false"/>
-          <w:color w:val="00000A"/>
-          <w:lang w:val="en-US"/>
-        </w:rPr>
-        <w:t>I</w:t>
-      </w:r>
-      <w:r>
-        <w:rPr>
-          <w:rFonts w:eastAsia="Calibri" w:ascii="TeXGyreTermes" w:hAnsi="TeXGyreTermes"/>
-          <w:b w:val="false"/>
-          <w:bCs w:val="false"/>
-          <w:color w:val="00000A"/>
-          <w:lang w:val="en-US"/>
-        </w:rPr>
-        <w:t xml:space="preserve">n case of </w:t>
-      </w:r>
-      <w:r>
-        <w:rPr>
-          <w:rFonts w:eastAsia="Calibri" w:ascii="TeXGyreTermes" w:hAnsi="TeXGyreTermes"/>
-          <w:b w:val="false"/>
-          <w:bCs w:val="false"/>
-          <w:color w:val="00000A"/>
-          <w:lang w:val="en-US"/>
-        </w:rPr>
-        <w:t>SN</w:t>
-      </w:r>
-      <w:r>
-        <w:rPr>
-          <w:rFonts w:eastAsia="Calibri" w:ascii="TeXGyreTermes" w:hAnsi="TeXGyreTermes"/>
-          <w:b w:val="false"/>
-          <w:bCs w:val="false"/>
-          <w:color w:val="00000A"/>
-          <w:lang w:val="en-US"/>
-        </w:rPr>
-        <w:t xml:space="preserve"> calculations, </w:t>
-      </w:r>
-      <w:r>
-        <w:rPr>
-          <w:rFonts w:eastAsia="Calibri" w:ascii="TeXGyreTermes" w:hAnsi="TeXGyreTermes"/>
-          <w:b w:val="false"/>
-          <w:bCs w:val="false"/>
-          <w:color w:val="00000A"/>
-          <w:lang w:val="en-US"/>
-        </w:rPr>
-        <w:t>it is suggested not to modify the boundary conditions and to use the defaultFlux file.</w:t>
+        <w:t>” folder. In the case of neutronics, the user can either specify different IC and BC for each one of the fluxes (that must be named fluxStar0, fluxStar1., etc…), or provide the same IC and BC to all fluxes by using the defaultFlux field. In case of SP3 calculations, the IC and BC for the second moment can be imposed either for each energy (using fields named fluxStar20, fluxStar21., etc…), or to all energies by using the defaultFlux2 field. In case of SN calculations, it is suggested not to modify the boundary conditions and to use the defaultFlux file.</w:t>
       </w:r>
     </w:p>
     <w:p>
@@ -1812,42 +1455,23 @@
           <w:rFonts w:ascii="TeXGyreTermes" w:hAnsi="TeXGyreTermes"/>
           <w:lang w:val="en-US"/>
         </w:rPr>
-        <w:t xml:space="preserve">In addition to the standard OpenFOAM BC, an albedo boundary condition is available in GeN-Foam </w:t>
-      </w:r>
-      <w:r>
-        <w:rPr>
-          <w:rFonts w:ascii="TeXGyreTermes" w:hAnsi="TeXGyreTermes"/>
-          <w:lang w:val="en-US"/>
-        </w:rPr>
-        <w:t>for diffudion and SP3 calculations</w:t>
-      </w:r>
-      <w:r>
-        <w:rPr>
-          <w:rFonts w:ascii="TeXGyreTermes" w:hAnsi="TeXGyreTermes"/>
-          <w:lang w:val="en-US"/>
-        </w:rPr>
-        <w:t xml:space="preserve"> and can be used according to the following syntax:</w:t>
+        <w:t>In addition to the standard OpenFOAM BC, an albedo boundary condition is available in GeN-Foam for diffudion and SP3 calculations and can be used according to the following syntax:</w:t>
       </w:r>
     </w:p>
     <w:p>
       <w:pPr>
         <w:pStyle w:val="Normal"/>
         <w:jc w:val="both"/>
-        <w:rPr>
-          <w:i/>
+        <w:rPr/>
+      </w:pPr>
+      <w:r>
+        <w:rPr>
+          <w:rFonts w:ascii="TeXGyreTermes" w:hAnsi="TeXGyreTermes"/>
           <w:i/>
           <w:iCs/>
           <w:lang w:val="en-US"/>
         </w:rPr>
-      </w:pPr>
-      <w:r>
-        <w:rPr>
-          <w:rFonts w:ascii="TeXGyreTermes" w:hAnsi="TeXGyreTermes"/>
-          <w:i/>
-          <w:iCs/>
-          <w:lang w:val="en-US"/>
-        </w:rPr>
-        <w:t xml:space="preserve">               </w:t>
+        <w:t xml:space="preserve">              </w:t>
       </w:r>
       <w:r>
         <w:rPr>
@@ -1993,21 +1617,7 @@
           <w:rFonts w:ascii="TeXGyreTermes" w:hAnsi="TeXGyreTermes"/>
           <w:lang w:val="en-US"/>
         </w:rPr>
-        <w:t xml:space="preserve">IC and BC for precursors do not have to be specified for standard reactors. On the other hand, they should be specified in case of liquid fuel reactors </w:t>
-      </w:r>
-      <w:r>
-        <w:rPr>
-          <w:rFonts w:ascii="TeXGyreTermes" w:hAnsi="TeXGyreTermes"/>
-          <w:lang w:val="en-US"/>
-        </w:rPr>
-        <w:t>(e.g., Molten Salt Reactors)</w:t>
-      </w:r>
-      <w:r>
-        <w:rPr>
-          <w:rFonts w:ascii="TeXGyreTermes" w:hAnsi="TeXGyreTermes"/>
-          <w:lang w:val="en-US"/>
-        </w:rPr>
-        <w:t xml:space="preserve">. This is possible by creating a defaultPrec field, in case the same conditions apply to all precursor groups, or by creating the fields named prec0, prec1, etc., in case different conditions must be provided for different precursor groups. </w:t>
+        <w:t xml:space="preserve">IC and BC for precursors do not have to be specified for standard reactors. On the other hand, they should be specified in case of liquid fuel reactors (e.g., Molten Salt Reactors). This is possible by creating a defaultPrec field, in case the same conditions apply to all precursor groups, or by creating the fields named prec0, prec1, etc., in case different conditions must be provided for different precursor groups. </w:t>
       </w:r>
     </w:p>
     <w:p>
@@ -2222,21 +1832,7 @@
           <w:rFonts w:ascii="TeXGyreTermes" w:hAnsi="TeXGyreTermes"/>
           <w:lang w:val="en-US"/>
         </w:rPr>
-        <w:t xml:space="preserve">GeN-Foam should be launched like a standard OpenFOAM solver, by executing the following commands in a terminal </w:t>
-      </w:r>
-      <w:r>
-        <w:rPr>
-          <w:rFonts w:ascii="TeXGyreTermes" w:hAnsi="TeXGyreTermes"/>
-          <w:lang w:val="en-US"/>
-        </w:rPr>
-        <w:t>(after sourcing the OpenFOAM environment)</w:t>
-      </w:r>
-      <w:r>
-        <w:rPr>
-          <w:rFonts w:ascii="TeXGyreTermes" w:hAnsi="TeXGyreTermes"/>
-          <w:lang w:val="en-US"/>
-        </w:rPr>
-        <w:t>:</w:t>
+        <w:t>GeN-Foam should be launched like a standard OpenFOAM solver, by executing the following commands in a terminal (after sourcing the OpenFOAM environment):</w:t>
       </w:r>
     </w:p>
     <w:p>
@@ -2491,35 +2087,7 @@
           <w:rFonts w:ascii="TeXGyreTermes" w:hAnsi="TeXGyreTermes"/>
           <w:lang w:val="en-US"/>
         </w:rPr>
-        <w:t xml:space="preserve">In case of parallel calculations, one should </w:t>
-      </w:r>
-      <w:r>
-        <w:rPr>
-          <w:rFonts w:ascii="TeXGyreTermes" w:hAnsi="TeXGyreTermes"/>
-          <w:lang w:val="en-US"/>
-        </w:rPr>
-        <w:t>first</w:t>
-      </w:r>
-      <w:r>
-        <w:rPr>
-          <w:rFonts w:ascii="TeXGyreTermes" w:hAnsi="TeXGyreTermes"/>
-          <w:lang w:val="en-US"/>
-        </w:rPr>
-        <w:t xml:space="preserve"> </w:t>
-      </w:r>
-      <w:r>
-        <w:rPr>
-          <w:rFonts w:ascii="TeXGyreTermes" w:hAnsi="TeXGyreTermes"/>
-          <w:lang w:val="en-US"/>
-        </w:rPr>
-        <w:t>resontruct</w:t>
-      </w:r>
-      <w:r>
-        <w:rPr>
-          <w:rFonts w:ascii="TeXGyreTermes" w:hAnsi="TeXGyreTermes"/>
-          <w:lang w:val="en-US"/>
-        </w:rPr>
-        <w:t xml:space="preserve"> each one of the three meshes using the command</w:t>
+        <w:t>In case of parallel calculations, one should first resontruct each one of the three meshes using the command</w:t>
       </w:r>
     </w:p>
     <w:p>
@@ -2537,15 +2105,7 @@
           <w:i/>
           <w:lang w:val="en-US"/>
         </w:rPr>
-        <w:t>recontruct</w:t>
-      </w:r>
-      <w:r>
-        <w:rPr>
-          <w:rFonts w:ascii="TeXGyreTermes" w:hAnsi="TeXGyreTermes"/>
-          <w:i/>
-          <w:lang w:val="en-US"/>
-        </w:rPr>
-        <w:t>Par -region (region name)</w:t>
+        <w:t>recontructPar -region (region name)</w:t>
       </w:r>
     </w:p>
     <w:p>
@@ -2624,21 +2184,7 @@
           <w:rFonts w:ascii="TeXGyreTermes" w:hAnsi="TeXGyreTermes"/>
           <w:lang w:val="en-US"/>
         </w:rPr>
-        <w:t xml:space="preserve">GeN-Foam also creates in the case folder </w:t>
-      </w:r>
-      <w:r>
-        <w:rPr>
-          <w:rFonts w:ascii="TeXGyreTermes" w:hAnsi="TeXGyreTermes"/>
-          <w:lang w:val="en-US"/>
-        </w:rPr>
-        <w:t>(or in the processor folder for parallel simulations)</w:t>
-      </w:r>
-      <w:r>
-        <w:rPr>
-          <w:rFonts w:ascii="TeXGyreTermes" w:hAnsi="TeXGyreTermes"/>
-          <w:lang w:val="en-US"/>
-        </w:rPr>
-        <w:t xml:space="preserve">  the .dat following files: flux (average flux), power, precs (total precursors), Tav (average coolant temperature in the core), TavClad (average clad temperature in the core), TavFuel (average fuel temperature in the core), Tmax (max coolant temperature in the core), TMaxClad (max clad temperature in the core), TMaxFuel  (max fuel temperature in the core), Tmin (min coolant temperature in the core), totalDisplacedCellsVolume (volume of the core)</w:t>
+        <w:t>GeN-Foam also creates in the case folder (or in the processor folder for parallel simulations)  the .dat following files: flux (average flux), power, precs (total precursors), Tav (average coolant temperature in the core), TavClad (average clad temperature in the core), TavFuel (average fuel temperature in the core), Tmax (max coolant temperature in the core), TMaxClad (max clad temperature in the core), TMaxFuel  (max fuel temperature in the core), Tmin (min coolant temperature in the core), totalDisplacedCellsVolume (volume of the core)</w:t>
       </w:r>
     </w:p>
     <w:p>
@@ -2649,32 +2195,36 @@
           <w:rFonts w:ascii="TeXGyreTermes" w:hAnsi="TeXGyreTermes"/>
         </w:rPr>
       </w:pPr>
+      <w:r>
+        <w:rPr>
+          <w:rFonts w:ascii="TeXGyreTermes" w:hAnsi="TeXGyreTermes"/>
+          <w:lang w:val="en-US"/>
+        </w:rPr>
+        <w:t>Tutorials</w:t>
+      </w:r>
+    </w:p>
+    <w:p>
+      <w:pPr>
+        <w:pStyle w:val="Normal"/>
+        <w:jc w:val="both"/>
+        <w:rPr/>
+      </w:pPr>
+      <w:r>
+        <w:rPr>
+          <w:rFonts w:ascii="TeXGyreTermes" w:hAnsi="TeXGyreTermes"/>
+          <w:lang w:val="en-US"/>
+        </w:rPr>
+        <w:t>Four</w:t>
+      </w:r>
       <w:bookmarkStart w:id="3" w:name="__DdeLink__860_1072200586"/>
       <w:r>
         <w:rPr>
           <w:rFonts w:ascii="TeXGyreTermes" w:hAnsi="TeXGyreTermes"/>
           <w:lang w:val="en-US"/>
         </w:rPr>
-        <w:t>Tutorials</w:t>
-      </w:r>
-    </w:p>
-    <w:p>
-      <w:pPr>
-        <w:pStyle w:val="Normal"/>
-        <w:jc w:val="both"/>
-        <w:rPr>
-          <w:rFonts w:ascii="TeXGyreTermes" w:hAnsi="TeXGyreTermes"/>
-        </w:rPr>
-      </w:pPr>
-      <w:bookmarkStart w:id="4" w:name="__DdeLink__860_1072200586"/>
-      <w:r>
-        <w:rPr>
-          <w:rFonts w:ascii="TeXGyreTermes" w:hAnsi="TeXGyreTermes"/>
-          <w:lang w:val="en-US"/>
-        </w:rPr>
-        <w:t>Three tutorials</w:t>
-      </w:r>
-      <w:bookmarkEnd w:id="4"/>
+        <w:t xml:space="preserve"> tutorials</w:t>
+      </w:r>
+      <w:bookmarkEnd w:id="3"/>
       <w:r>
         <w:rPr>
           <w:rFonts w:ascii="TeXGyreTermes" w:hAnsi="TeXGyreTermes"/>
@@ -2707,35 +2257,7 @@
           <w:rFonts w:ascii="TeXGyreTermes" w:hAnsi="TeXGyreTermes"/>
           <w:lang w:val="en-US"/>
         </w:rPr>
-        <w:t xml:space="preserve"> is a slightly simplified 3-D model of the core of</w:t>
-      </w:r>
-      <w:r>
-        <w:rPr>
-          <w:rFonts w:ascii="TeXGyreTermes" w:hAnsi="TeXGyreTermes"/>
-          <w:lang w:val="en-US"/>
-        </w:rPr>
-        <w:t xml:space="preserve"> the European Sodium Fast Reactor (ESFR) [</w:t>
-      </w:r>
-      <w:r>
-        <w:rPr>
-          <w:rFonts w:ascii="TeXGyreTermes" w:hAnsi="TeXGyreTermes"/>
-          <w:lang w:val="en-US"/>
-        </w:rPr>
-        <w:t>10</w:t>
-      </w:r>
-      <w:r>
-        <w:rPr>
-          <w:rFonts w:ascii="TeXGyreTermes" w:hAnsi="TeXGyreTermes"/>
-          <w:lang w:val="en-US"/>
-        </w:rPr>
-        <w:t xml:space="preserve">]. </w:t>
-      </w:r>
-      <w:r>
-        <w:rPr>
-          <w:rFonts w:ascii="TeXGyreTermes" w:hAnsi="TeXGyreTermes"/>
-          <w:lang w:val="en-US"/>
-        </w:rPr>
-        <w:t xml:space="preserve">It is a full multiphysics case. The </w:t>
+        <w:t xml:space="preserve"> is a slightly simplified 3-D model of the core of the European Sodium Fast Reactor (ESFR) [10]. It is a full multiphysics case. The </w:t>
       </w:r>
       <w:r>
         <w:rPr>
@@ -2751,14 +2273,7 @@
           <w:rFonts w:ascii="TeXGyreTermes" w:hAnsi="TeXGyreTermes"/>
           <w:lang w:val="en-US"/>
         </w:rPr>
-        <w:t xml:space="preserve"> </w:t>
-      </w:r>
-      <w:r>
-        <w:rPr>
-          <w:rFonts w:ascii="TeXGyreTermes" w:hAnsi="TeXGyreTermes"/>
-          <w:lang w:val="en-US"/>
-        </w:rPr>
-        <w:t>and</w:t>
+        <w:t xml:space="preserve"> and</w:t>
       </w:r>
       <w:r>
         <w:rPr>
@@ -2774,7 +2289,7 @@
           <w:rFonts w:ascii="TeXGyreTermes" w:hAnsi="TeXGyreTermes"/>
           <w:lang w:val="en-US"/>
         </w:rPr>
-        <w:t>bash scripts can be used to run the tutorials in one or 4 cores, respectively. In particular, the scripts will first run a steady-state case with eigenvalue neutronics, and then start from the obrained steady-state, and run a simple transient calculation. No reactivity is inserted in the transient and the power will simply stay constant for 10 seconds. The case is similar to the one presented in Refs. [4,7].</w:t>
+        <w:t>bash scripts can be used to run the tutorial in one or 4 cores, respectively. In particular, the scripts will first run a steady-state case with eigenvalue neutronics, and then start from the obrained steady-state, and run a simple transient calculation. No reactivity is inserted in the transient and the power will simply stay constant for 10 seconds. The case is similar to the one presented in Refs. [4,7].</w:t>
       </w:r>
     </w:p>
     <w:p>
@@ -2801,21 +2316,7 @@
           <w:rFonts w:ascii="TeXGyreTermes" w:hAnsi="TeXGyreTermes"/>
           <w:lang w:val="en-US"/>
         </w:rPr>
-        <w:t xml:space="preserve">is a 2-D r-z model of the ESFR. </w:t>
-      </w:r>
-      <w:r>
-        <w:rPr>
-          <w:rFonts w:ascii="TeXGyreTermes" w:hAnsi="TeXGyreTermes"/>
-          <w:lang w:val="en-US"/>
-        </w:rPr>
-        <w:t>It is a full multiphysics case.</w:t>
-      </w:r>
-      <w:r>
-        <w:rPr>
-          <w:rFonts w:ascii="TeXGyreTermes" w:hAnsi="TeXGyreTermes"/>
-          <w:lang w:val="en-US"/>
-        </w:rPr>
-        <w:t xml:space="preserve"> It includes both core and primary pool. The pyhton </w:t>
+        <w:t xml:space="preserve">is a 2-D r-z model of the ESFR. It is a full multiphysics case. It includes both core and primary pool. The pyhton </w:t>
       </w:r>
       <w:r>
         <w:rPr>
@@ -2879,24 +2380,26 @@
       <w:r>
         <w:rPr>
           <w:rFonts w:ascii="TeXGyreTermes" w:hAnsi="TeXGyreTermes"/>
-          <w:lang w:val="en-US"/>
-        </w:rPr>
-        <w:t xml:space="preserve">godiva_SN is a simple model (sphere) of the Godiva experiment. It only solve for neutronics, with a SN approximation. </w:t>
-      </w:r>
-      <w:r>
-        <w:rPr>
-          <w:rFonts w:ascii="TeXGyreTermes" w:hAnsi="TeXGyreTermes"/>
-          <w:lang w:val="en-US"/>
-        </w:rPr>
-        <w:t xml:space="preserve">The </w:t>
-      </w:r>
-      <w:r>
-        <w:rPr>
-          <w:rFonts w:ascii="TeXGyreTermes" w:hAnsi="TeXGyreTermes"/>
           <w:i/>
           <w:iCs/>
           <w:lang w:val="en-US"/>
         </w:rPr>
+        <w:t>godiva_SN</w:t>
+      </w:r>
+      <w:r>
+        <w:rPr>
+          <w:rFonts w:ascii="TeXGyreTermes" w:hAnsi="TeXGyreTermes"/>
+          <w:lang w:val="en-US"/>
+        </w:rPr>
+        <w:t xml:space="preserve"> is a simple model (sphere) of the Godiva experiment. It only solve for neutronics, with a SN approximation. The </w:t>
+      </w:r>
+      <w:r>
+        <w:rPr>
+          <w:rFonts w:ascii="TeXGyreTermes" w:hAnsi="TeXGyreTermes"/>
+          <w:i/>
+          <w:iCs/>
+          <w:lang w:val="en-US"/>
+        </w:rPr>
         <w:t>Allrun</w:t>
       </w:r>
       <w:r>
@@ -2904,14 +2407,7 @@
           <w:rFonts w:ascii="TeXGyreTermes" w:hAnsi="TeXGyreTermes"/>
           <w:lang w:val="en-US"/>
         </w:rPr>
-        <w:t xml:space="preserve"> </w:t>
-      </w:r>
-      <w:r>
-        <w:rPr>
-          <w:rFonts w:ascii="TeXGyreTermes" w:hAnsi="TeXGyreTermes"/>
-          <w:lang w:val="en-US"/>
-        </w:rPr>
-        <w:t>and</w:t>
+        <w:t xml:space="preserve"> and</w:t>
       </w:r>
       <w:r>
         <w:rPr>
@@ -2928,6 +2424,49 @@
           <w:lang w:val="en-US"/>
         </w:rPr>
         <w:t>bash scripts can be used to run the tutorials in one or 4 cores, respectively.</w:t>
+      </w:r>
+    </w:p>
+    <w:p>
+      <w:pPr>
+        <w:pStyle w:val="Normal"/>
+        <w:numPr>
+          <w:ilvl w:val="0"/>
+          <w:numId w:val="6"/>
+        </w:numPr>
+        <w:jc w:val="both"/>
+        <w:rPr/>
+      </w:pPr>
+      <w:r>
+        <w:rPr>
+          <w:rFonts w:ascii="TeXGyreTermes" w:hAnsi="TeXGyreTermes"/>
+          <w:i/>
+          <w:iCs/>
+          <w:lang w:val="en-US"/>
+        </w:rPr>
+        <w:t>msfr</w:t>
+      </w:r>
+      <w:r>
+        <w:rPr>
+          <w:rFonts w:ascii="TeXGyreTermes" w:hAnsi="TeXGyreTermes"/>
+          <w:lang w:val="en-US"/>
+        </w:rPr>
+        <w:t xml:space="preserve"> is a 2-D r-z model of a Molten Salt Fast Reactor. It solves for neutronics and thermal-hydraulics. The </w:t>
+      </w:r>
+      <w:r>
+        <w:rPr>
+          <w:rFonts w:ascii="TeXGyreTermes" w:hAnsi="TeXGyreTermes"/>
+          <w:i/>
+          <w:iCs/>
+          <w:lang w:val="en-US"/>
+        </w:rPr>
+        <w:t>Allrun</w:t>
+      </w:r>
+      <w:r>
+        <w:rPr>
+          <w:rFonts w:ascii="TeXGyreTermes" w:hAnsi="TeXGyreTermes"/>
+          <w:lang w:val="en-US"/>
+        </w:rPr>
+        <w:t xml:space="preserve"> bash script can be used to run the tutorial. In particular, the scriptswill first run a steady-state case with fluid dynamics only. Starting from the results of the simulation, a second steady-state is launched solving for neutronics and energy. Finally, a simple transient calculation is run. No reactivity is inserted in the transient and the power will simply stay constant for 10 seconds. Please note that, for simplicity, the fluid-dynamics equations are not solved in the transient simulation. Note also that an upwind scheme is employed for the divergence term in the diffusion equations (in system/neutroRegion/fvSchemes). This is necessary to achieve convergence. </w:t>
       </w:r>
     </w:p>
     <w:p>
@@ -2963,14 +2502,7 @@
           <w:rFonts w:ascii="TeXGyreTermes" w:hAnsi="TeXGyreTermes"/>
           <w:lang w:val="en-US"/>
         </w:rPr>
-        <w:t>A</w:t>
-      </w:r>
-      <w:r>
-        <w:rPr>
-          <w:rFonts w:ascii="TeXGyreTermes" w:hAnsi="TeXGyreTermes"/>
-          <w:lang w:val="en-US"/>
-        </w:rPr>
-        <w:t>n adjoint diffusion solver has been implemented but not tested.</w:t>
+        <w:t>An adjoint diffusion solver has been implemented but not tested.</w:t>
       </w:r>
     </w:p>
     <w:p>
@@ -3087,8 +2619,8 @@
         <w:jc w:val="both"/>
         <w:rPr/>
       </w:pPr>
-      <w:bookmarkStart w:id="5" w:name="docs-internal-guid-382eb12a-7fff-7725-8068-4862a43b5464"/>
-      <w:bookmarkEnd w:id="5"/>
+      <w:bookmarkStart w:id="4" w:name="docs-internal-guid-382eb12a-7fff-7725-8068-4862a43b5464"/>
+      <w:bookmarkEnd w:id="4"/>
       <w:r>
         <w:rPr>
           <w:rFonts w:ascii="TeXGyreTermes" w:hAnsi="TeXGyreTermes"/>
@@ -3117,8 +2649,8 @@
         <w:jc w:val="both"/>
         <w:rPr/>
       </w:pPr>
-      <w:bookmarkStart w:id="6" w:name="docs-internal-guid-1e80ded5-7fff-b58b-1e4c-7273a97fd73e"/>
-      <w:bookmarkEnd w:id="6"/>
+      <w:bookmarkStart w:id="5" w:name="docs-internal-guid-1e80ded5-7fff-b58b-1e4c-7273a97fd73e"/>
+      <w:bookmarkEnd w:id="5"/>
       <w:r>
         <w:rPr>
           <w:rFonts w:ascii="TeXGyreTermes" w:hAnsi="TeXGyreTermes"/>
@@ -3147,8 +2679,8 @@
         <w:jc w:val="both"/>
         <w:rPr/>
       </w:pPr>
-      <w:bookmarkStart w:id="7" w:name="docs-internal-guid-22c00167-7fff-3455-c675-e5c55e8ab383"/>
-      <w:bookmarkEnd w:id="7"/>
+      <w:bookmarkStart w:id="6" w:name="docs-internal-guid-22c00167-7fff-3455-c675-e5c55e8ab383"/>
+      <w:bookmarkEnd w:id="6"/>
       <w:r>
         <w:rPr>
           <w:rFonts w:ascii="TeXGyreTermes" w:hAnsi="TeXGyreTermes"/>
@@ -3177,8 +2709,8 @@
         <w:jc w:val="both"/>
         <w:rPr/>
       </w:pPr>
-      <w:bookmarkStart w:id="8" w:name="docs-internal-guid-75f7e865-7fff-91e4-dfe2-0ee719ed5858"/>
-      <w:bookmarkEnd w:id="8"/>
+      <w:bookmarkStart w:id="7" w:name="docs-internal-guid-75f7e865-7fff-91e4-dfe2-0ee719ed5858"/>
+      <w:bookmarkEnd w:id="7"/>
       <w:r>
         <w:rPr>
           <w:rFonts w:ascii="TeXGyreTermes" w:hAnsi="TeXGyreTermes"/>
@@ -3207,8 +2739,8 @@
         <w:jc w:val="both"/>
         <w:rPr/>
       </w:pPr>
-      <w:bookmarkStart w:id="9" w:name="docs-internal-guid-2de829a2-7fff-c7db-a468-c302cfd704e5"/>
-      <w:bookmarkEnd w:id="9"/>
+      <w:bookmarkStart w:id="8" w:name="docs-internal-guid-2de829a2-7fff-c7db-a468-c302cfd704e5"/>
+      <w:bookmarkEnd w:id="8"/>
       <w:r>
         <w:rPr>
           <w:rFonts w:ascii="TeXGyreTermes" w:hAnsi="TeXGyreTermes"/>
@@ -3294,8 +2826,8 @@
         <w:jc w:val="both"/>
         <w:rPr/>
       </w:pPr>
-      <w:bookmarkStart w:id="10" w:name="docs-internal-guid-0bf5e26e-7fff-f355-78bf-39acc38fd528"/>
-      <w:bookmarkEnd w:id="10"/>
+      <w:bookmarkStart w:id="9" w:name="docs-internal-guid-0bf5e26e-7fff-f355-78bf-39acc38fd528"/>
+      <w:bookmarkEnd w:id="9"/>
       <w:r>
         <w:rPr>
           <w:rFonts w:ascii="TeXGyreTermes" w:hAnsi="TeXGyreTermes"/>
@@ -3346,7 +2878,10 @@
         </w:rPr>
       </w:pPr>
       <w:r>
-        <w:rPr/>
+        <w:rPr>
+          <w:rFonts w:ascii="TeXGyreTermes" w:hAnsi="TeXGyreTermes"/>
+          <w:lang w:val="en-US"/>
+        </w:rPr>
       </w:r>
     </w:p>
     <w:p>
@@ -3370,14 +2905,10 @@
         <w:pStyle w:val="Normal"/>
         <w:spacing w:before="0" w:after="200"/>
         <w:jc w:val="both"/>
-        <w:rPr>
-          <w:rFonts w:ascii="TeXGyreTermes" w:hAnsi="TeXGyreTermes"/>
-        </w:rPr>
-      </w:pPr>
-      <w:r>
-        <w:rPr>
-          <w:rFonts w:ascii="TeXGyreTermes" w:hAnsi="TeXGyreTermes"/>
-        </w:rPr>
+        <w:rPr/>
+      </w:pPr>
+      <w:r>
+        <w:rPr/>
       </w:r>
     </w:p>
     <w:sectPr>
@@ -4417,6 +3948,244 @@
         </w:tabs>
         <w:ind w:left="1584" w:hanging="1584"/>
       </w:pPr>
+    </w:lvl>
+  </w:abstractNum>
+  <w:abstractNum w:abstractNumId="9">
+    <w:lvl w:ilvl="0">
+      <w:start w:val="1"/>
+      <w:numFmt w:val="bullet"/>
+      <w:lvlText w:val=""/>
+      <w:lvlJc w:val="left"/>
+      <w:pPr>
+        <w:ind w:left="720" w:hanging="360"/>
+      </w:pPr>
+      <w:rPr>
+        <w:rFonts w:ascii="Symbol" w:hAnsi="Symbol" w:cs="Symbol" w:hint="default"/>
+        <w:rFonts w:cs="Symbol"/>
+      </w:rPr>
+    </w:lvl>
+    <w:lvl w:ilvl="1">
+      <w:start w:val="1"/>
+      <w:numFmt w:val="bullet"/>
+      <w:lvlText w:val="o"/>
+      <w:lvlJc w:val="left"/>
+      <w:pPr>
+        <w:ind w:left="1440" w:hanging="360"/>
+      </w:pPr>
+      <w:rPr>
+        <w:rFonts w:ascii="Courier New" w:hAnsi="Courier New" w:cs="Courier New" w:hint="default"/>
+        <w:rFonts w:cs="Courier New"/>
+      </w:rPr>
+    </w:lvl>
+    <w:lvl w:ilvl="2">
+      <w:start w:val="1"/>
+      <w:numFmt w:val="bullet"/>
+      <w:lvlText w:val=""/>
+      <w:lvlJc w:val="left"/>
+      <w:pPr>
+        <w:ind w:left="2160" w:hanging="360"/>
+      </w:pPr>
+      <w:rPr>
+        <w:rFonts w:ascii="Wingdings" w:hAnsi="Wingdings" w:cs="Wingdings" w:hint="default"/>
+        <w:rFonts w:cs="Wingdings"/>
+      </w:rPr>
+    </w:lvl>
+    <w:lvl w:ilvl="3">
+      <w:start w:val="1"/>
+      <w:numFmt w:val="bullet"/>
+      <w:lvlText w:val=""/>
+      <w:lvlJc w:val="left"/>
+      <w:pPr>
+        <w:ind w:left="2880" w:hanging="360"/>
+      </w:pPr>
+      <w:rPr>
+        <w:rFonts w:ascii="Symbol" w:hAnsi="Symbol" w:cs="Symbol" w:hint="default"/>
+        <w:rFonts w:cs="Symbol"/>
+      </w:rPr>
+    </w:lvl>
+    <w:lvl w:ilvl="4">
+      <w:start w:val="1"/>
+      <w:numFmt w:val="bullet"/>
+      <w:lvlText w:val="o"/>
+      <w:lvlJc w:val="left"/>
+      <w:pPr>
+        <w:ind w:left="3600" w:hanging="360"/>
+      </w:pPr>
+      <w:rPr>
+        <w:rFonts w:ascii="Courier New" w:hAnsi="Courier New" w:cs="Courier New" w:hint="default"/>
+        <w:rFonts w:cs="Courier New"/>
+      </w:rPr>
+    </w:lvl>
+    <w:lvl w:ilvl="5">
+      <w:start w:val="1"/>
+      <w:numFmt w:val="bullet"/>
+      <w:lvlText w:val=""/>
+      <w:lvlJc w:val="left"/>
+      <w:pPr>
+        <w:ind w:left="4320" w:hanging="360"/>
+      </w:pPr>
+      <w:rPr>
+        <w:rFonts w:ascii="Wingdings" w:hAnsi="Wingdings" w:cs="Wingdings" w:hint="default"/>
+        <w:rFonts w:cs="Wingdings"/>
+      </w:rPr>
+    </w:lvl>
+    <w:lvl w:ilvl="6">
+      <w:start w:val="1"/>
+      <w:numFmt w:val="bullet"/>
+      <w:lvlText w:val=""/>
+      <w:lvlJc w:val="left"/>
+      <w:pPr>
+        <w:ind w:left="5040" w:hanging="360"/>
+      </w:pPr>
+      <w:rPr>
+        <w:rFonts w:ascii="Symbol" w:hAnsi="Symbol" w:cs="Symbol" w:hint="default"/>
+        <w:rFonts w:cs="Symbol"/>
+      </w:rPr>
+    </w:lvl>
+    <w:lvl w:ilvl="7">
+      <w:start w:val="1"/>
+      <w:numFmt w:val="bullet"/>
+      <w:lvlText w:val="o"/>
+      <w:lvlJc w:val="left"/>
+      <w:pPr>
+        <w:ind w:left="5760" w:hanging="360"/>
+      </w:pPr>
+      <w:rPr>
+        <w:rFonts w:ascii="Courier New" w:hAnsi="Courier New" w:cs="Courier New" w:hint="default"/>
+        <w:rFonts w:cs="Courier New"/>
+      </w:rPr>
+    </w:lvl>
+    <w:lvl w:ilvl="8">
+      <w:start w:val="1"/>
+      <w:numFmt w:val="bullet"/>
+      <w:lvlText w:val=""/>
+      <w:lvlJc w:val="left"/>
+      <w:pPr>
+        <w:ind w:left="6480" w:hanging="360"/>
+      </w:pPr>
+      <w:rPr>
+        <w:rFonts w:ascii="Wingdings" w:hAnsi="Wingdings" w:cs="Wingdings" w:hint="default"/>
+        <w:rFonts w:cs="Wingdings"/>
+      </w:rPr>
+    </w:lvl>
+  </w:abstractNum>
+  <w:abstractNum w:abstractNumId="10">
+    <w:lvl w:ilvl="0">
+      <w:start w:val="1"/>
+      <w:numFmt w:val="bullet"/>
+      <w:lvlText w:val=""/>
+      <w:lvlJc w:val="left"/>
+      <w:pPr>
+        <w:ind w:left="720" w:hanging="360"/>
+      </w:pPr>
+      <w:rPr>
+        <w:rFonts w:ascii="Symbol" w:hAnsi="Symbol" w:cs="Symbol" w:hint="default"/>
+        <w:rFonts w:cs="Symbol"/>
+      </w:rPr>
+    </w:lvl>
+    <w:lvl w:ilvl="1">
+      <w:start w:val="1"/>
+      <w:numFmt w:val="bullet"/>
+      <w:lvlText w:val="o"/>
+      <w:lvlJc w:val="left"/>
+      <w:pPr>
+        <w:ind w:left="1440" w:hanging="360"/>
+      </w:pPr>
+      <w:rPr>
+        <w:rFonts w:ascii="Courier New" w:hAnsi="Courier New" w:cs="Courier New" w:hint="default"/>
+        <w:rFonts w:cs="Courier New"/>
+      </w:rPr>
+    </w:lvl>
+    <w:lvl w:ilvl="2">
+      <w:start w:val="1"/>
+      <w:numFmt w:val="bullet"/>
+      <w:lvlText w:val=""/>
+      <w:lvlJc w:val="left"/>
+      <w:pPr>
+        <w:ind w:left="2160" w:hanging="360"/>
+      </w:pPr>
+      <w:rPr>
+        <w:rFonts w:ascii="Wingdings" w:hAnsi="Wingdings" w:cs="Wingdings" w:hint="default"/>
+        <w:rFonts w:cs="Wingdings"/>
+      </w:rPr>
+    </w:lvl>
+    <w:lvl w:ilvl="3">
+      <w:start w:val="1"/>
+      <w:numFmt w:val="bullet"/>
+      <w:lvlText w:val=""/>
+      <w:lvlJc w:val="left"/>
+      <w:pPr>
+        <w:ind w:left="2880" w:hanging="360"/>
+      </w:pPr>
+      <w:rPr>
+        <w:rFonts w:ascii="Symbol" w:hAnsi="Symbol" w:cs="Symbol" w:hint="default"/>
+        <w:rFonts w:cs="Symbol"/>
+      </w:rPr>
+    </w:lvl>
+    <w:lvl w:ilvl="4">
+      <w:start w:val="1"/>
+      <w:numFmt w:val="bullet"/>
+      <w:lvlText w:val="o"/>
+      <w:lvlJc w:val="left"/>
+      <w:pPr>
+        <w:ind w:left="3600" w:hanging="360"/>
+      </w:pPr>
+      <w:rPr>
+        <w:rFonts w:ascii="Courier New" w:hAnsi="Courier New" w:cs="Courier New" w:hint="default"/>
+        <w:rFonts w:cs="Courier New"/>
+      </w:rPr>
+    </w:lvl>
+    <w:lvl w:ilvl="5">
+      <w:start w:val="1"/>
+      <w:numFmt w:val="bullet"/>
+      <w:lvlText w:val=""/>
+      <w:lvlJc w:val="left"/>
+      <w:pPr>
+        <w:ind w:left="4320" w:hanging="360"/>
+      </w:pPr>
+      <w:rPr>
+        <w:rFonts w:ascii="Wingdings" w:hAnsi="Wingdings" w:cs="Wingdings" w:hint="default"/>
+        <w:rFonts w:cs="Wingdings"/>
+      </w:rPr>
+    </w:lvl>
+    <w:lvl w:ilvl="6">
+      <w:start w:val="1"/>
+      <w:numFmt w:val="bullet"/>
+      <w:lvlText w:val=""/>
+      <w:lvlJc w:val="left"/>
+      <w:pPr>
+        <w:ind w:left="5040" w:hanging="360"/>
+      </w:pPr>
+      <w:rPr>
+        <w:rFonts w:ascii="Symbol" w:hAnsi="Symbol" w:cs="Symbol" w:hint="default"/>
+        <w:rFonts w:cs="Symbol"/>
+      </w:rPr>
+    </w:lvl>
+    <w:lvl w:ilvl="7">
+      <w:start w:val="1"/>
+      <w:numFmt w:val="bullet"/>
+      <w:lvlText w:val="o"/>
+      <w:lvlJc w:val="left"/>
+      <w:pPr>
+        <w:ind w:left="5760" w:hanging="360"/>
+      </w:pPr>
+      <w:rPr>
+        <w:rFonts w:ascii="Courier New" w:hAnsi="Courier New" w:cs="Courier New" w:hint="default"/>
+        <w:rFonts w:cs="Courier New"/>
+      </w:rPr>
+    </w:lvl>
+    <w:lvl w:ilvl="8">
+      <w:start w:val="1"/>
+      <w:numFmt w:val="bullet"/>
+      <w:lvlText w:val=""/>
+      <w:lvlJc w:val="left"/>
+      <w:pPr>
+        <w:ind w:left="6480" w:hanging="360"/>
+      </w:pPr>
+      <w:rPr>
+        <w:rFonts w:ascii="Wingdings" w:hAnsi="Wingdings" w:cs="Wingdings" w:hint="default"/>
+        <w:rFonts w:cs="Wingdings"/>
+      </w:rPr>
     </w:lvl>
   </w:abstractNum>
   <w:num w:numId="1">
@@ -4442,6 +4211,12 @@
   </w:num>
   <w:num w:numId="8">
     <w:abstractNumId w:val="8"/>
+  </w:num>
+  <w:num w:numId="9">
+    <w:abstractNumId w:val="9"/>
+  </w:num>
+  <w:num w:numId="10">
+    <w:abstractNumId w:val="10"/>
   </w:num>
 </w:numbering>
 </file>
@@ -5610,6 +5385,762 @@
     <w:qFormat/>
     <w:rPr/>
   </w:style>
+  <w:style w:type="character" w:styleId="ListLabel88">
+    <w:name w:val="ListLabel 88"/>
+    <w:qFormat/>
+    <w:rPr>
+      <w:rFonts w:ascii="TeXGyreTermes" w:hAnsi="TeXGyreTermes" w:cs="Symbol"/>
+    </w:rPr>
+  </w:style>
+  <w:style w:type="character" w:styleId="ListLabel89">
+    <w:name w:val="ListLabel 89"/>
+    <w:qFormat/>
+    <w:rPr>
+      <w:rFonts w:cs="Courier New"/>
+    </w:rPr>
+  </w:style>
+  <w:style w:type="character" w:styleId="ListLabel90">
+    <w:name w:val="ListLabel 90"/>
+    <w:qFormat/>
+    <w:rPr>
+      <w:rFonts w:cs="Wingdings"/>
+    </w:rPr>
+  </w:style>
+  <w:style w:type="character" w:styleId="ListLabel91">
+    <w:name w:val="ListLabel 91"/>
+    <w:qFormat/>
+    <w:rPr>
+      <w:rFonts w:cs="Symbol"/>
+    </w:rPr>
+  </w:style>
+  <w:style w:type="character" w:styleId="ListLabel92">
+    <w:name w:val="ListLabel 92"/>
+    <w:qFormat/>
+    <w:rPr>
+      <w:rFonts w:cs="Courier New"/>
+    </w:rPr>
+  </w:style>
+  <w:style w:type="character" w:styleId="ListLabel93">
+    <w:name w:val="ListLabel 93"/>
+    <w:qFormat/>
+    <w:rPr>
+      <w:rFonts w:cs="Wingdings"/>
+    </w:rPr>
+  </w:style>
+  <w:style w:type="character" w:styleId="ListLabel94">
+    <w:name w:val="ListLabel 94"/>
+    <w:qFormat/>
+    <w:rPr>
+      <w:rFonts w:cs="Symbol"/>
+    </w:rPr>
+  </w:style>
+  <w:style w:type="character" w:styleId="ListLabel95">
+    <w:name w:val="ListLabel 95"/>
+    <w:qFormat/>
+    <w:rPr>
+      <w:rFonts w:cs="Courier New"/>
+    </w:rPr>
+  </w:style>
+  <w:style w:type="character" w:styleId="ListLabel96">
+    <w:name w:val="ListLabel 96"/>
+    <w:qFormat/>
+    <w:rPr>
+      <w:rFonts w:cs="Wingdings"/>
+    </w:rPr>
+  </w:style>
+  <w:style w:type="character" w:styleId="ListLabel97">
+    <w:name w:val="ListLabel 97"/>
+    <w:qFormat/>
+    <w:rPr>
+      <w:rFonts w:ascii="TeXGyreTermes" w:hAnsi="TeXGyreTermes" w:cs="Symbol"/>
+    </w:rPr>
+  </w:style>
+  <w:style w:type="character" w:styleId="ListLabel98">
+    <w:name w:val="ListLabel 98"/>
+    <w:qFormat/>
+    <w:rPr>
+      <w:rFonts w:cs="Courier New"/>
+    </w:rPr>
+  </w:style>
+  <w:style w:type="character" w:styleId="ListLabel99">
+    <w:name w:val="ListLabel 99"/>
+    <w:qFormat/>
+    <w:rPr>
+      <w:rFonts w:cs="Wingdings"/>
+    </w:rPr>
+  </w:style>
+  <w:style w:type="character" w:styleId="ListLabel100">
+    <w:name w:val="ListLabel 100"/>
+    <w:qFormat/>
+    <w:rPr>
+      <w:rFonts w:cs="Symbol"/>
+    </w:rPr>
+  </w:style>
+  <w:style w:type="character" w:styleId="ListLabel101">
+    <w:name w:val="ListLabel 101"/>
+    <w:qFormat/>
+    <w:rPr>
+      <w:rFonts w:cs="Courier New"/>
+    </w:rPr>
+  </w:style>
+  <w:style w:type="character" w:styleId="ListLabel102">
+    <w:name w:val="ListLabel 102"/>
+    <w:qFormat/>
+    <w:rPr>
+      <w:rFonts w:cs="Wingdings"/>
+    </w:rPr>
+  </w:style>
+  <w:style w:type="character" w:styleId="ListLabel103">
+    <w:name w:val="ListLabel 103"/>
+    <w:qFormat/>
+    <w:rPr>
+      <w:rFonts w:cs="Symbol"/>
+    </w:rPr>
+  </w:style>
+  <w:style w:type="character" w:styleId="ListLabel104">
+    <w:name w:val="ListLabel 104"/>
+    <w:qFormat/>
+    <w:rPr>
+      <w:rFonts w:cs="Courier New"/>
+    </w:rPr>
+  </w:style>
+  <w:style w:type="character" w:styleId="ListLabel105">
+    <w:name w:val="ListLabel 105"/>
+    <w:qFormat/>
+    <w:rPr>
+      <w:rFonts w:cs="Wingdings"/>
+    </w:rPr>
+  </w:style>
+  <w:style w:type="character" w:styleId="ListLabel106">
+    <w:name w:val="ListLabel 106"/>
+    <w:qFormat/>
+    <w:rPr>
+      <w:rFonts w:ascii="TeXGyreTermes" w:hAnsi="TeXGyreTermes" w:cs="OpenSymbol"/>
+    </w:rPr>
+  </w:style>
+  <w:style w:type="character" w:styleId="ListLabel107">
+    <w:name w:val="ListLabel 107"/>
+    <w:qFormat/>
+    <w:rPr>
+      <w:rFonts w:cs="OpenSymbol"/>
+    </w:rPr>
+  </w:style>
+  <w:style w:type="character" w:styleId="ListLabel108">
+    <w:name w:val="ListLabel 108"/>
+    <w:qFormat/>
+    <w:rPr>
+      <w:rFonts w:cs="OpenSymbol"/>
+    </w:rPr>
+  </w:style>
+  <w:style w:type="character" w:styleId="ListLabel109">
+    <w:name w:val="ListLabel 109"/>
+    <w:qFormat/>
+    <w:rPr>
+      <w:rFonts w:cs="OpenSymbol"/>
+    </w:rPr>
+  </w:style>
+  <w:style w:type="character" w:styleId="ListLabel110">
+    <w:name w:val="ListLabel 110"/>
+    <w:qFormat/>
+    <w:rPr>
+      <w:rFonts w:cs="OpenSymbol"/>
+    </w:rPr>
+  </w:style>
+  <w:style w:type="character" w:styleId="ListLabel111">
+    <w:name w:val="ListLabel 111"/>
+    <w:qFormat/>
+    <w:rPr>
+      <w:rFonts w:cs="OpenSymbol"/>
+    </w:rPr>
+  </w:style>
+  <w:style w:type="character" w:styleId="ListLabel112">
+    <w:name w:val="ListLabel 112"/>
+    <w:qFormat/>
+    <w:rPr>
+      <w:rFonts w:cs="OpenSymbol"/>
+    </w:rPr>
+  </w:style>
+  <w:style w:type="character" w:styleId="ListLabel113">
+    <w:name w:val="ListLabel 113"/>
+    <w:qFormat/>
+    <w:rPr>
+      <w:rFonts w:cs="OpenSymbol"/>
+    </w:rPr>
+  </w:style>
+  <w:style w:type="character" w:styleId="ListLabel114">
+    <w:name w:val="ListLabel 114"/>
+    <w:qFormat/>
+    <w:rPr>
+      <w:rFonts w:cs="OpenSymbol"/>
+    </w:rPr>
+  </w:style>
+  <w:style w:type="character" w:styleId="ListLabel115">
+    <w:name w:val="ListLabel 115"/>
+    <w:qFormat/>
+    <w:rPr>
+      <w:rFonts w:ascii="TeXGyreTermes" w:hAnsi="TeXGyreTermes" w:cs="OpenSymbol"/>
+    </w:rPr>
+  </w:style>
+  <w:style w:type="character" w:styleId="ListLabel116">
+    <w:name w:val="ListLabel 116"/>
+    <w:qFormat/>
+    <w:rPr>
+      <w:rFonts w:cs="OpenSymbol"/>
+    </w:rPr>
+  </w:style>
+  <w:style w:type="character" w:styleId="ListLabel117">
+    <w:name w:val="ListLabel 117"/>
+    <w:qFormat/>
+    <w:rPr>
+      <w:rFonts w:cs="OpenSymbol"/>
+    </w:rPr>
+  </w:style>
+  <w:style w:type="character" w:styleId="ListLabel118">
+    <w:name w:val="ListLabel 118"/>
+    <w:qFormat/>
+    <w:rPr>
+      <w:rFonts w:cs="OpenSymbol"/>
+    </w:rPr>
+  </w:style>
+  <w:style w:type="character" w:styleId="ListLabel119">
+    <w:name w:val="ListLabel 119"/>
+    <w:qFormat/>
+    <w:rPr>
+      <w:rFonts w:cs="OpenSymbol"/>
+    </w:rPr>
+  </w:style>
+  <w:style w:type="character" w:styleId="ListLabel120">
+    <w:name w:val="ListLabel 120"/>
+    <w:qFormat/>
+    <w:rPr>
+      <w:rFonts w:cs="OpenSymbol"/>
+    </w:rPr>
+  </w:style>
+  <w:style w:type="character" w:styleId="ListLabel121">
+    <w:name w:val="ListLabel 121"/>
+    <w:qFormat/>
+    <w:rPr>
+      <w:rFonts w:cs="OpenSymbol"/>
+    </w:rPr>
+  </w:style>
+  <w:style w:type="character" w:styleId="ListLabel122">
+    <w:name w:val="ListLabel 122"/>
+    <w:qFormat/>
+    <w:rPr>
+      <w:rFonts w:cs="OpenSymbol"/>
+    </w:rPr>
+  </w:style>
+  <w:style w:type="character" w:styleId="ListLabel123">
+    <w:name w:val="ListLabel 123"/>
+    <w:qFormat/>
+    <w:rPr>
+      <w:rFonts w:cs="OpenSymbol"/>
+    </w:rPr>
+  </w:style>
+  <w:style w:type="character" w:styleId="ListLabel124">
+    <w:name w:val="ListLabel 124"/>
+    <w:qFormat/>
+    <w:rPr>
+      <w:rFonts w:cs="OpenSymbol"/>
+    </w:rPr>
+  </w:style>
+  <w:style w:type="character" w:styleId="ListLabel125">
+    <w:name w:val="ListLabel 125"/>
+    <w:qFormat/>
+    <w:rPr>
+      <w:rFonts w:cs="OpenSymbol"/>
+    </w:rPr>
+  </w:style>
+  <w:style w:type="character" w:styleId="ListLabel126">
+    <w:name w:val="ListLabel 126"/>
+    <w:qFormat/>
+    <w:rPr>
+      <w:rFonts w:cs="OpenSymbol"/>
+    </w:rPr>
+  </w:style>
+  <w:style w:type="character" w:styleId="ListLabel127">
+    <w:name w:val="ListLabel 127"/>
+    <w:qFormat/>
+    <w:rPr>
+      <w:rFonts w:cs="OpenSymbol"/>
+    </w:rPr>
+  </w:style>
+  <w:style w:type="character" w:styleId="ListLabel128">
+    <w:name w:val="ListLabel 128"/>
+    <w:qFormat/>
+    <w:rPr>
+      <w:rFonts w:cs="OpenSymbol"/>
+    </w:rPr>
+  </w:style>
+  <w:style w:type="character" w:styleId="ListLabel129">
+    <w:name w:val="ListLabel 129"/>
+    <w:qFormat/>
+    <w:rPr>
+      <w:rFonts w:cs="OpenSymbol"/>
+    </w:rPr>
+  </w:style>
+  <w:style w:type="character" w:styleId="ListLabel130">
+    <w:name w:val="ListLabel 130"/>
+    <w:qFormat/>
+    <w:rPr>
+      <w:rFonts w:cs="OpenSymbol"/>
+    </w:rPr>
+  </w:style>
+  <w:style w:type="character" w:styleId="ListLabel131">
+    <w:name w:val="ListLabel 131"/>
+    <w:qFormat/>
+    <w:rPr>
+      <w:rFonts w:cs="OpenSymbol"/>
+    </w:rPr>
+  </w:style>
+  <w:style w:type="character" w:styleId="ListLabel132">
+    <w:name w:val="ListLabel 132"/>
+    <w:qFormat/>
+    <w:rPr>
+      <w:rFonts w:cs="OpenSymbol"/>
+    </w:rPr>
+  </w:style>
+  <w:style w:type="character" w:styleId="ListLabel133">
+    <w:name w:val="ListLabel 133"/>
+    <w:qFormat/>
+    <w:rPr>
+      <w:rFonts w:ascii="TeXGyreTermes" w:hAnsi="TeXGyreTermes" w:cs="OpenSymbol"/>
+    </w:rPr>
+  </w:style>
+  <w:style w:type="character" w:styleId="ListLabel134">
+    <w:name w:val="ListLabel 134"/>
+    <w:qFormat/>
+    <w:rPr>
+      <w:rFonts w:cs="OpenSymbol"/>
+    </w:rPr>
+  </w:style>
+  <w:style w:type="character" w:styleId="ListLabel135">
+    <w:name w:val="ListLabel 135"/>
+    <w:qFormat/>
+    <w:rPr>
+      <w:rFonts w:cs="OpenSymbol"/>
+    </w:rPr>
+  </w:style>
+  <w:style w:type="character" w:styleId="ListLabel136">
+    <w:name w:val="ListLabel 136"/>
+    <w:qFormat/>
+    <w:rPr>
+      <w:rFonts w:cs="OpenSymbol"/>
+    </w:rPr>
+  </w:style>
+  <w:style w:type="character" w:styleId="ListLabel137">
+    <w:name w:val="ListLabel 137"/>
+    <w:qFormat/>
+    <w:rPr>
+      <w:rFonts w:cs="OpenSymbol"/>
+    </w:rPr>
+  </w:style>
+  <w:style w:type="character" w:styleId="ListLabel138">
+    <w:name w:val="ListLabel 138"/>
+    <w:qFormat/>
+    <w:rPr>
+      <w:rFonts w:cs="OpenSymbol"/>
+    </w:rPr>
+  </w:style>
+  <w:style w:type="character" w:styleId="ListLabel139">
+    <w:name w:val="ListLabel 139"/>
+    <w:qFormat/>
+    <w:rPr>
+      <w:rFonts w:cs="OpenSymbol"/>
+    </w:rPr>
+  </w:style>
+  <w:style w:type="character" w:styleId="ListLabel140">
+    <w:name w:val="ListLabel 140"/>
+    <w:qFormat/>
+    <w:rPr>
+      <w:rFonts w:cs="OpenSymbol"/>
+    </w:rPr>
+  </w:style>
+  <w:style w:type="character" w:styleId="ListLabel141">
+    <w:name w:val="ListLabel 141"/>
+    <w:qFormat/>
+    <w:rPr>
+      <w:rFonts w:cs="OpenSymbol"/>
+    </w:rPr>
+  </w:style>
+  <w:style w:type="character" w:styleId="ListLabel142">
+    <w:name w:val="ListLabel 142"/>
+    <w:qFormat/>
+    <w:rPr>
+      <w:rFonts w:ascii="TeXGyreTermes" w:hAnsi="TeXGyreTermes" w:cs="Symbol"/>
+    </w:rPr>
+  </w:style>
+  <w:style w:type="character" w:styleId="ListLabel143">
+    <w:name w:val="ListLabel 143"/>
+    <w:qFormat/>
+    <w:rPr>
+      <w:rFonts w:cs="Courier New"/>
+    </w:rPr>
+  </w:style>
+  <w:style w:type="character" w:styleId="ListLabel144">
+    <w:name w:val="ListLabel 144"/>
+    <w:qFormat/>
+    <w:rPr>
+      <w:rFonts w:cs="Wingdings"/>
+    </w:rPr>
+  </w:style>
+  <w:style w:type="character" w:styleId="ListLabel145">
+    <w:name w:val="ListLabel 145"/>
+    <w:qFormat/>
+    <w:rPr>
+      <w:rFonts w:cs="Symbol"/>
+    </w:rPr>
+  </w:style>
+  <w:style w:type="character" w:styleId="ListLabel146">
+    <w:name w:val="ListLabel 146"/>
+    <w:qFormat/>
+    <w:rPr>
+      <w:rFonts w:cs="Courier New"/>
+    </w:rPr>
+  </w:style>
+  <w:style w:type="character" w:styleId="ListLabel147">
+    <w:name w:val="ListLabel 147"/>
+    <w:qFormat/>
+    <w:rPr>
+      <w:rFonts w:cs="Wingdings"/>
+    </w:rPr>
+  </w:style>
+  <w:style w:type="character" w:styleId="ListLabel148">
+    <w:name w:val="ListLabel 148"/>
+    <w:qFormat/>
+    <w:rPr>
+      <w:rFonts w:cs="Symbol"/>
+    </w:rPr>
+  </w:style>
+  <w:style w:type="character" w:styleId="ListLabel149">
+    <w:name w:val="ListLabel 149"/>
+    <w:qFormat/>
+    <w:rPr>
+      <w:rFonts w:cs="Courier New"/>
+    </w:rPr>
+  </w:style>
+  <w:style w:type="character" w:styleId="ListLabel150">
+    <w:name w:val="ListLabel 150"/>
+    <w:qFormat/>
+    <w:rPr>
+      <w:rFonts w:cs="Wingdings"/>
+    </w:rPr>
+  </w:style>
+  <w:style w:type="character" w:styleId="ListLabel151">
+    <w:name w:val="ListLabel 151"/>
+    <w:qFormat/>
+    <w:rPr>
+      <w:rFonts w:ascii="TeXGyreTermes" w:hAnsi="TeXGyreTermes" w:cs="Symbol"/>
+    </w:rPr>
+  </w:style>
+  <w:style w:type="character" w:styleId="ListLabel152">
+    <w:name w:val="ListLabel 152"/>
+    <w:qFormat/>
+    <w:rPr>
+      <w:rFonts w:cs="Courier New"/>
+    </w:rPr>
+  </w:style>
+  <w:style w:type="character" w:styleId="ListLabel153">
+    <w:name w:val="ListLabel 153"/>
+    <w:qFormat/>
+    <w:rPr>
+      <w:rFonts w:cs="Wingdings"/>
+    </w:rPr>
+  </w:style>
+  <w:style w:type="character" w:styleId="ListLabel154">
+    <w:name w:val="ListLabel 154"/>
+    <w:qFormat/>
+    <w:rPr>
+      <w:rFonts w:cs="Symbol"/>
+    </w:rPr>
+  </w:style>
+  <w:style w:type="character" w:styleId="ListLabel155">
+    <w:name w:val="ListLabel 155"/>
+    <w:qFormat/>
+    <w:rPr>
+      <w:rFonts w:cs="Courier New"/>
+    </w:rPr>
+  </w:style>
+  <w:style w:type="character" w:styleId="ListLabel156">
+    <w:name w:val="ListLabel 156"/>
+    <w:qFormat/>
+    <w:rPr>
+      <w:rFonts w:cs="Wingdings"/>
+    </w:rPr>
+  </w:style>
+  <w:style w:type="character" w:styleId="ListLabel157">
+    <w:name w:val="ListLabel 157"/>
+    <w:qFormat/>
+    <w:rPr>
+      <w:rFonts w:cs="Symbol"/>
+    </w:rPr>
+  </w:style>
+  <w:style w:type="character" w:styleId="ListLabel158">
+    <w:name w:val="ListLabel 158"/>
+    <w:qFormat/>
+    <w:rPr>
+      <w:rFonts w:cs="Courier New"/>
+    </w:rPr>
+  </w:style>
+  <w:style w:type="character" w:styleId="ListLabel159">
+    <w:name w:val="ListLabel 159"/>
+    <w:qFormat/>
+    <w:rPr>
+      <w:rFonts w:cs="Wingdings"/>
+    </w:rPr>
+  </w:style>
+  <w:style w:type="character" w:styleId="ListLabel160">
+    <w:name w:val="ListLabel 160"/>
+    <w:qFormat/>
+    <w:rPr>
+      <w:rFonts w:ascii="TeXGyreTermes" w:hAnsi="TeXGyreTermes" w:cs="OpenSymbol"/>
+    </w:rPr>
+  </w:style>
+  <w:style w:type="character" w:styleId="ListLabel161">
+    <w:name w:val="ListLabel 161"/>
+    <w:qFormat/>
+    <w:rPr>
+      <w:rFonts w:cs="OpenSymbol"/>
+    </w:rPr>
+  </w:style>
+  <w:style w:type="character" w:styleId="ListLabel162">
+    <w:name w:val="ListLabel 162"/>
+    <w:qFormat/>
+    <w:rPr>
+      <w:rFonts w:cs="OpenSymbol"/>
+    </w:rPr>
+  </w:style>
+  <w:style w:type="character" w:styleId="ListLabel163">
+    <w:name w:val="ListLabel 163"/>
+    <w:qFormat/>
+    <w:rPr>
+      <w:rFonts w:cs="OpenSymbol"/>
+    </w:rPr>
+  </w:style>
+  <w:style w:type="character" w:styleId="ListLabel164">
+    <w:name w:val="ListLabel 164"/>
+    <w:qFormat/>
+    <w:rPr>
+      <w:rFonts w:cs="OpenSymbol"/>
+    </w:rPr>
+  </w:style>
+  <w:style w:type="character" w:styleId="ListLabel165">
+    <w:name w:val="ListLabel 165"/>
+    <w:qFormat/>
+    <w:rPr>
+      <w:rFonts w:cs="OpenSymbol"/>
+    </w:rPr>
+  </w:style>
+  <w:style w:type="character" w:styleId="ListLabel166">
+    <w:name w:val="ListLabel 166"/>
+    <w:qFormat/>
+    <w:rPr>
+      <w:rFonts w:cs="OpenSymbol"/>
+    </w:rPr>
+  </w:style>
+  <w:style w:type="character" w:styleId="ListLabel167">
+    <w:name w:val="ListLabel 167"/>
+    <w:qFormat/>
+    <w:rPr>
+      <w:rFonts w:cs="OpenSymbol"/>
+    </w:rPr>
+  </w:style>
+  <w:style w:type="character" w:styleId="ListLabel168">
+    <w:name w:val="ListLabel 168"/>
+    <w:qFormat/>
+    <w:rPr>
+      <w:rFonts w:cs="OpenSymbol"/>
+    </w:rPr>
+  </w:style>
+  <w:style w:type="character" w:styleId="ListLabel169">
+    <w:name w:val="ListLabel 169"/>
+    <w:qFormat/>
+    <w:rPr>
+      <w:rFonts w:ascii="TeXGyreTermes" w:hAnsi="TeXGyreTermes" w:cs="OpenSymbol"/>
+    </w:rPr>
+  </w:style>
+  <w:style w:type="character" w:styleId="ListLabel170">
+    <w:name w:val="ListLabel 170"/>
+    <w:qFormat/>
+    <w:rPr>
+      <w:rFonts w:cs="OpenSymbol"/>
+    </w:rPr>
+  </w:style>
+  <w:style w:type="character" w:styleId="ListLabel171">
+    <w:name w:val="ListLabel 171"/>
+    <w:qFormat/>
+    <w:rPr>
+      <w:rFonts w:cs="OpenSymbol"/>
+    </w:rPr>
+  </w:style>
+  <w:style w:type="character" w:styleId="ListLabel172">
+    <w:name w:val="ListLabel 172"/>
+    <w:qFormat/>
+    <w:rPr>
+      <w:rFonts w:cs="OpenSymbol"/>
+    </w:rPr>
+  </w:style>
+  <w:style w:type="character" w:styleId="ListLabel173">
+    <w:name w:val="ListLabel 173"/>
+    <w:qFormat/>
+    <w:rPr>
+      <w:rFonts w:cs="OpenSymbol"/>
+    </w:rPr>
+  </w:style>
+  <w:style w:type="character" w:styleId="ListLabel174">
+    <w:name w:val="ListLabel 174"/>
+    <w:qFormat/>
+    <w:rPr>
+      <w:rFonts w:cs="OpenSymbol"/>
+    </w:rPr>
+  </w:style>
+  <w:style w:type="character" w:styleId="ListLabel175">
+    <w:name w:val="ListLabel 175"/>
+    <w:qFormat/>
+    <w:rPr>
+      <w:rFonts w:cs="OpenSymbol"/>
+    </w:rPr>
+  </w:style>
+  <w:style w:type="character" w:styleId="ListLabel176">
+    <w:name w:val="ListLabel 176"/>
+    <w:qFormat/>
+    <w:rPr>
+      <w:rFonts w:cs="OpenSymbol"/>
+    </w:rPr>
+  </w:style>
+  <w:style w:type="character" w:styleId="ListLabel177">
+    <w:name w:val="ListLabel 177"/>
+    <w:qFormat/>
+    <w:rPr>
+      <w:rFonts w:cs="OpenSymbol"/>
+    </w:rPr>
+  </w:style>
+  <w:style w:type="character" w:styleId="ListLabel178">
+    <w:name w:val="ListLabel 178"/>
+    <w:qFormat/>
+    <w:rPr>
+      <w:rFonts w:cs="OpenSymbol"/>
+    </w:rPr>
+  </w:style>
+  <w:style w:type="character" w:styleId="ListLabel179">
+    <w:name w:val="ListLabel 179"/>
+    <w:qFormat/>
+    <w:rPr>
+      <w:rFonts w:cs="OpenSymbol"/>
+    </w:rPr>
+  </w:style>
+  <w:style w:type="character" w:styleId="ListLabel180">
+    <w:name w:val="ListLabel 180"/>
+    <w:qFormat/>
+    <w:rPr>
+      <w:rFonts w:cs="OpenSymbol"/>
+    </w:rPr>
+  </w:style>
+  <w:style w:type="character" w:styleId="ListLabel181">
+    <w:name w:val="ListLabel 181"/>
+    <w:qFormat/>
+    <w:rPr>
+      <w:rFonts w:cs="OpenSymbol"/>
+    </w:rPr>
+  </w:style>
+  <w:style w:type="character" w:styleId="ListLabel182">
+    <w:name w:val="ListLabel 182"/>
+    <w:qFormat/>
+    <w:rPr>
+      <w:rFonts w:cs="OpenSymbol"/>
+    </w:rPr>
+  </w:style>
+  <w:style w:type="character" w:styleId="ListLabel183">
+    <w:name w:val="ListLabel 183"/>
+    <w:qFormat/>
+    <w:rPr>
+      <w:rFonts w:cs="OpenSymbol"/>
+    </w:rPr>
+  </w:style>
+  <w:style w:type="character" w:styleId="ListLabel184">
+    <w:name w:val="ListLabel 184"/>
+    <w:qFormat/>
+    <w:rPr>
+      <w:rFonts w:cs="OpenSymbol"/>
+    </w:rPr>
+  </w:style>
+  <w:style w:type="character" w:styleId="ListLabel185">
+    <w:name w:val="ListLabel 185"/>
+    <w:qFormat/>
+    <w:rPr>
+      <w:rFonts w:cs="OpenSymbol"/>
+    </w:rPr>
+  </w:style>
+  <w:style w:type="character" w:styleId="ListLabel186">
+    <w:name w:val="ListLabel 186"/>
+    <w:qFormat/>
+    <w:rPr>
+      <w:rFonts w:cs="OpenSymbol"/>
+    </w:rPr>
+  </w:style>
+  <w:style w:type="character" w:styleId="ListLabel187">
+    <w:name w:val="ListLabel 187"/>
+    <w:qFormat/>
+    <w:rPr>
+      <w:rFonts w:ascii="TeXGyreTermes" w:hAnsi="TeXGyreTermes" w:cs="OpenSymbol"/>
+    </w:rPr>
+  </w:style>
+  <w:style w:type="character" w:styleId="ListLabel188">
+    <w:name w:val="ListLabel 188"/>
+    <w:qFormat/>
+    <w:rPr>
+      <w:rFonts w:cs="OpenSymbol"/>
+    </w:rPr>
+  </w:style>
+  <w:style w:type="character" w:styleId="ListLabel189">
+    <w:name w:val="ListLabel 189"/>
+    <w:qFormat/>
+    <w:rPr>
+      <w:rFonts w:cs="OpenSymbol"/>
+    </w:rPr>
+  </w:style>
+  <w:style w:type="character" w:styleId="ListLabel190">
+    <w:name w:val="ListLabel 190"/>
+    <w:qFormat/>
+    <w:rPr>
+      <w:rFonts w:cs="OpenSymbol"/>
+    </w:rPr>
+  </w:style>
+  <w:style w:type="character" w:styleId="ListLabel191">
+    <w:name w:val="ListLabel 191"/>
+    <w:qFormat/>
+    <w:rPr>
+      <w:rFonts w:cs="OpenSymbol"/>
+    </w:rPr>
+  </w:style>
+  <w:style w:type="character" w:styleId="ListLabel192">
+    <w:name w:val="ListLabel 192"/>
+    <w:qFormat/>
+    <w:rPr>
+      <w:rFonts w:cs="OpenSymbol"/>
+    </w:rPr>
+  </w:style>
+  <w:style w:type="character" w:styleId="ListLabel193">
+    <w:name w:val="ListLabel 193"/>
+    <w:qFormat/>
+    <w:rPr>
+      <w:rFonts w:cs="OpenSymbol"/>
+    </w:rPr>
+  </w:style>
+  <w:style w:type="character" w:styleId="ListLabel194">
+    <w:name w:val="ListLabel 194"/>
+    <w:qFormat/>
+    <w:rPr>
+      <w:rFonts w:cs="OpenSymbol"/>
+    </w:rPr>
+  </w:style>
+  <w:style w:type="character" w:styleId="ListLabel195">
+    <w:name w:val="ListLabel 195"/>
+    <w:qFormat/>
+    <w:rPr>
+      <w:rFonts w:cs="OpenSymbol"/>
+    </w:rPr>
+  </w:style>
   <w:style w:type="paragraph" w:styleId="Heading" w:customStyle="1">
     <w:name w:val="Heading"/>
     <w:basedOn w:val="Normal"/>

</xml_diff>